<commit_message>
Updated historical growth analysis formatting
</commit_message>
<xml_diff>
--- a/report/draft/Macroeconomic and Demographic Context Version 1.docx
+++ b/report/draft/Macroeconomic and Demographic Context Version 1.docx
@@ -2603,6 +2603,7 @@
       <w:pPr>
         <w:pStyle w:val="Caption"/>
         <w:keepNext/>
+        <w:spacing w:after="0"/>
         <w:jc w:val="center"/>
         <w:rPr>
           <w:rFonts w:cs="Calibri"/>
@@ -2613,68 +2614,14 @@
           <w:sz w:val="22"/>
           <w:szCs w:val="22"/>
         </w:rPr>
-      </w:pPr>
-      <w:r>
-        <w:rPr>
-          <w:rFonts w:cs="Calibri"/>
-          <w:noProof/>
-        </w:rPr>
-        <w:drawing>
-          <wp:anchor distT="0" distB="0" distL="114300" distR="114300" simplePos="0" relativeHeight="251659264" behindDoc="0" locked="0" layoutInCell="1" allowOverlap="1" wp14:anchorId="50028A89" wp14:editId="1967B171">
-            <wp:simplePos x="0" y="0"/>
-            <wp:positionH relativeFrom="column">
-              <wp:posOffset>47625</wp:posOffset>
-            </wp:positionH>
-            <wp:positionV relativeFrom="paragraph">
-              <wp:posOffset>177165</wp:posOffset>
-            </wp:positionV>
-            <wp:extent cx="5793105" cy="4154170"/>
-            <wp:effectExtent l="0" t="0" r="0" b="0"/>
-            <wp:wrapSquare wrapText="bothSides"/>
-            <wp:docPr id="817398390" name="Picture 1"/>
-            <wp:cNvGraphicFramePr>
-              <a:graphicFrameLocks xmlns:a="http://schemas.openxmlformats.org/drawingml/2006/main" noChangeAspect="1"/>
-            </wp:cNvGraphicFramePr>
-            <a:graphic xmlns:a="http://schemas.openxmlformats.org/drawingml/2006/main">
-              <a:graphicData uri="http://schemas.openxmlformats.org/drawingml/2006/picture">
-                <pic:pic xmlns:pic="http://schemas.openxmlformats.org/drawingml/2006/picture">
-                  <pic:nvPicPr>
-                    <pic:cNvPr id="817398390" name=""/>
-                    <pic:cNvPicPr/>
-                  </pic:nvPicPr>
-                  <pic:blipFill>
-                    <a:blip r:embed="rId12">
-                      <a:extLst>
-                        <a:ext uri="{28A0092B-C50C-407E-A947-70E740481C1C}">
-                          <a14:useLocalDpi xmlns:a14="http://schemas.microsoft.com/office/drawing/2010/main" val="0"/>
-                        </a:ext>
-                      </a:extLst>
-                    </a:blip>
-                    <a:stretch>
-                      <a:fillRect/>
-                    </a:stretch>
-                  </pic:blipFill>
-                  <pic:spPr>
-                    <a:xfrm>
-                      <a:off x="0" y="0"/>
-                      <a:ext cx="5793105" cy="4154170"/>
-                    </a:xfrm>
-                    <a:prstGeom prst="rect">
-                      <a:avLst/>
-                    </a:prstGeom>
-                  </pic:spPr>
-                </pic:pic>
-              </a:graphicData>
-            </a:graphic>
-            <wp14:sizeRelH relativeFrom="page">
-              <wp14:pctWidth>0</wp14:pctWidth>
-            </wp14:sizeRelH>
-            <wp14:sizeRelV relativeFrom="page">
-              <wp14:pctHeight>0</wp14:pctHeight>
-            </wp14:sizeRelV>
-          </wp:anchor>
-        </w:drawing>
-      </w:r>
+        <w:pPrChange w:id="6" w:author="Tommy Descartes" w:date="2026-05-26T12:05:00Z" w16du:dateUtc="2026-05-26T16:05:00Z">
+          <w:pPr>
+            <w:pStyle w:val="Caption"/>
+            <w:keepNext/>
+            <w:jc w:val="center"/>
+          </w:pPr>
+        </w:pPrChange>
+      </w:pPr>
       <w:r>
         <w:rPr>
           <w:rFonts w:cs="Calibri"/>
@@ -2697,6 +2644,45 @@
           <w:rFonts w:cs="Calibri"/>
         </w:rPr>
       </w:pPr>
+      <w:ins w:id="7" w:author="Tommy Descartes" w:date="2026-05-26T12:05:00Z" w16du:dateUtc="2026-05-26T16:05:00Z">
+        <w:r>
+          <w:drawing>
+            <wp:inline distT="0" distB="0" distL="0" distR="0" wp14:anchorId="6036C3B6" wp14:editId="117B8830">
+              <wp:extent cx="5943600" cy="4272915"/>
+              <wp:effectExtent l="0" t="0" r="0" b="0"/>
+              <wp:docPr id="1992989836" name="Picture 1"/>
+              <wp:cNvGraphicFramePr>
+                <a:graphicFrameLocks xmlns:a="http://schemas.openxmlformats.org/drawingml/2006/main" noChangeAspect="1"/>
+              </wp:cNvGraphicFramePr>
+              <a:graphic xmlns:a="http://schemas.openxmlformats.org/drawingml/2006/main">
+                <a:graphicData uri="http://schemas.openxmlformats.org/drawingml/2006/picture">
+                  <pic:pic xmlns:pic="http://schemas.openxmlformats.org/drawingml/2006/picture">
+                    <pic:nvPicPr>
+                      <pic:cNvPr id="1992989836" name=""/>
+                      <pic:cNvPicPr/>
+                    </pic:nvPicPr>
+                    <pic:blipFill>
+                      <a:blip r:embed="rId12"/>
+                      <a:stretch>
+                        <a:fillRect/>
+                      </a:stretch>
+                    </pic:blipFill>
+                    <pic:spPr>
+                      <a:xfrm>
+                        <a:off x="0" y="0"/>
+                        <a:ext cx="5943600" cy="4272915"/>
+                      </a:xfrm>
+                      <a:prstGeom prst="rect">
+                        <a:avLst/>
+                      </a:prstGeom>
+                    </pic:spPr>
+                  </pic:pic>
+                </a:graphicData>
+              </a:graphic>
+            </wp:inline>
+          </w:drawing>
+        </w:r>
+      </w:ins>
     </w:p>
     <w:p>
       <w:pPr>
@@ -2780,14 +2766,14 @@
         </w:rPr>
         <w:t xml:space="preserve"> respectively, supported by a rebound in tourist arrivals, increased construction activity and growth in the </w:t>
       </w:r>
-      <w:commentRangeStart w:id="6"/>
+      <w:commentRangeStart w:id="8"/>
       <w:r>
         <w:rPr>
           <w:rFonts w:cs="Calibri"/>
         </w:rPr>
         <w:t xml:space="preserve">business process outsourcing (BPO) sector. </w:t>
       </w:r>
-      <w:commentRangeEnd w:id="6"/>
+      <w:commentRangeEnd w:id="8"/>
       <w:r>
         <w:rPr>
           <w:rStyle w:val="CommentReference"/>
@@ -2795,7 +2781,7 @@
           <w:sz w:val="22"/>
           <w:szCs w:val="22"/>
         </w:rPr>
-        <w:commentReference w:id="6"/>
+        <w:commentReference w:id="8"/>
       </w:r>
       <w:r>
         <w:rPr>
@@ -2835,7 +2821,7 @@
           <w:rFonts w:cs="Calibri"/>
         </w:rPr>
       </w:pPr>
-      <w:commentRangeStart w:id="7"/>
+      <w:commentRangeStart w:id="9"/>
       <w:r>
         <w:rPr>
           <w:rFonts w:cs="Calibri"/>
@@ -2963,7 +2949,7 @@
         </w:rPr>
         <w:t xml:space="preserve">, </w:t>
       </w:r>
-      <w:commentRangeStart w:id="8"/>
+      <w:commentRangeStart w:id="10"/>
       <w:r>
         <w:rPr>
           <w:rFonts w:cs="Calibri"/>
@@ -3006,7 +2992,7 @@
         </w:rPr>
         <w:t xml:space="preserve"> the business environment and reducing the prevalence of crime.</w:t>
       </w:r>
-      <w:commentRangeEnd w:id="8"/>
+      <w:commentRangeEnd w:id="10"/>
       <w:r>
         <w:rPr>
           <w:rStyle w:val="CommentReference"/>
@@ -3014,9 +3000,9 @@
           <w:sz w:val="22"/>
           <w:szCs w:val="22"/>
         </w:rPr>
-        <w:commentReference w:id="8"/>
-      </w:r>
-      <w:commentRangeEnd w:id="7"/>
+        <w:commentReference w:id="10"/>
+      </w:r>
+      <w:commentRangeEnd w:id="9"/>
       <w:r>
         <w:rPr>
           <w:rStyle w:val="CommentReference"/>
@@ -3024,7 +3010,7 @@
           <w:sz w:val="22"/>
           <w:szCs w:val="22"/>
         </w:rPr>
-        <w:commentReference w:id="7"/>
+        <w:commentReference w:id="9"/>
       </w:r>
     </w:p>
     <w:p>
@@ -3046,7 +3032,7 @@
           <w:rFonts w:cs="Calibri"/>
         </w:rPr>
       </w:pPr>
-      <w:commentRangeStart w:id="9"/>
+      <w:commentRangeStart w:id="11"/>
       <w:r>
         <w:rPr>
           <w:rFonts w:cs="Calibri"/>
@@ -3130,7 +3116,7 @@
         </w:rPr>
         <w:t xml:space="preserve"> </w:t>
       </w:r>
-      <w:commentRangeEnd w:id="9"/>
+      <w:commentRangeEnd w:id="11"/>
       <w:r>
         <w:rPr>
           <w:rStyle w:val="CommentReference"/>
@@ -3138,7 +3124,7 @@
           <w:sz w:val="22"/>
           <w:szCs w:val="22"/>
         </w:rPr>
-        <w:commentReference w:id="9"/>
+        <w:commentReference w:id="11"/>
       </w:r>
       <w:r>
         <w:rPr>
@@ -3289,7 +3275,7 @@
         </w:rPr>
         <w:t xml:space="preserve"> </w:t>
       </w:r>
-      <w:commentRangeStart w:id="10"/>
+      <w:commentRangeStart w:id="12"/>
       <w:r>
         <w:rPr>
           <w:rFonts w:cs="Calibri"/>
@@ -3350,7 +3336,7 @@
         </w:rPr>
         <w:t>2025 and is projected to increase to approximately 53.7% by 2035.</w:t>
       </w:r>
-      <w:commentRangeEnd w:id="10"/>
+      <w:commentRangeEnd w:id="12"/>
       <w:r>
         <w:rPr>
           <w:rStyle w:val="CommentReference"/>
@@ -3358,7 +3344,7 @@
           <w:sz w:val="22"/>
           <w:szCs w:val="22"/>
         </w:rPr>
-        <w:commentReference w:id="10"/>
+        <w:commentReference w:id="12"/>
       </w:r>
       <w:r>
         <w:rPr>
@@ -3615,7 +3601,7 @@
         </w:rPr>
         <w:t xml:space="preserve">ravel receipts have become an increasingly important component of Belize’s external services account, rising from </w:t>
       </w:r>
-      <w:commentRangeStart w:id="11"/>
+      <w:commentRangeStart w:id="13"/>
       <w:r>
         <w:rPr>
           <w:rFonts w:cs="Calibri"/>
@@ -3634,7 +3620,7 @@
         </w:rPr>
         <w:t xml:space="preserve"> in 2024.</w:t>
       </w:r>
-      <w:commentRangeEnd w:id="11"/>
+      <w:commentRangeEnd w:id="13"/>
       <w:r>
         <w:rPr>
           <w:rStyle w:val="CommentReference"/>
@@ -3642,7 +3628,7 @@
           <w:sz w:val="22"/>
           <w:szCs w:val="22"/>
         </w:rPr>
-        <w:commentReference w:id="11"/>
+        <w:commentReference w:id="13"/>
       </w:r>
       <w:r>
         <w:rPr>
@@ -3803,7 +3789,7 @@
           <w:szCs w:val="22"/>
         </w:rPr>
       </w:pPr>
-      <w:commentRangeStart w:id="12"/>
+      <w:commentRangeStart w:id="14"/>
       <w:r>
         <w:rPr>
           <w:b/>
@@ -3909,7 +3895,7 @@
         </w:rPr>
         <w:t>Belize Growth Accounting Decomposition (Avg. Annual Contribution to Real GDP)</w:t>
       </w:r>
-      <w:commentRangeEnd w:id="12"/>
+      <w:commentRangeEnd w:id="14"/>
       <w:r>
         <w:rPr>
           <w:rStyle w:val="CommentReference"/>
@@ -3920,7 +3906,7 @@
           <w:sz w:val="22"/>
           <w:szCs w:val="22"/>
         </w:rPr>
-        <w:commentReference w:id="12"/>
+        <w:commentReference w:id="14"/>
       </w:r>
     </w:p>
     <w:p>
@@ -3935,6 +3921,7 @@
       <w:r>
         <w:rPr>
           <w:rFonts w:cs="Calibri"/>
+          <w:noProof/>
         </w:rPr>
         <w:drawing>
           <wp:inline distT="0" distB="0" distL="0" distR="0" wp14:anchorId="55F8649F" wp14:editId="78785BD2">
@@ -4086,19 +4073,7 @@
         <w:rPr>
           <w:rFonts w:cs="Calibri"/>
         </w:rPr>
-        <w:t xml:space="preserve">The 2020–2023 period reflects the extraordinary disruptions associated with the COVID-19 pandemic and the subsequent recovery. Despite severe economic contraction during 2020, the </w:t>
-      </w:r>
-      <w:r>
-        <w:rPr>
-          <w:rFonts w:cs="Calibri"/>
-        </w:rPr>
-        <w:t>average period</w:t>
-      </w:r>
-      <w:r>
-        <w:rPr>
-          <w:rFonts w:cs="Calibri"/>
-        </w:rPr>
-        <w:t xml:space="preserve"> still shows positive contributions from capital and labour, reflecting the rapid rebound in tourism, employment recovery, and post-pandemic investment activity. TFP appears close to neutral over this period, suggesting that the recovery was driven more by cyclical reopening effects than by deeper productivity-enhancing structural transformation.</w:t>
+        <w:t>The 2020–2023 period reflects the extraordinary disruptions associated with the COVID-19 pandemic and the subsequent recovery. Despite severe economic contraction during 2020, the average period still shows positive contributions from capital and labour, reflecting the rapid rebound in tourism, employment recovery, and post-pandemic investment activity. TFP appears close to neutral over this period, suggesting that the recovery was driven more by cyclical reopening effects than by deeper productivity-enhancing structural transformation.</w:t>
       </w:r>
     </w:p>
     <w:p>
@@ -4146,15 +4121,15 @@
           <w:rFonts w:cs="Calibri"/>
         </w:rPr>
       </w:pPr>
-      <w:commentRangeStart w:id="13"/>
-      <w:commentRangeStart w:id="14"/>
+      <w:commentRangeStart w:id="15"/>
+      <w:commentRangeStart w:id="16"/>
       <w:r>
         <w:rPr>
           <w:rFonts w:cs="Calibri"/>
         </w:rPr>
         <w:t xml:space="preserve">Comparator economies such as Costa Rica, the Dominican Republic, and Mauritius provide </w:t>
       </w:r>
-      <w:commentRangeEnd w:id="14"/>
+      <w:commentRangeEnd w:id="16"/>
       <w:r>
         <w:rPr>
           <w:rStyle w:val="CommentReference"/>
@@ -4162,7 +4137,7 @@
           <w:sz w:val="22"/>
           <w:szCs w:val="22"/>
         </w:rPr>
-        <w:commentReference w:id="14"/>
+        <w:commentReference w:id="16"/>
       </w:r>
       <w:r>
         <w:rPr>
@@ -4194,7 +4169,7 @@
         </w:rPr>
         <w:t xml:space="preserve">GNI grew by only 19.3%, reflecting the presence of a persistent middle-income trap dynamics, which is limiting long-term income convergence relative to the selected comparator countries. </w:t>
       </w:r>
-      <w:commentRangeEnd w:id="13"/>
+      <w:commentRangeEnd w:id="15"/>
       <w:r>
         <w:rPr>
           <w:rStyle w:val="CommentReference"/>
@@ -4202,7 +4177,7 @@
           <w:sz w:val="22"/>
           <w:szCs w:val="22"/>
         </w:rPr>
-        <w:commentReference w:id="13"/>
+        <w:commentReference w:id="15"/>
       </w:r>
     </w:p>
     <w:p>
@@ -4461,7 +4436,7 @@
           <w:szCs w:val="22"/>
         </w:rPr>
       </w:pPr>
-      <w:commentRangeStart w:id="15"/>
+      <w:commentRangeStart w:id="17"/>
       <w:r>
         <w:rPr>
           <w:rFonts w:cs="Calibri"/>
@@ -4576,7 +4551,7 @@
         </w:rPr>
         <w:t xml:space="preserve">Gross National Income Per Capita, PPP (Constant 2021 Internation $) </w:t>
       </w:r>
-      <w:commentRangeEnd w:id="15"/>
+      <w:commentRangeEnd w:id="17"/>
       <w:r>
         <w:rPr>
           <w:rStyle w:val="CommentReference"/>
@@ -4588,7 +4563,7 @@
           <w:sz w:val="22"/>
           <w:szCs w:val="22"/>
         </w:rPr>
-        <w:commentReference w:id="15"/>
+        <w:commentReference w:id="17"/>
       </w:r>
     </w:p>
     <w:p>
@@ -4927,7 +4902,7 @@
         </w:rPr>
         <w:t xml:space="preserve"> </w:t>
       </w:r>
-      <w:commentRangeStart w:id="16"/>
+      <w:commentRangeStart w:id="18"/>
       <w:r>
         <w:rPr>
           <w:rFonts w:ascii="Trebuchet MS" w:hAnsi="Trebuchet MS"/>
@@ -4958,7 +4933,7 @@
         </w:rPr>
         <w:t>Trends</w:t>
       </w:r>
-      <w:commentRangeEnd w:id="16"/>
+      <w:commentRangeEnd w:id="18"/>
       <w:r>
         <w:rPr>
           <w:rStyle w:val="CommentReference"/>
@@ -4968,7 +4943,7 @@
           <w:sz w:val="28"/>
           <w:szCs w:val="28"/>
         </w:rPr>
-        <w:commentReference w:id="16"/>
+        <w:commentReference w:id="18"/>
       </w:r>
     </w:p>
     <w:p>
@@ -4993,14 +4968,14 @@
           <w:rFonts w:cs="Calibri"/>
         </w:rPr>
       </w:pPr>
-      <w:commentRangeStart w:id="17"/>
+      <w:commentRangeStart w:id="19"/>
       <w:r>
         <w:rPr>
           <w:rFonts w:cs="Calibri"/>
         </w:rPr>
         <w:t xml:space="preserve">Belize’s estimated mid-year population in 2026 stood at </w:t>
       </w:r>
-      <w:commentRangeStart w:id="18"/>
+      <w:commentRangeStart w:id="20"/>
       <w:r>
         <w:rPr>
           <w:rFonts w:cs="Calibri"/>
@@ -5013,7 +4988,7 @@
         </w:rPr>
         <w:t>, comprising 210,525 males and 217,869 females,</w:t>
       </w:r>
-      <w:commentRangeEnd w:id="18"/>
+      <w:commentRangeEnd w:id="20"/>
       <w:r>
         <w:rPr>
           <w:rStyle w:val="CommentReference"/>
@@ -5021,7 +4996,7 @@
           <w:sz w:val="22"/>
           <w:szCs w:val="22"/>
         </w:rPr>
-        <w:commentReference w:id="18"/>
+        <w:commentReference w:id="20"/>
       </w:r>
       <w:r>
         <w:rPr>
@@ -5035,7 +5010,7 @@
         </w:rPr>
         <w:t xml:space="preserve">. </w:t>
       </w:r>
-      <w:commentRangeEnd w:id="17"/>
+      <w:commentRangeEnd w:id="19"/>
       <w:r>
         <w:rPr>
           <w:rStyle w:val="CommentReference"/>
@@ -5043,7 +5018,7 @@
           <w:sz w:val="22"/>
           <w:szCs w:val="22"/>
         </w:rPr>
-        <w:commentReference w:id="17"/>
+        <w:commentReference w:id="19"/>
       </w:r>
       <w:r>
         <w:rPr>
@@ -5051,7 +5026,7 @@
         </w:rPr>
         <w:t xml:space="preserve">Between 2015 and 2026, </w:t>
       </w:r>
-      <w:commentRangeStart w:id="19"/>
+      <w:commentRangeStart w:id="21"/>
       <w:r>
         <w:rPr>
           <w:rFonts w:cs="Calibri"/>
@@ -5076,7 +5051,7 @@
         </w:rPr>
         <w:t xml:space="preserve"> </w:t>
       </w:r>
-      <w:commentRangeEnd w:id="19"/>
+      <w:commentRangeEnd w:id="21"/>
       <w:r>
         <w:rPr>
           <w:rStyle w:val="CommentReference"/>
@@ -5084,7 +5059,7 @@
           <w:sz w:val="22"/>
           <w:szCs w:val="22"/>
         </w:rPr>
-        <w:commentReference w:id="19"/>
+        <w:commentReference w:id="21"/>
       </w:r>
     </w:p>
     <w:p>
@@ -5128,14 +5103,14 @@
         </w:rPr>
         <w:t xml:space="preserve">small developing </w:t>
       </w:r>
-      <w:commentRangeStart w:id="20"/>
+      <w:commentRangeStart w:id="22"/>
       <w:r>
         <w:rPr>
           <w:rFonts w:cs="Calibri"/>
         </w:rPr>
         <w:t>states</w:t>
       </w:r>
-      <w:commentRangeEnd w:id="20"/>
+      <w:commentRangeEnd w:id="22"/>
       <w:r>
         <w:rPr>
           <w:rStyle w:val="CommentReference"/>
@@ -5143,7 +5118,7 @@
           <w:sz w:val="22"/>
           <w:szCs w:val="22"/>
         </w:rPr>
-        <w:commentReference w:id="20"/>
+        <w:commentReference w:id="22"/>
       </w:r>
       <w:r>
         <w:rPr>
@@ -5157,7 +5132,7 @@
         </w:rPr>
         <w:t xml:space="preserve"> is becoming increasingly ruralized. </w:t>
       </w:r>
-      <w:commentRangeStart w:id="21"/>
+      <w:commentRangeStart w:id="23"/>
       <w:r>
         <w:rPr>
           <w:rFonts w:cs="Calibri"/>
@@ -5194,7 +5169,7 @@
         </w:rPr>
         <w:t xml:space="preserve"> several districts emerging as key labour supply centers</w:t>
       </w:r>
-      <w:commentRangeEnd w:id="21"/>
+      <w:commentRangeEnd w:id="23"/>
       <w:r>
         <w:rPr>
           <w:rStyle w:val="CommentReference"/>
@@ -5202,7 +5177,7 @@
           <w:sz w:val="22"/>
           <w:szCs w:val="22"/>
         </w:rPr>
-        <w:commentReference w:id="21"/>
+        <w:commentReference w:id="23"/>
       </w:r>
       <w:r>
         <w:rPr>
@@ -5266,7 +5241,7 @@
         </w:rPr>
         <w:t xml:space="preserve"> </w:t>
       </w:r>
-      <w:commentRangeStart w:id="22"/>
+      <w:commentRangeStart w:id="24"/>
       <w:r>
         <w:rPr>
           <w:rFonts w:cs="Calibri"/>
@@ -5285,7 +5260,7 @@
         </w:rPr>
         <w:t xml:space="preserve">  </w:t>
       </w:r>
-      <w:commentRangeEnd w:id="22"/>
+      <w:commentRangeEnd w:id="24"/>
       <w:r>
         <w:rPr>
           <w:rStyle w:val="CommentReference"/>
@@ -5293,7 +5268,7 @@
           <w:sz w:val="22"/>
           <w:szCs w:val="22"/>
         </w:rPr>
-        <w:commentReference w:id="22"/>
+        <w:commentReference w:id="24"/>
       </w:r>
     </w:p>
     <w:p>
@@ -5367,14 +5342,14 @@
         </w:rPr>
         <w:t xml:space="preserve"> pressures on the economy’s capacity to generate productive employment opportunities, particularly for youth entering the labor market. At the same time, </w:t>
       </w:r>
-      <w:commentRangeStart w:id="23"/>
+      <w:commentRangeStart w:id="25"/>
       <w:r>
         <w:rPr>
           <w:rFonts w:cs="Calibri"/>
         </w:rPr>
         <w:t>sustained population growth raises demand for housing, education, healthcare, transportation, and other public infrastructure</w:t>
       </w:r>
-      <w:commentRangeEnd w:id="23"/>
+      <w:commentRangeEnd w:id="25"/>
       <w:r>
         <w:rPr>
           <w:rStyle w:val="CommentReference"/>
@@ -5382,7 +5357,7 @@
           <w:sz w:val="22"/>
           <w:szCs w:val="22"/>
         </w:rPr>
-        <w:commentReference w:id="23"/>
+        <w:commentReference w:id="25"/>
       </w:r>
       <w:r>
         <w:rPr>
@@ -5488,7 +5463,7 @@
           <w:rFonts w:cs="Calibri"/>
         </w:rPr>
       </w:pPr>
-      <w:commentRangeStart w:id="24"/>
+      <w:commentRangeStart w:id="26"/>
       <w:r>
         <w:rPr>
           <w:rFonts w:cs="Calibri"/>
@@ -5514,7 +5489,7 @@
         </w:rPr>
         <w:t>, reflecting a relatively youthful demographic structure. The dependency burden is concentrated among the younger cohort of the population, as evidenced by a youth dependence ratio of 43.8%, while the old-age dependency ratio is comparatively low at 10.9</w:t>
       </w:r>
-      <w:commentRangeEnd w:id="24"/>
+      <w:commentRangeEnd w:id="26"/>
       <w:r>
         <w:rPr>
           <w:rStyle w:val="CommentReference"/>
@@ -5522,7 +5497,7 @@
           <w:sz w:val="22"/>
           <w:szCs w:val="22"/>
         </w:rPr>
-        <w:commentReference w:id="24"/>
+        <w:commentReference w:id="26"/>
       </w:r>
       <w:r>
         <w:rPr>
@@ -5637,7 +5612,7 @@
           <w:szCs w:val="22"/>
         </w:rPr>
       </w:pPr>
-      <w:commentRangeStart w:id="25"/>
+      <w:commentRangeStart w:id="27"/>
       <w:r>
         <w:rPr>
           <w:rFonts w:cs="Calibri"/>
@@ -5724,7 +5699,7 @@
         </w:rPr>
         <w:t xml:space="preserve">: </w:t>
       </w:r>
-      <w:commentRangeEnd w:id="25"/>
+      <w:commentRangeEnd w:id="27"/>
       <w:r>
         <w:rPr>
           <w:rStyle w:val="CommentReference"/>
@@ -5736,7 +5711,7 @@
           <w:sz w:val="22"/>
           <w:szCs w:val="22"/>
         </w:rPr>
-        <w:commentReference w:id="25"/>
+        <w:commentReference w:id="27"/>
       </w:r>
     </w:p>
     <w:p>
@@ -5898,7 +5873,7 @@
         </w:rPr>
         <w:t xml:space="preserve"> </w:t>
       </w:r>
-      <w:commentRangeStart w:id="26"/>
+      <w:commentRangeStart w:id="28"/>
       <w:r>
         <w:rPr>
           <w:rFonts w:cs="Calibri"/>
@@ -5929,7 +5904,7 @@
         </w:rPr>
         <w:t xml:space="preserve"> are macro-critical, as it can weaken human capital deepening and constrain domestic labour market dynamism.</w:t>
       </w:r>
-      <w:commentRangeEnd w:id="26"/>
+      <w:commentRangeEnd w:id="28"/>
       <w:r>
         <w:rPr>
           <w:rStyle w:val="CommentReference"/>
@@ -5937,7 +5912,7 @@
           <w:sz w:val="22"/>
           <w:szCs w:val="22"/>
         </w:rPr>
-        <w:commentReference w:id="26"/>
+        <w:commentReference w:id="28"/>
       </w:r>
     </w:p>
     <w:p>
@@ -6105,7 +6080,7 @@
           <w:szCs w:val="22"/>
         </w:rPr>
       </w:pPr>
-      <w:commentRangeStart w:id="27"/>
+      <w:commentRangeStart w:id="29"/>
       <w:r>
         <w:rPr>
           <w:b/>
@@ -6212,7 +6187,7 @@
         </w:rPr>
         <w:t>Belize Demographic Transition, 2015-2025</w:t>
       </w:r>
-      <w:commentRangeEnd w:id="27"/>
+      <w:commentRangeEnd w:id="29"/>
       <w:r>
         <w:rPr>
           <w:rStyle w:val="CommentReference"/>
@@ -6223,7 +6198,7 @@
           <w:sz w:val="22"/>
           <w:szCs w:val="22"/>
         </w:rPr>
-        <w:commentReference w:id="27"/>
+        <w:commentReference w:id="29"/>
       </w:r>
     </w:p>
     <w:p>
@@ -6474,14 +6449,14 @@
         </w:rPr>
         <w:t xml:space="preserve"> likely reflects expanding economic opportunities associated with the growth of the tourism sector as well as inward migration from neighbouring Central American countries. Net migration flows strengthened during the 2000s, contributing to the expansion of the labour force and total population growth. Migration patterns, however, remain highly sensitive to economic conditions, </w:t>
       </w:r>
-      <w:commentRangeStart w:id="28"/>
+      <w:commentRangeStart w:id="30"/>
       <w:r>
         <w:rPr>
           <w:rFonts w:cs="Calibri"/>
         </w:rPr>
         <w:t>as evidenced by the sharp decline during the COVID-19 pandemic and the subsequent rebound in 2022</w:t>
       </w:r>
-      <w:commentRangeEnd w:id="28"/>
+      <w:commentRangeEnd w:id="30"/>
       <w:r>
         <w:rPr>
           <w:rStyle w:val="CommentReference"/>
@@ -6489,7 +6464,7 @@
           <w:sz w:val="22"/>
           <w:szCs w:val="22"/>
         </w:rPr>
-        <w:commentReference w:id="28"/>
+        <w:commentReference w:id="30"/>
       </w:r>
       <w:r>
         <w:rPr>
@@ -6996,7 +6971,7 @@
           <w:szCs w:val="28"/>
         </w:rPr>
       </w:pPr>
-      <w:commentRangeStart w:id="29"/>
+      <w:commentRangeStart w:id="31"/>
       <w:r>
         <w:rPr>
           <w:rFonts w:ascii="Trebuchet MS" w:hAnsi="Trebuchet MS"/>
@@ -7008,7 +6983,7 @@
         <w:lastRenderedPageBreak/>
         <w:t>Labour Market Assessment</w:t>
       </w:r>
-      <w:commentRangeEnd w:id="29"/>
+      <w:commentRangeEnd w:id="31"/>
       <w:r>
         <w:rPr>
           <w:rStyle w:val="CommentReference"/>
@@ -7018,7 +6993,7 @@
           <w:sz w:val="28"/>
           <w:szCs w:val="28"/>
         </w:rPr>
-        <w:commentReference w:id="29"/>
+        <w:commentReference w:id="31"/>
       </w:r>
     </w:p>
     <w:bookmarkEnd w:id="0"/>
@@ -7610,7 +7585,7 @@
           <w:rFonts w:cs="Aptos Serif"/>
         </w:rPr>
       </w:pPr>
-      <w:commentRangeStart w:id="30"/>
+      <w:commentRangeStart w:id="32"/>
       <w:r>
         <w:rPr>
           <w:rFonts w:cs="Aptos Serif"/>
@@ -7739,7 +7714,7 @@
         </w:rPr>
         <w:t xml:space="preserve"> The population with secondary education increased from 50,037 persons in 2015 to 70,051 persons in 2024, equivalent to 40.0%. Similarly, the number of persons with tertiary education expanded from 35,229 to 54,025 over the same period, representing an increase of nearly 53.4%. This growth in tertiary education attainment suggests a gradual deepening of Belize’s skilled labour force and may reflect expanded access to higher education, increased educational participation and changing labour market demands.</w:t>
       </w:r>
-      <w:commentRangeEnd w:id="30"/>
+      <w:commentRangeEnd w:id="32"/>
       <w:r>
         <w:rPr>
           <w:rStyle w:val="CommentReference"/>
@@ -7747,7 +7722,7 @@
           <w:sz w:val="22"/>
           <w:szCs w:val="22"/>
         </w:rPr>
-        <w:commentReference w:id="30"/>
+        <w:commentReference w:id="32"/>
       </w:r>
     </w:p>
     <w:p>
@@ -10059,7 +10034,7 @@
                 <w:szCs w:val="20"/>
               </w:rPr>
             </w:pPr>
-            <w:commentRangeStart w:id="31"/>
+            <w:commentRangeStart w:id="33"/>
             <w:r>
               <w:rPr>
                 <w:rFonts w:cs="Calibri"/>
@@ -10086,7 +10061,7 @@
               </w:rPr>
               <w:t xml:space="preserve">175,944 </w:t>
             </w:r>
-            <w:commentRangeEnd w:id="31"/>
+            <w:commentRangeEnd w:id="33"/>
             <w:r>
               <w:rPr>
                 <w:rStyle w:val="CommentReference"/>
@@ -10094,7 +10069,7 @@
                 <w:sz w:val="20"/>
                 <w:szCs w:val="20"/>
               </w:rPr>
-              <w:commentReference w:id="31"/>
+              <w:commentReference w:id="33"/>
             </w:r>
           </w:p>
         </w:tc>
@@ -10259,7 +10234,7 @@
           <w:szCs w:val="24"/>
         </w:rPr>
       </w:pPr>
-      <w:commentRangeStart w:id="32"/>
+      <w:commentRangeStart w:id="34"/>
       <w:r>
         <w:rPr>
           <w:b/>
@@ -10270,7 +10245,7 @@
         <w:lastRenderedPageBreak/>
         <w:t>Gender Participation Gap</w:t>
       </w:r>
-      <w:commentRangeEnd w:id="32"/>
+      <w:commentRangeEnd w:id="34"/>
       <w:r>
         <w:rPr>
           <w:rStyle w:val="CommentReference"/>
@@ -10279,7 +10254,7 @@
           <w:sz w:val="24"/>
           <w:szCs w:val="24"/>
         </w:rPr>
-        <w:commentReference w:id="32"/>
+        <w:commentReference w:id="34"/>
       </w:r>
     </w:p>
     <w:p>
@@ -10390,7 +10365,7 @@
           <w:szCs w:val="22"/>
         </w:rPr>
       </w:pPr>
-      <w:commentRangeStart w:id="33"/>
+      <w:commentRangeStart w:id="35"/>
       <w:r>
         <w:rPr>
           <w:b/>
@@ -10496,7 +10471,7 @@
         </w:rPr>
         <w:t>Belize: Labour Force Participation and Gender Gap</w:t>
       </w:r>
-      <w:commentRangeEnd w:id="33"/>
+      <w:commentRangeEnd w:id="35"/>
       <w:r>
         <w:rPr>
           <w:rStyle w:val="CommentReference"/>
@@ -10507,7 +10482,7 @@
           <w:sz w:val="22"/>
           <w:szCs w:val="22"/>
         </w:rPr>
-        <w:commentReference w:id="33"/>
+        <w:commentReference w:id="35"/>
       </w:r>
     </w:p>
     <w:p>
@@ -10633,14 +10608,14 @@
         <w:lastRenderedPageBreak/>
         <w:t xml:space="preserve">domestic responsibilities, transportation limitations, </w:t>
       </w:r>
-      <w:commentRangeStart w:id="34"/>
+      <w:commentRangeStart w:id="36"/>
       <w:r>
         <w:rPr>
           <w:rFonts w:cs="Calibri"/>
         </w:rPr>
         <w:t xml:space="preserve">occupational segregation, </w:t>
       </w:r>
-      <w:commentRangeEnd w:id="34"/>
+      <w:commentRangeEnd w:id="36"/>
       <w:r>
         <w:rPr>
           <w:rStyle w:val="CommentReference"/>
@@ -10648,7 +10623,7 @@
           <w:sz w:val="22"/>
           <w:szCs w:val="22"/>
         </w:rPr>
-        <w:commentReference w:id="34"/>
+        <w:commentReference w:id="36"/>
       </w:r>
       <w:r>
         <w:rPr>
@@ -11846,14 +11821,14 @@
         </w:rPr>
         <w:t xml:space="preserve">The decline in labour force participation has coincided with a substantial increase in the number </w:t>
       </w:r>
-      <w:commentRangeStart w:id="35"/>
+      <w:commentRangeStart w:id="37"/>
       <w:r>
         <w:rPr>
           <w:rFonts w:cs="Calibri"/>
         </w:rPr>
         <w:t>of persons remaining outside the labour force. The economically inactive working-age population increased from 81,344 persons in September 2019, equivalent to approximately 29.9% of the working-age population, to 130,909 persons by September 2025, representing approximately 41.9% of the working-age population. Overall, the number of economically inactive persons increased by 49,565 persons between 2019 and 2025, equivalent to a cumulative increase of approximately 60.9%.</w:t>
       </w:r>
-      <w:commentRangeEnd w:id="35"/>
+      <w:commentRangeEnd w:id="37"/>
       <w:r>
         <w:rPr>
           <w:rStyle w:val="CommentReference"/>
@@ -11861,7 +11836,7 @@
           <w:sz w:val="22"/>
           <w:szCs w:val="22"/>
         </w:rPr>
-        <w:commentReference w:id="35"/>
+        <w:commentReference w:id="37"/>
       </w:r>
     </w:p>
     <w:p>
@@ -12131,7 +12106,7 @@
           <w:szCs w:val="22"/>
         </w:rPr>
       </w:pPr>
-      <w:commentRangeStart w:id="36"/>
+      <w:commentRangeStart w:id="38"/>
       <w:r>
         <w:rPr>
           <w:b/>
@@ -12143,7 +12118,7 @@
         </w:rPr>
         <w:t>Belize: Persons Outside the Labour Force by Sex</w:t>
       </w:r>
-      <w:commentRangeEnd w:id="36"/>
+      <w:commentRangeEnd w:id="38"/>
       <w:r>
         <w:rPr>
           <w:rStyle w:val="CommentReference"/>
@@ -12154,7 +12129,7 @@
           <w:sz w:val="22"/>
           <w:szCs w:val="22"/>
         </w:rPr>
-        <w:commentReference w:id="36"/>
+        <w:commentReference w:id="38"/>
       </w:r>
     </w:p>
     <w:p>
@@ -12243,7 +12218,7 @@
           <w:rFonts w:cs="Calibri"/>
         </w:rPr>
       </w:pPr>
-      <w:commentRangeStart w:id="37"/>
+      <w:commentRangeStart w:id="39"/>
       <w:r>
         <w:rPr>
           <w:rFonts w:cs="Calibri"/>
@@ -12271,7 +12246,7 @@
         </w:rPr>
         <w:t xml:space="preserve"> </w:t>
       </w:r>
-      <w:commentRangeEnd w:id="37"/>
+      <w:commentRangeEnd w:id="39"/>
       <w:r>
         <w:rPr>
           <w:rStyle w:val="CommentReference"/>
@@ -12279,7 +12254,7 @@
           <w:sz w:val="22"/>
           <w:szCs w:val="22"/>
         </w:rPr>
-        <w:commentReference w:id="37"/>
+        <w:commentReference w:id="39"/>
       </w:r>
       <w:r>
         <w:rPr>
@@ -12309,7 +12284,7 @@
           <w:rFonts w:cs="Calibri"/>
         </w:rPr>
       </w:pPr>
-      <w:commentRangeStart w:id="38"/>
+      <w:commentRangeStart w:id="40"/>
       <w:r>
         <w:rPr>
           <w:rFonts w:cs="Calibri"/>
@@ -12323,7 +12298,7 @@
         <w:lastRenderedPageBreak/>
         <w:t>may constrain labour utilization, productivity growth, household income generation, and the country’s ability to fully capitalize on its demographic dividend. These findings therefore underscore the importance of policies aimed at strengthening female labour market participation through investments in childcare services, transportation infrastructure, skills development, flexible work arrangements, and broader labour market inclusion initiatives.</w:t>
       </w:r>
-      <w:commentRangeEnd w:id="38"/>
+      <w:commentRangeEnd w:id="40"/>
       <w:r>
         <w:rPr>
           <w:rStyle w:val="CommentReference"/>
@@ -12331,7 +12306,7 @@
           <w:sz w:val="22"/>
           <w:szCs w:val="22"/>
         </w:rPr>
-        <w:commentReference w:id="38"/>
+        <w:commentReference w:id="40"/>
       </w:r>
     </w:p>
     <w:p>
@@ -12469,7 +12444,7 @@
       </w:r>
     </w:p>
   </w:comment>
-  <w:comment w:id="6" w:author="Tommy Descartes" w:date="2026-05-14T09:03:00Z" w:initials="TD">
+  <w:comment w:id="8" w:author="Tommy Descartes" w:date="2026-05-14T09:03:00Z" w:initials="TD">
     <w:p>
       <w:pPr>
         <w:pStyle w:val="CommentText"/>
@@ -12485,7 +12460,7 @@
       </w:r>
     </w:p>
   </w:comment>
-  <w:comment w:id="8" w:author="Tommy Descartes" w:date="2026-05-12T17:37:00Z" w:initials="TD">
+  <w:comment w:id="10" w:author="Tommy Descartes" w:date="2026-05-12T17:37:00Z" w:initials="TD">
     <w:p>
       <w:pPr>
         <w:pStyle w:val="CommentText"/>
@@ -12501,7 +12476,7 @@
       </w:r>
     </w:p>
   </w:comment>
-  <w:comment w:id="7" w:author="Tommy Descartes" w:date="2026-05-14T11:53:00Z" w:initials="TD">
+  <w:comment w:id="9" w:author="Tommy Descartes" w:date="2026-05-14T11:53:00Z" w:initials="TD">
     <w:p>
       <w:pPr>
         <w:pStyle w:val="CommentText"/>
@@ -12517,7 +12492,7 @@
       </w:r>
     </w:p>
   </w:comment>
-  <w:comment w:id="9" w:author="Tommy Descartes" w:date="2026-05-25T18:34:00Z" w:initials="TD">
+  <w:comment w:id="11" w:author="Tommy Descartes" w:date="2026-05-25T18:34:00Z" w:initials="TD">
     <w:p>
       <w:pPr>
         <w:pStyle w:val="CommentText"/>
@@ -12533,7 +12508,7 @@
       </w:r>
     </w:p>
   </w:comment>
-  <w:comment w:id="10" w:author="Tommy Descartes" w:date="2026-05-14T10:57:00Z" w:initials="TD">
+  <w:comment w:id="12" w:author="Tommy Descartes" w:date="2026-05-14T10:57:00Z" w:initials="TD">
     <w:p>
       <w:pPr>
         <w:pStyle w:val="CommentText"/>
@@ -12549,7 +12524,7 @@
       </w:r>
     </w:p>
   </w:comment>
-  <w:comment w:id="11" w:author="Tommy Descartes" w:date="2026-05-15T11:54:00Z" w:initials="TD">
+  <w:comment w:id="13" w:author="Tommy Descartes" w:date="2026-05-15T11:54:00Z" w:initials="TD">
     <w:p>
       <w:pPr>
         <w:pStyle w:val="CommentText"/>
@@ -12565,7 +12540,7 @@
       </w:r>
     </w:p>
   </w:comment>
-  <w:comment w:id="12" w:author="Tommy Descartes" w:date="2026-05-25T18:51:00Z" w:initials="TD">
+  <w:comment w:id="14" w:author="Tommy Descartes" w:date="2026-05-25T18:51:00Z" w:initials="TD">
     <w:p>
       <w:pPr>
         <w:pStyle w:val="CommentText"/>
@@ -12581,7 +12556,7 @@
       </w:r>
     </w:p>
   </w:comment>
-  <w:comment w:id="14" w:author="Tommy Descartes" w:date="2026-05-14T12:09:00Z" w:initials="TD">
+  <w:comment w:id="16" w:author="Tommy Descartes" w:date="2026-05-14T12:09:00Z" w:initials="TD">
     <w:p>
       <w:pPr>
         <w:pStyle w:val="CommentText"/>
@@ -12597,7 +12572,7 @@
       </w:r>
     </w:p>
   </w:comment>
-  <w:comment w:id="13" w:author="Tommy Descartes" w:date="2026-05-13T11:24:00Z" w:initials="TD">
+  <w:comment w:id="15" w:author="Tommy Descartes" w:date="2026-05-13T11:24:00Z" w:initials="TD">
     <w:p>
       <w:pPr>
         <w:pStyle w:val="CommentText"/>
@@ -12613,7 +12588,7 @@
       </w:r>
     </w:p>
   </w:comment>
-  <w:comment w:id="15" w:author="Tommy Descartes" w:date="2026-05-12T17:36:00Z" w:initials="TD">
+  <w:comment w:id="17" w:author="Tommy Descartes" w:date="2026-05-12T17:36:00Z" w:initials="TD">
     <w:p>
       <w:pPr>
         <w:pStyle w:val="CommentText"/>
@@ -12629,7 +12604,7 @@
       </w:r>
     </w:p>
   </w:comment>
-  <w:comment w:id="16" w:author="Tommy Descartes" w:date="2026-05-15T03:16:00Z" w:initials="TD">
+  <w:comment w:id="18" w:author="Tommy Descartes" w:date="2026-05-15T03:16:00Z" w:initials="TD">
     <w:p>
       <w:pPr>
         <w:pStyle w:val="CommentText"/>
@@ -12645,7 +12620,7 @@
       </w:r>
     </w:p>
   </w:comment>
-  <w:comment w:id="18" w:author="Tommy Descartes" w:date="2026-05-17T18:19:00Z" w:initials="TD">
+  <w:comment w:id="20" w:author="Tommy Descartes" w:date="2026-05-17T18:19:00Z" w:initials="TD">
     <w:p>
       <w:pPr>
         <w:pStyle w:val="CommentText"/>
@@ -12661,7 +12636,7 @@
       </w:r>
     </w:p>
   </w:comment>
-  <w:comment w:id="17" w:author="Tommy Descartes" w:date="2026-05-13T08:29:00Z" w:initials="TD">
+  <w:comment w:id="19" w:author="Tommy Descartes" w:date="2026-05-13T08:29:00Z" w:initials="TD">
     <w:p>
       <w:pPr>
         <w:pStyle w:val="CommentText"/>
@@ -12677,7 +12652,7 @@
       </w:r>
     </w:p>
   </w:comment>
-  <w:comment w:id="19" w:author="Tommy Descartes" w:date="2026-05-13T17:55:00Z" w:initials="TD">
+  <w:comment w:id="21" w:author="Tommy Descartes" w:date="2026-05-13T17:55:00Z" w:initials="TD">
     <w:p>
       <w:pPr>
         <w:pStyle w:val="CommentText"/>
@@ -12693,7 +12668,7 @@
       </w:r>
     </w:p>
   </w:comment>
-  <w:comment w:id="20" w:author="Tommy Descartes" w:date="2026-05-14T13:55:00Z" w:initials="TD">
+  <w:comment w:id="22" w:author="Tommy Descartes" w:date="2026-05-14T13:55:00Z" w:initials="TD">
     <w:p>
       <w:pPr>
         <w:pStyle w:val="CommentText"/>
@@ -12709,7 +12684,7 @@
       </w:r>
     </w:p>
   </w:comment>
-  <w:comment w:id="21" w:author="Tommy Descartes" w:date="2026-05-25T19:05:00Z" w:initials="TD">
+  <w:comment w:id="23" w:author="Tommy Descartes" w:date="2026-05-25T19:05:00Z" w:initials="TD">
     <w:p>
       <w:pPr>
         <w:pStyle w:val="CommentText"/>
@@ -12725,7 +12700,7 @@
       </w:r>
     </w:p>
   </w:comment>
-  <w:comment w:id="22" w:author="Tommy Descartes" w:date="2026-05-25T19:06:00Z" w:initials="TD">
+  <w:comment w:id="24" w:author="Tommy Descartes" w:date="2026-05-25T19:06:00Z" w:initials="TD">
     <w:p>
       <w:pPr>
         <w:pStyle w:val="CommentText"/>
@@ -12741,7 +12716,7 @@
       </w:r>
     </w:p>
   </w:comment>
-  <w:comment w:id="23" w:author="Tommy Descartes" w:date="2026-05-13T10:07:00Z" w:initials="TD">
+  <w:comment w:id="25" w:author="Tommy Descartes" w:date="2026-05-13T10:07:00Z" w:initials="TD">
     <w:p>
       <w:pPr>
         <w:pStyle w:val="CommentText"/>
@@ -12757,7 +12732,7 @@
       </w:r>
     </w:p>
   </w:comment>
-  <w:comment w:id="24" w:author="Tommy Descartes" w:date="2026-05-15T03:10:00Z" w:initials="TD">
+  <w:comment w:id="26" w:author="Tommy Descartes" w:date="2026-05-15T03:10:00Z" w:initials="TD">
     <w:p>
       <w:pPr>
         <w:pStyle w:val="CommentText"/>
@@ -12773,7 +12748,7 @@
       </w:r>
     </w:p>
   </w:comment>
-  <w:comment w:id="25" w:author="Tommy Descartes" w:date="2026-05-13T08:23:00Z" w:initials="TD">
+  <w:comment w:id="27" w:author="Tommy Descartes" w:date="2026-05-13T08:23:00Z" w:initials="TD">
     <w:p>
       <w:pPr>
         <w:pStyle w:val="CommentText"/>
@@ -12789,7 +12764,7 @@
       </w:r>
     </w:p>
   </w:comment>
-  <w:comment w:id="26" w:author="Tommy Descartes" w:date="2026-05-15T03:20:00Z" w:initials="TD">
+  <w:comment w:id="28" w:author="Tommy Descartes" w:date="2026-05-15T03:20:00Z" w:initials="TD">
     <w:p>
       <w:pPr>
         <w:pStyle w:val="CommentText"/>
@@ -12805,7 +12780,7 @@
       </w:r>
     </w:p>
   </w:comment>
-  <w:comment w:id="27" w:author="Tommy Descartes" w:date="2026-05-25T19:20:00Z" w:initials="TD">
+  <w:comment w:id="29" w:author="Tommy Descartes" w:date="2026-05-25T19:20:00Z" w:initials="TD">
     <w:p>
       <w:pPr>
         <w:pStyle w:val="CommentText"/>
@@ -12821,7 +12796,7 @@
       </w:r>
     </w:p>
   </w:comment>
-  <w:comment w:id="28" w:author="Tommy Descartes" w:date="2026-05-15T11:29:00Z" w:initials="TD">
+  <w:comment w:id="30" w:author="Tommy Descartes" w:date="2026-05-15T11:29:00Z" w:initials="TD">
     <w:p>
       <w:pPr>
         <w:pStyle w:val="CommentText"/>
@@ -12837,7 +12812,7 @@
       </w:r>
     </w:p>
   </w:comment>
-  <w:comment w:id="29" w:author="Tommy Descartes" w:date="2026-05-17T18:31:00Z" w:initials="TD">
+  <w:comment w:id="31" w:author="Tommy Descartes" w:date="2026-05-17T18:31:00Z" w:initials="TD">
     <w:p>
       <w:pPr>
         <w:pStyle w:val="CommentText"/>
@@ -12866,7 +12841,7 @@
       </w:r>
     </w:p>
   </w:comment>
-  <w:comment w:id="30" w:author="Tommy Descartes" w:date="2026-05-25T19:29:00Z" w:initials="TD">
+  <w:comment w:id="32" w:author="Tommy Descartes" w:date="2026-05-25T19:29:00Z" w:initials="TD">
     <w:p>
       <w:pPr>
         <w:pStyle w:val="CommentText"/>
@@ -12882,7 +12857,7 @@
       </w:r>
     </w:p>
   </w:comment>
-  <w:comment w:id="31" w:author="Tommy Descartes" w:date="2026-05-19T17:04:00Z" w:initials="TD">
+  <w:comment w:id="33" w:author="Tommy Descartes" w:date="2026-05-19T17:04:00Z" w:initials="TD">
     <w:p>
       <w:pPr>
         <w:pStyle w:val="CommentText"/>
@@ -12898,7 +12873,7 @@
       </w:r>
     </w:p>
   </w:comment>
-  <w:comment w:id="32" w:author="Tommy Descartes" w:date="2026-05-23T07:25:00Z" w:initials="TD">
+  <w:comment w:id="34" w:author="Tommy Descartes" w:date="2026-05-23T07:25:00Z" w:initials="TD">
     <w:p>
       <w:pPr>
         <w:pStyle w:val="CommentText"/>
@@ -12914,7 +12889,7 @@
       </w:r>
     </w:p>
   </w:comment>
-  <w:comment w:id="33" w:author="Tommy Descartes" w:date="2026-05-23T07:32:00Z" w:initials="TD">
+  <w:comment w:id="35" w:author="Tommy Descartes" w:date="2026-05-23T07:32:00Z" w:initials="TD">
     <w:p>
       <w:pPr>
         <w:pStyle w:val="CommentText"/>
@@ -12930,7 +12905,7 @@
       </w:r>
     </w:p>
   </w:comment>
-  <w:comment w:id="34" w:author="Tommy Descartes" w:date="2026-05-25T19:35:00Z" w:initials="TD">
+  <w:comment w:id="36" w:author="Tommy Descartes" w:date="2026-05-25T19:35:00Z" w:initials="TD">
     <w:p>
       <w:pPr>
         <w:pStyle w:val="CommentText"/>
@@ -12946,7 +12921,7 @@
       </w:r>
     </w:p>
   </w:comment>
-  <w:comment w:id="35" w:author="Tommy Descartes" w:date="2026-05-20T17:53:00Z" w:initials="TD">
+  <w:comment w:id="37" w:author="Tommy Descartes" w:date="2026-05-20T17:53:00Z" w:initials="TD">
     <w:p>
       <w:pPr>
         <w:pStyle w:val="CommentText"/>
@@ -12962,7 +12937,7 @@
       </w:r>
     </w:p>
   </w:comment>
-  <w:comment w:id="36" w:author="Tommy Descartes" w:date="2026-05-20T19:07:00Z" w:initials="TD">
+  <w:comment w:id="38" w:author="Tommy Descartes" w:date="2026-05-20T19:07:00Z" w:initials="TD">
     <w:p>
       <w:pPr>
         <w:pStyle w:val="CommentText"/>
@@ -12978,7 +12953,7 @@
       </w:r>
     </w:p>
   </w:comment>
-  <w:comment w:id="37" w:author="Tommy Descartes" w:date="2026-05-20T18:28:00Z" w:initials="TD">
+  <w:comment w:id="39" w:author="Tommy Descartes" w:date="2026-05-20T18:28:00Z" w:initials="TD">
     <w:p>
       <w:pPr>
         <w:pStyle w:val="CommentText"/>
@@ -12994,7 +12969,7 @@
       </w:r>
     </w:p>
   </w:comment>
-  <w:comment w:id="38" w:author="Tommy Descartes" w:date="2026-05-20T18:29:00Z" w:initials="TD">
+  <w:comment w:id="40" w:author="Tommy Descartes" w:date="2026-05-20T18:29:00Z" w:initials="TD">
     <w:p>
       <w:pPr>
         <w:pStyle w:val="CommentText"/>
@@ -14130,6 +14105,7 @@
   <w:style w:type="character" w:default="1" w:styleId="DefaultParagraphFont">
     <w:name w:val="Default Paragraph Font"/>
     <w:uiPriority w:val="1"/>
+    <w:semiHidden/>
     <w:unhideWhenUsed/>
   </w:style>
   <w:style w:type="table" w:default="1" w:styleId="TableNormal">

</xml_diff>

<commit_message>
Add Sector Contribution Dofile
</commit_message>
<xml_diff>
--- a/report/draft/Macroeconomic and Demographic Context Version 1.docx
+++ b/report/draft/Macroeconomic and Demographic Context Version 1.docx
@@ -2160,6 +2160,7 @@
     <w:p>
       <w:pPr>
         <w:pStyle w:val="Heading2"/>
+        <w:spacing w:before="0"/>
         <w:rPr>
           <w:rFonts w:ascii="Trebuchet MS" w:hAnsi="Trebuchet MS"/>
           <w:b/>
@@ -2179,6 +2180,7 @@
         <w:t>Economic Growth</w:t>
       </w:r>
       <w:commentRangeStart w:id="1"/>
+      <w:commentRangeStart w:id="2"/>
       <w:r>
         <w:rPr>
           <w:rFonts w:ascii="Trebuchet MS" w:hAnsi="Trebuchet MS"/>
@@ -2201,6 +2203,18 @@
         </w:rPr>
         <w:commentReference w:id="1"/>
       </w:r>
+      <w:commentRangeEnd w:id="2"/>
+      <w:r>
+        <w:rPr>
+          <w:rStyle w:val="CommentReference"/>
+          <w:rFonts w:ascii="Trebuchet MS" w:hAnsi="Trebuchet MS"/>
+          <w:b/>
+          <w:bCs/>
+          <w:sz w:val="24"/>
+          <w:szCs w:val="24"/>
+        </w:rPr>
+        <w:commentReference w:id="2"/>
+      </w:r>
     </w:p>
     <w:p>
       <w:pPr>
@@ -2225,7 +2239,13 @@
         <w:rPr>
           <w:rFonts w:cs="Calibri"/>
         </w:rPr>
-        <w:t>Belize’s post-independence economic growth performance has been characterized by periodic expansions, elevated output volatility, and increasing exposure to external shocks</w:t>
+        <w:t>Belize’s post-independence economic growth performance has been characterized by period</w:t>
+      </w:r>
+      <w:r>
+        <w:rPr>
+          <w:rFonts w:cs="Calibri"/>
+        </w:rPr>
+        <w:t>s of economic expansion punctuated by elevated volatility and increasing exposure to external shocks</w:t>
       </w:r>
       <w:r>
         <w:rPr>
@@ -2238,244 +2258,25 @@
         <w:rPr>
           <w:rFonts w:cs="Calibri"/>
         </w:rPr>
-        <w:t xml:space="preserve">. From 1980 to the early 1990s, the country registered several episodes of robust economic growth, including multiple years of double-digit </w:t>
-      </w:r>
-      <w:r>
-        <w:rPr>
-          <w:rFonts w:cs="Calibri"/>
-        </w:rPr>
-        <w:t>expansion</w:t>
-      </w:r>
-      <w:r>
-        <w:rPr>
-          <w:rFonts w:cs="Calibri"/>
-        </w:rPr>
-        <w:t xml:space="preserve"> in economic activity</w:t>
-      </w:r>
-      <w:r>
-        <w:rPr>
-          <w:rFonts w:cs="Calibri"/>
-        </w:rPr>
-        <w:t xml:space="preserve"> </w:t>
-      </w:r>
-      <w:r>
-        <w:rPr>
-          <w:rFonts w:cs="Calibri"/>
-          <w:b/>
-          <w:bCs/>
-          <w:highlight w:val="yellow"/>
-        </w:rPr>
-        <w:t>(Figure 1)</w:t>
-      </w:r>
-      <w:r>
-        <w:rPr>
-          <w:rFonts w:cs="Calibri"/>
-          <w:b/>
-          <w:bCs/>
-        </w:rPr>
-        <w:t>.</w:t>
-      </w:r>
-      <w:r>
-        <w:rPr>
-          <w:rFonts w:cs="Calibri"/>
-        </w:rPr>
-        <w:t xml:space="preserve"> This </w:t>
-      </w:r>
-      <w:r>
-        <w:rPr>
-          <w:rFonts w:cs="Calibri"/>
-          <w:strike/>
-        </w:rPr>
-        <w:t xml:space="preserve">strong </w:t>
-      </w:r>
-      <w:r>
-        <w:rPr>
-          <w:rFonts w:cs="Calibri"/>
-        </w:rPr>
-        <w:t xml:space="preserve">growth </w:t>
-      </w:r>
-      <w:r>
-        <w:rPr>
-          <w:rFonts w:cs="Calibri"/>
-        </w:rPr>
-        <w:t>performance</w:t>
-      </w:r>
-      <w:r>
-        <w:rPr>
-          <w:rFonts w:cs="Calibri"/>
-        </w:rPr>
-        <w:t xml:space="preserve"> was driven </w:t>
-      </w:r>
-      <w:r>
-        <w:rPr>
-          <w:rFonts w:cs="Calibri"/>
-        </w:rPr>
-        <w:t xml:space="preserve">primarily </w:t>
-      </w:r>
-      <w:r>
-        <w:rPr>
-          <w:rFonts w:cs="Calibri"/>
-        </w:rPr>
-        <w:t xml:space="preserve">by  </w:t>
-      </w:r>
-      <w:r>
-        <w:rPr>
-          <w:rFonts w:cs="Calibri"/>
-        </w:rPr>
-        <w:t xml:space="preserve">development in the </w:t>
-      </w:r>
-      <w:r>
-        <w:rPr>
-          <w:rFonts w:cs="Calibri"/>
-        </w:rPr>
-        <w:t xml:space="preserve">agricultural </w:t>
-      </w:r>
-      <w:r>
-        <w:rPr>
-          <w:rFonts w:cs="Calibri"/>
-        </w:rPr>
-        <w:t>sector</w:t>
-      </w:r>
-      <w:r>
-        <w:rPr>
-          <w:rFonts w:cs="Calibri"/>
-        </w:rPr>
-        <w:t xml:space="preserve">, accelerated diversification </w:t>
-      </w:r>
-      <w:commentRangeStart w:id="2"/>
-      <w:r>
-        <w:rPr>
-          <w:rFonts w:cs="Calibri"/>
-        </w:rPr>
-        <w:t xml:space="preserve">into tourism services </w:t>
-      </w:r>
-      <w:commentRangeEnd w:id="2"/>
-      <w:r>
-        <w:rPr>
-          <w:rStyle w:val="CommentReference"/>
-          <w:rFonts w:cs="Calibri"/>
-          <w:sz w:val="22"/>
-          <w:szCs w:val="22"/>
-        </w:rPr>
-        <w:commentReference w:id="2"/>
-      </w:r>
-      <w:r>
-        <w:rPr>
-          <w:rFonts w:cs="Calibri"/>
-        </w:rPr>
-        <w:t xml:space="preserve">and </w:t>
-      </w:r>
-      <w:commentRangeStart w:id="3"/>
-      <w:r>
-        <w:rPr>
-          <w:rFonts w:cs="Calibri"/>
-        </w:rPr>
-        <w:t>public sector infrastructure investments</w:t>
-      </w:r>
-      <w:commentRangeEnd w:id="3"/>
-      <w:r>
-        <w:rPr>
-          <w:rStyle w:val="CommentReference"/>
-          <w:rFonts w:cs="Calibri"/>
-          <w:sz w:val="22"/>
-          <w:szCs w:val="22"/>
-        </w:rPr>
-        <w:commentReference w:id="3"/>
-      </w:r>
-      <w:r>
-        <w:rPr>
-          <w:rFonts w:cs="Calibri"/>
-        </w:rPr>
-        <w:t>. Growth</w:t>
-      </w:r>
-      <w:r>
-        <w:rPr>
-          <w:rFonts w:cs="Calibri"/>
-        </w:rPr>
-        <w:t>, however,</w:t>
-      </w:r>
-      <w:r>
-        <w:rPr>
-          <w:rFonts w:cs="Calibri"/>
-        </w:rPr>
-        <w:t xml:space="preserve"> moderated significantly thereafter, </w:t>
-      </w:r>
-      <w:commentRangeStart w:id="4"/>
-      <w:r>
-        <w:rPr>
-          <w:rFonts w:cs="Calibri"/>
-        </w:rPr>
-        <w:t xml:space="preserve">with the post-2008 </w:t>
-      </w:r>
-      <w:commentRangeEnd w:id="4"/>
-      <w:r>
-        <w:rPr>
-          <w:rStyle w:val="CommentReference"/>
-          <w:rFonts w:cs="Calibri"/>
-          <w:sz w:val="22"/>
-          <w:szCs w:val="22"/>
-        </w:rPr>
-        <w:commentReference w:id="4"/>
-      </w:r>
-      <w:r>
-        <w:rPr>
-          <w:rFonts w:cs="Calibri"/>
-        </w:rPr>
-        <w:t xml:space="preserve">period marked by lower average growth and repeated episodes of economic contractions. </w:t>
-      </w:r>
-      <w:r>
-        <w:rPr>
-          <w:rFonts w:cs="Calibri"/>
-        </w:rPr>
-        <w:t>Over time, t</w:t>
-      </w:r>
-      <w:r>
-        <w:rPr>
-          <w:rFonts w:cs="Calibri"/>
-        </w:rPr>
-        <w:t>he Belizean economy ha</w:t>
-      </w:r>
-      <w:r>
-        <w:rPr>
-          <w:rFonts w:cs="Calibri"/>
-        </w:rPr>
-        <w:t>s</w:t>
-      </w:r>
-      <w:r>
-        <w:rPr>
-          <w:rFonts w:cs="Calibri"/>
-        </w:rPr>
-        <w:t xml:space="preserve"> exhibited increased sensitivity to global economic fluctuations, vulnerability to natural disasters, and a susceptibility to commodity price </w:t>
-      </w:r>
-      <w:r>
-        <w:rPr>
-          <w:rFonts w:cs="Calibri"/>
-        </w:rPr>
-        <w:t>volatility</w:t>
-      </w:r>
-      <w:r>
-        <w:rPr>
-          <w:rFonts w:cs="Calibri"/>
-        </w:rPr>
-        <w:t xml:space="preserve">. In 2020, on account of the COVID-19 Pandemic, the economy </w:t>
-      </w:r>
-      <w:r>
-        <w:rPr>
-          <w:rFonts w:cs="Calibri"/>
-        </w:rPr>
-        <w:t>recorded its largest contraction in recent history, declining by</w:t>
-      </w:r>
-      <w:r>
-        <w:rPr>
-          <w:rFonts w:cs="Calibri"/>
-        </w:rPr>
-        <w:t xml:space="preserve"> 13.5%. </w:t>
+        <w:t xml:space="preserve">. </w:t>
+      </w:r>
+      <w:r>
+        <w:rPr>
+          <w:rFonts w:cs="Calibri"/>
+        </w:rPr>
+        <w:t xml:space="preserve">Between 1980 and the early 1990s, the economy experienced several episodes of robust growth, including multiple years of double-digit expansion in economic activity (Figure 1 – Panel 1). This performance was driven primarily by agricultural expansion, diversification into tourism services and public sector investment. Growth, however, moderated significantly thereafter, particularly following the global financial crisis, with the post-2008 period characterized by lower average growth and repeated episodes of economic contraction. Over time, the economy has </w:t>
+      </w:r>
+      <w:r>
+        <w:rPr>
+          <w:rFonts w:cs="Calibri"/>
+        </w:rPr>
+        <w:t>become increasingly vulnerable to global economic fluctuations, natural disasters and commodity price shocks. These vulnerabilities culminated in 2020, when, amid the COVID-19 pandemic, Belize recorded its largest economic contraction in recent history, with output declining by 13.5% percent.</w:t>
       </w:r>
     </w:p>
     <w:p>
       <w:pPr>
         <w:pStyle w:val="BodyText"/>
-        <w:ind w:left="-284" w:right="-447"/>
+        <w:ind w:right="-23"/>
         <w:jc w:val="both"/>
         <w:rPr>
           <w:rFonts w:cs="Calibri"/>
@@ -2494,11 +2295,13 @@
           <w:bCs/>
           <w:i w:val="0"/>
           <w:iCs w:val="0"/>
-          <w:sz w:val="22"/>
-          <w:szCs w:val="22"/>
-        </w:rPr>
-      </w:pPr>
-      <w:commentRangeStart w:id="5"/>
+          <w:caps/>
+          <w:sz w:val="22"/>
+          <w:szCs w:val="22"/>
+        </w:rPr>
+      </w:pPr>
+      <w:commentRangeStart w:id="3"/>
+      <w:commentRangeStart w:id="4"/>
       <w:r>
         <w:rPr>
           <w:rFonts w:cs="Calibri"/>
@@ -2506,6 +2309,7 @@
           <w:bCs/>
           <w:i w:val="0"/>
           <w:iCs w:val="0"/>
+          <w:caps/>
           <w:sz w:val="22"/>
           <w:szCs w:val="22"/>
         </w:rPr>
@@ -2518,6 +2322,7 @@
           <w:bCs/>
           <w:i w:val="0"/>
           <w:iCs w:val="0"/>
+          <w:caps/>
           <w:sz w:val="22"/>
           <w:szCs w:val="22"/>
         </w:rPr>
@@ -2530,6 +2335,7 @@
           <w:bCs/>
           <w:i w:val="0"/>
           <w:iCs w:val="0"/>
+          <w:caps/>
           <w:sz w:val="22"/>
           <w:szCs w:val="22"/>
         </w:rPr>
@@ -2542,6 +2348,7 @@
           <w:bCs/>
           <w:i w:val="0"/>
           <w:iCs w:val="0"/>
+          <w:caps/>
           <w:sz w:val="22"/>
           <w:szCs w:val="22"/>
         </w:rPr>
@@ -2554,6 +2361,7 @@
           <w:bCs/>
           <w:i w:val="0"/>
           <w:iCs w:val="0"/>
+          <w:caps/>
           <w:noProof/>
           <w:sz w:val="22"/>
           <w:szCs w:val="22"/>
@@ -2567,6 +2375,7 @@
           <w:bCs/>
           <w:i w:val="0"/>
           <w:iCs w:val="0"/>
+          <w:caps/>
           <w:sz w:val="22"/>
           <w:szCs w:val="22"/>
         </w:rPr>
@@ -2579,12 +2388,13 @@
           <w:bCs/>
           <w:i w:val="0"/>
           <w:iCs w:val="0"/>
+          <w:caps/>
           <w:sz w:val="22"/>
           <w:szCs w:val="22"/>
         </w:rPr>
         <w:t xml:space="preserve">: </w:t>
       </w:r>
-      <w:commentRangeEnd w:id="5"/>
+      <w:commentRangeEnd w:id="3"/>
       <w:r>
         <w:rPr>
           <w:rStyle w:val="CommentReference"/>
@@ -2593,10 +2403,26 @@
           <w:bCs/>
           <w:i w:val="0"/>
           <w:iCs w:val="0"/>
-          <w:sz w:val="22"/>
-          <w:szCs w:val="22"/>
-        </w:rPr>
-        <w:commentReference w:id="5"/>
+          <w:caps/>
+          <w:sz w:val="22"/>
+          <w:szCs w:val="22"/>
+        </w:rPr>
+        <w:commentReference w:id="3"/>
+      </w:r>
+      <w:commentRangeEnd w:id="4"/>
+      <w:r>
+        <w:rPr>
+          <w:rStyle w:val="CommentReference"/>
+          <w:rFonts w:cs="Calibri"/>
+          <w:b/>
+          <w:bCs/>
+          <w:i w:val="0"/>
+          <w:iCs w:val="0"/>
+          <w:caps/>
+          <w:sz w:val="22"/>
+          <w:szCs w:val="22"/>
+        </w:rPr>
+        <w:commentReference w:id="4"/>
       </w:r>
     </w:p>
     <w:p>
@@ -2614,14 +2440,8 @@
           <w:sz w:val="22"/>
           <w:szCs w:val="22"/>
         </w:rPr>
-        <w:pPrChange w:id="6" w:author="Tommy Descartes" w:date="2026-05-26T12:05:00Z" w16du:dateUtc="2026-05-26T16:05:00Z">
-          <w:pPr>
-            <w:pStyle w:val="Caption"/>
-            <w:keepNext/>
-            <w:jc w:val="center"/>
-          </w:pPr>
-        </w:pPrChange>
-      </w:pPr>
+      </w:pPr>
+      <w:commentRangeStart w:id="5"/>
       <w:r>
         <w:rPr>
           <w:rFonts w:cs="Calibri"/>
@@ -2632,7 +2452,21 @@
           <w:sz w:val="22"/>
           <w:szCs w:val="22"/>
         </w:rPr>
-        <w:t>Belize Real GDP Growth, Annual percentage change (1980 – 2025)</w:t>
+        <w:t>Belize Real GDP Growth, Annual percentage and 5-Year Average (1980 – 2025)</w:t>
+      </w:r>
+      <w:commentRangeEnd w:id="5"/>
+      <w:r>
+        <w:rPr>
+          <w:rStyle w:val="CommentReference"/>
+          <w:rFonts w:cs="Calibri"/>
+          <w:b/>
+          <w:bCs/>
+          <w:i w:val="0"/>
+          <w:iCs w:val="0"/>
+          <w:sz w:val="22"/>
+          <w:szCs w:val="22"/>
+        </w:rPr>
+        <w:commentReference w:id="5"/>
       </w:r>
     </w:p>
     <w:p>
@@ -2644,45 +2478,43 @@
           <w:rFonts w:cs="Calibri"/>
         </w:rPr>
       </w:pPr>
-      <w:ins w:id="7" w:author="Tommy Descartes" w:date="2026-05-26T12:05:00Z" w16du:dateUtc="2026-05-26T16:05:00Z">
-        <w:r>
-          <w:drawing>
-            <wp:inline distT="0" distB="0" distL="0" distR="0" wp14:anchorId="6036C3B6" wp14:editId="117B8830">
-              <wp:extent cx="5943600" cy="4272915"/>
-              <wp:effectExtent l="0" t="0" r="0" b="0"/>
-              <wp:docPr id="1992989836" name="Picture 1"/>
-              <wp:cNvGraphicFramePr>
-                <a:graphicFrameLocks xmlns:a="http://schemas.openxmlformats.org/drawingml/2006/main" noChangeAspect="1"/>
-              </wp:cNvGraphicFramePr>
-              <a:graphic xmlns:a="http://schemas.openxmlformats.org/drawingml/2006/main">
-                <a:graphicData uri="http://schemas.openxmlformats.org/drawingml/2006/picture">
-                  <pic:pic xmlns:pic="http://schemas.openxmlformats.org/drawingml/2006/picture">
-                    <pic:nvPicPr>
-                      <pic:cNvPr id="1992989836" name=""/>
-                      <pic:cNvPicPr/>
-                    </pic:nvPicPr>
-                    <pic:blipFill>
-                      <a:blip r:embed="rId12"/>
-                      <a:stretch>
-                        <a:fillRect/>
-                      </a:stretch>
-                    </pic:blipFill>
-                    <pic:spPr>
-                      <a:xfrm>
-                        <a:off x="0" y="0"/>
-                        <a:ext cx="5943600" cy="4272915"/>
-                      </a:xfrm>
-                      <a:prstGeom prst="rect">
-                        <a:avLst/>
-                      </a:prstGeom>
-                    </pic:spPr>
-                  </pic:pic>
-                </a:graphicData>
-              </a:graphic>
-            </wp:inline>
-          </w:drawing>
-        </w:r>
-      </w:ins>
+      <w:r>
+        <w:drawing>
+          <wp:inline distT="0" distB="0" distL="0" distR="0" wp14:anchorId="148882CC" wp14:editId="540E7804">
+            <wp:extent cx="5943600" cy="4272915"/>
+            <wp:effectExtent l="0" t="0" r="0" b="0"/>
+            <wp:docPr id="1588773438" name="Picture 1"/>
+            <wp:cNvGraphicFramePr>
+              <a:graphicFrameLocks xmlns:a="http://schemas.openxmlformats.org/drawingml/2006/main" noChangeAspect="1"/>
+            </wp:cNvGraphicFramePr>
+            <a:graphic xmlns:a="http://schemas.openxmlformats.org/drawingml/2006/main">
+              <a:graphicData uri="http://schemas.openxmlformats.org/drawingml/2006/picture">
+                <pic:pic xmlns:pic="http://schemas.openxmlformats.org/drawingml/2006/picture">
+                  <pic:nvPicPr>
+                    <pic:cNvPr id="1992989836" name=""/>
+                    <pic:cNvPicPr/>
+                  </pic:nvPicPr>
+                  <pic:blipFill>
+                    <a:blip r:embed="rId12"/>
+                    <a:stretch>
+                      <a:fillRect/>
+                    </a:stretch>
+                  </pic:blipFill>
+                  <pic:spPr>
+                    <a:xfrm>
+                      <a:off x="0" y="0"/>
+                      <a:ext cx="5943600" cy="4272915"/>
+                    </a:xfrm>
+                    <a:prstGeom prst="rect">
+                      <a:avLst/>
+                    </a:prstGeom>
+                  </pic:spPr>
+                </pic:pic>
+              </a:graphicData>
+            </a:graphic>
+          </wp:inline>
+        </w:drawing>
+      </w:r>
     </w:p>
     <w:p>
       <w:pPr>
@@ -2693,114 +2525,6 @@
           <w:rFonts w:cs="Calibri"/>
         </w:rPr>
       </w:pPr>
-      <w:r>
-        <w:rPr>
-          <w:rFonts w:cs="Calibri"/>
-        </w:rPr>
-        <w:t xml:space="preserve">The country registered a credible recovery in the immediate aftermath of the pandemic, but </w:t>
-      </w:r>
-      <w:r>
-        <w:rPr>
-          <w:rFonts w:cs="Calibri"/>
-        </w:rPr>
-        <w:lastRenderedPageBreak/>
-        <w:t>growth is expected to return to its post-pandemic potential of 2% or below. Real</w:t>
-      </w:r>
-      <w:r>
-        <w:rPr>
-          <w:rFonts w:cs="Calibri"/>
-        </w:rPr>
-        <w:t xml:space="preserve"> gross domestic product</w:t>
-      </w:r>
-      <w:r>
-        <w:rPr>
-          <w:rFonts w:cs="Calibri"/>
-        </w:rPr>
-        <w:t xml:space="preserve"> </w:t>
-      </w:r>
-      <w:r>
-        <w:rPr>
-          <w:rFonts w:cs="Calibri"/>
-        </w:rPr>
-        <w:t>(</w:t>
-      </w:r>
-      <w:r>
-        <w:rPr>
-          <w:rFonts w:cs="Calibri"/>
-        </w:rPr>
-        <w:t>GDP</w:t>
-      </w:r>
-      <w:r>
-        <w:rPr>
-          <w:rFonts w:cs="Calibri"/>
-        </w:rPr>
-        <w:t>)</w:t>
-      </w:r>
-      <w:r>
-        <w:rPr>
-          <w:rFonts w:cs="Calibri"/>
-        </w:rPr>
-        <w:t xml:space="preserve"> expanded </w:t>
-      </w:r>
-      <w:r>
-        <w:rPr>
-          <w:rFonts w:cs="Calibri"/>
-        </w:rPr>
-        <w:t xml:space="preserve">by </w:t>
-      </w:r>
-      <w:r>
-        <w:rPr>
-          <w:rFonts w:cs="Calibri"/>
-        </w:rPr>
-        <w:t>17.9%, 8.7% and 4.7%,</w:t>
-      </w:r>
-      <w:r>
-        <w:rPr>
-          <w:rFonts w:cs="Calibri"/>
-        </w:rPr>
-        <w:t xml:space="preserve"> in 2021, 2022 and 2023,</w:t>
-      </w:r>
-      <w:r>
-        <w:rPr>
-          <w:rFonts w:cs="Calibri"/>
-        </w:rPr>
-        <w:t xml:space="preserve"> respectively, supported by a rebound in tourist arrivals, increased construction activity and growth in the </w:t>
-      </w:r>
-      <w:commentRangeStart w:id="8"/>
-      <w:r>
-        <w:rPr>
-          <w:rFonts w:cs="Calibri"/>
-        </w:rPr>
-        <w:t xml:space="preserve">business process outsourcing (BPO) sector. </w:t>
-      </w:r>
-      <w:commentRangeEnd w:id="8"/>
-      <w:r>
-        <w:rPr>
-          <w:rStyle w:val="CommentReference"/>
-          <w:rFonts w:cs="Calibri"/>
-          <w:sz w:val="22"/>
-          <w:szCs w:val="22"/>
-        </w:rPr>
-        <w:commentReference w:id="8"/>
-      </w:r>
-      <w:r>
-        <w:rPr>
-          <w:rFonts w:cs="Calibri"/>
-        </w:rPr>
-        <w:t>Although, the Belizean economy has demonstrated resilience in the face of multiple shocks, its trend is indicative of weakening growth persistence</w:t>
-      </w:r>
-      <w:r>
-        <w:rPr>
-          <w:rFonts w:cs="Calibri"/>
-        </w:rPr>
-        <w:t>, modest productivity gains</w:t>
-      </w:r>
-      <w:r>
-        <w:rPr>
-          <w:rFonts w:cs="Calibri"/>
-        </w:rPr>
-        <w:t xml:space="preserve"> and limited structural transformation over the medium-term. </w:t>
-      </w:r>
     </w:p>
     <w:p>
       <w:pPr>
@@ -2821,196 +2545,44 @@
           <w:rFonts w:cs="Calibri"/>
         </w:rPr>
       </w:pPr>
-      <w:commentRangeStart w:id="9"/>
-      <w:r>
-        <w:rPr>
-          <w:rFonts w:cs="Calibri"/>
-        </w:rPr>
-        <w:t xml:space="preserve">These macroeconomic dynamics are critical to understanding labour market outcomes, as </w:t>
-      </w:r>
-      <w:r>
-        <w:rPr>
-          <w:rFonts w:cs="Calibri"/>
-        </w:rPr>
-        <w:t xml:space="preserve">prolonged </w:t>
-      </w:r>
-      <w:r>
-        <w:rPr>
-          <w:rFonts w:cs="Calibri"/>
-        </w:rPr>
-        <w:t xml:space="preserve">periods of volatile and uneven growth </w:t>
-      </w:r>
-      <w:r>
-        <w:rPr>
-          <w:rFonts w:cs="Calibri"/>
-        </w:rPr>
-        <w:t>are</w:t>
-      </w:r>
-      <w:r>
-        <w:rPr>
-          <w:rFonts w:cs="Calibri"/>
-        </w:rPr>
-        <w:t xml:space="preserve"> often associated with</w:t>
-      </w:r>
-      <w:r>
-        <w:rPr>
-          <w:rFonts w:cs="Calibri"/>
-        </w:rPr>
-        <w:t xml:space="preserve"> </w:t>
-      </w:r>
-      <w:r>
-        <w:rPr>
-          <w:rFonts w:cs="Calibri"/>
-        </w:rPr>
-        <w:t xml:space="preserve">weaker </w:t>
-      </w:r>
-      <w:r>
-        <w:rPr>
-          <w:rFonts w:cs="Calibri"/>
-        </w:rPr>
-        <w:t>employment generation</w:t>
-      </w:r>
-      <w:r>
-        <w:rPr>
-          <w:rFonts w:cs="Calibri"/>
-        </w:rPr>
-        <w:t xml:space="preserve">, productivity challenges, skills mismatches and increased labour market </w:t>
-      </w:r>
-      <w:r>
-        <w:rPr>
-          <w:rFonts w:cs="Calibri"/>
-        </w:rPr>
-        <w:t>insecurity</w:t>
-      </w:r>
-      <w:r>
-        <w:rPr>
-          <w:rFonts w:cs="Calibri"/>
-        </w:rPr>
-        <w:t xml:space="preserve">, </w:t>
-      </w:r>
-      <w:r>
-        <w:rPr>
-          <w:rFonts w:cs="Calibri"/>
-        </w:rPr>
-        <w:t>specifically</w:t>
-      </w:r>
-      <w:r>
-        <w:rPr>
-          <w:rFonts w:cs="Calibri"/>
-        </w:rPr>
-        <w:t xml:space="preserve"> among youth, women and workers in the tourism and agricultural dependent sectors. To boost </w:t>
-      </w:r>
-      <w:r>
-        <w:rPr>
-          <w:rFonts w:cs="Calibri"/>
-        </w:rPr>
-        <w:t>growth</w:t>
-      </w:r>
-      <w:r>
-        <w:rPr>
-          <w:rFonts w:cs="Calibri"/>
-        </w:rPr>
-        <w:t xml:space="preserve"> in the near term, </w:t>
-      </w:r>
-      <w:r>
-        <w:rPr>
-          <w:rFonts w:cs="Calibri"/>
-        </w:rPr>
-        <w:t xml:space="preserve">it is crucial that these structural constraints are addressed frontally. In particular, it will require </w:t>
-      </w:r>
-      <w:r>
-        <w:rPr>
-          <w:rFonts w:cs="Calibri"/>
-        </w:rPr>
-        <w:t xml:space="preserve">decisive </w:t>
-      </w:r>
-      <w:r>
-        <w:rPr>
-          <w:rFonts w:cs="Calibri"/>
-        </w:rPr>
-        <w:t xml:space="preserve">policy </w:t>
-      </w:r>
-      <w:r>
-        <w:rPr>
-          <w:rFonts w:cs="Calibri"/>
-        </w:rPr>
-        <w:t xml:space="preserve">steps </w:t>
-      </w:r>
-      <w:r>
-        <w:rPr>
-          <w:rFonts w:cs="Calibri"/>
-          <w:highlight w:val="yellow"/>
-        </w:rPr>
-        <w:t>to increase female labour force participation</w:t>
-      </w:r>
-      <w:r>
-        <w:rPr>
-          <w:rFonts w:cs="Calibri"/>
-        </w:rPr>
-        <w:t xml:space="preserve">, </w:t>
-      </w:r>
-      <w:commentRangeStart w:id="10"/>
-      <w:r>
-        <w:rPr>
-          <w:rFonts w:cs="Calibri"/>
-        </w:rPr>
-        <w:t>i</w:t>
-      </w:r>
-      <w:r>
-        <w:rPr>
-          <w:rFonts w:cs="Calibri"/>
-        </w:rPr>
-        <w:t>mproving</w:t>
-      </w:r>
-      <w:r>
-        <w:rPr>
-          <w:rFonts w:cs="Calibri"/>
-        </w:rPr>
-        <w:t xml:space="preserve"> access to </w:t>
-      </w:r>
-      <w:r>
-        <w:rPr>
-          <w:rFonts w:cs="Calibri"/>
-        </w:rPr>
-        <w:t>financing</w:t>
-      </w:r>
-      <w:r>
-        <w:rPr>
-          <w:rFonts w:cs="Calibri"/>
-        </w:rPr>
-        <w:t xml:space="preserve"> for small and medium size enterprises, enhanc</w:t>
-      </w:r>
-      <w:r>
-        <w:rPr>
-          <w:rFonts w:cs="Calibri"/>
-        </w:rPr>
-        <w:t>ing</w:t>
-      </w:r>
-      <w:r>
-        <w:rPr>
-          <w:rFonts w:cs="Calibri"/>
-        </w:rPr>
-        <w:t xml:space="preserve"> the business environment and reducing the prevalence of crime.</w:t>
-      </w:r>
-      <w:commentRangeEnd w:id="10"/>
-      <w:r>
-        <w:rPr>
-          <w:rStyle w:val="CommentReference"/>
-          <w:rFonts w:cs="Calibri"/>
-          <w:sz w:val="22"/>
-          <w:szCs w:val="22"/>
-        </w:rPr>
-        <w:commentReference w:id="10"/>
-      </w:r>
-      <w:commentRangeEnd w:id="9"/>
-      <w:r>
-        <w:rPr>
-          <w:rStyle w:val="CommentReference"/>
-          <w:rFonts w:cs="Calibri"/>
-          <w:sz w:val="22"/>
-          <w:szCs w:val="22"/>
-        </w:rPr>
-        <w:commentReference w:id="9"/>
+      <w:r>
+        <w:rPr>
+          <w:rFonts w:cs="Calibri"/>
+        </w:rPr>
+        <w:lastRenderedPageBreak/>
+        <w:t xml:space="preserve">Despite registering a strong post-pandemic recovery, growth </w:t>
+      </w:r>
+      <w:r>
+        <w:rPr>
+          <w:rFonts w:cs="Calibri"/>
+        </w:rPr>
+        <w:t>is projected to return to its estimated medium-term potential of approximately 2 percent or below</w:t>
+      </w:r>
+      <w:r>
+        <w:rPr>
+          <w:rStyle w:val="FootnoteReference"/>
+          <w:rFonts w:cs="Calibri"/>
+        </w:rPr>
+        <w:footnoteReference w:id="2"/>
+      </w:r>
+      <w:r>
+        <w:rPr>
+          <w:rFonts w:cs="Calibri"/>
+        </w:rPr>
+        <w:t>. Real GDP expanded by 17.9% in 2021, 8.7% in 2022 and 4.7% in 2023, supported by the rebound in tourism activity, increased construction and continued expansion of the business process outsourcing (BPO) sector</w:t>
+      </w:r>
+      <w:r>
+        <w:rPr>
+          <w:rStyle w:val="FootnoteReference"/>
+          <w:rFonts w:cs="Calibri"/>
+        </w:rPr>
+        <w:footnoteReference w:id="3"/>
+      </w:r>
+      <w:r>
+        <w:rPr>
+          <w:rFonts w:cs="Calibri"/>
+        </w:rPr>
+        <w:t>. Notwithstanding, the broader growth trend suggests weakening economic dynamism, modest productivity improvements and limited structural transformation.</w:t>
       </w:r>
     </w:p>
     <w:p>
@@ -3026,208 +2598,123 @@
     <w:p>
       <w:pPr>
         <w:pStyle w:val="BodyText"/>
-        <w:ind w:right="4"/>
-        <w:jc w:val="both"/>
-        <w:rPr>
-          <w:rFonts w:cs="Calibri"/>
-        </w:rPr>
-      </w:pPr>
-      <w:commentRangeStart w:id="11"/>
-      <w:r>
-        <w:rPr>
-          <w:rFonts w:cs="Calibri"/>
-          <w:highlight w:val="yellow"/>
-        </w:rPr>
-        <w:t>T</w:t>
-      </w:r>
-      <w:r>
-        <w:rPr>
-          <w:rFonts w:cs="Calibri"/>
-          <w:highlight w:val="yellow"/>
-        </w:rPr>
-        <w:t>he development of tourism services in</w:t>
-      </w:r>
-      <w:r>
-        <w:rPr>
-          <w:rFonts w:cs="Calibri"/>
-          <w:highlight w:val="yellow"/>
-        </w:rPr>
-        <w:t xml:space="preserve"> Belize</w:t>
-      </w:r>
-      <w:r>
-        <w:rPr>
-          <w:rFonts w:cs="Calibri"/>
-          <w:highlight w:val="yellow"/>
-        </w:rPr>
-        <w:t xml:space="preserve"> has contributed </w:t>
-      </w:r>
-      <w:r>
-        <w:rPr>
-          <w:rFonts w:cs="Calibri"/>
-          <w:highlight w:val="yellow"/>
-        </w:rPr>
-        <w:t xml:space="preserve">significantly </w:t>
-      </w:r>
-      <w:r>
-        <w:rPr>
-          <w:rFonts w:cs="Calibri"/>
-          <w:highlight w:val="yellow"/>
-        </w:rPr>
-        <w:t>to</w:t>
-      </w:r>
-      <w:r>
-        <w:rPr>
-          <w:rFonts w:cs="Calibri"/>
-          <w:highlight w:val="yellow"/>
-        </w:rPr>
-        <w:t xml:space="preserve"> the country’s</w:t>
-      </w:r>
-      <w:r>
-        <w:rPr>
-          <w:rFonts w:cs="Calibri"/>
-          <w:highlight w:val="yellow"/>
-        </w:rPr>
-        <w:t xml:space="preserve"> </w:t>
-      </w:r>
-      <w:r>
-        <w:rPr>
-          <w:rFonts w:cs="Calibri"/>
-          <w:highlight w:val="yellow"/>
-        </w:rPr>
-        <w:t xml:space="preserve">economic </w:t>
-      </w:r>
-      <w:r>
-        <w:rPr>
-          <w:rFonts w:cs="Calibri"/>
-          <w:highlight w:val="yellow"/>
-        </w:rPr>
-        <w:t>diversification</w:t>
-      </w:r>
-      <w:r>
-        <w:rPr>
-          <w:rFonts w:cs="Calibri"/>
-          <w:highlight w:val="yellow"/>
-        </w:rPr>
-        <w:t xml:space="preserve"> efforts.</w:t>
-      </w:r>
-      <w:r>
-        <w:rPr>
-          <w:rFonts w:cs="Calibri"/>
-        </w:rPr>
-        <w:t xml:space="preserve"> </w:t>
-      </w:r>
-      <w:commentRangeEnd w:id="11"/>
-      <w:r>
-        <w:rPr>
-          <w:rStyle w:val="CommentReference"/>
-          <w:rFonts w:cs="Calibri"/>
-          <w:sz w:val="22"/>
-          <w:szCs w:val="22"/>
-        </w:rPr>
-        <w:commentReference w:id="11"/>
-      </w:r>
-      <w:r>
-        <w:rPr>
-          <w:rFonts w:cs="Calibri"/>
-        </w:rPr>
-        <w:t>Over time, however, t</w:t>
-      </w:r>
-      <w:r>
-        <w:rPr>
-          <w:rFonts w:cs="Calibri"/>
-        </w:rPr>
-        <w:t xml:space="preserve">he </w:t>
-      </w:r>
-      <w:r>
-        <w:rPr>
-          <w:rFonts w:cs="Calibri"/>
-        </w:rPr>
-        <w:t>economy</w:t>
-      </w:r>
-      <w:r>
-        <w:rPr>
-          <w:rFonts w:cs="Calibri"/>
-        </w:rPr>
-        <w:t xml:space="preserve"> </w:t>
-      </w:r>
-      <w:r>
-        <w:rPr>
-          <w:rFonts w:cs="Calibri"/>
-        </w:rPr>
-        <w:t>has become increasingly concentrated in tourism-related activities</w:t>
-      </w:r>
-      <w:r>
-        <w:rPr>
-          <w:rFonts w:cs="Calibri"/>
-        </w:rPr>
-        <w:t xml:space="preserve">, </w:t>
-      </w:r>
-      <w:r>
-        <w:rPr>
-          <w:rFonts w:cs="Calibri"/>
-        </w:rPr>
-        <w:t>p</w:t>
-      </w:r>
-      <w:r>
-        <w:rPr>
-          <w:rFonts w:cs="Calibri"/>
-        </w:rPr>
-        <w:t>osition</w:t>
-      </w:r>
-      <w:r>
-        <w:rPr>
-          <w:rFonts w:cs="Calibri"/>
-        </w:rPr>
-        <w:t>ing</w:t>
-      </w:r>
-      <w:r>
-        <w:rPr>
-          <w:rFonts w:cs="Calibri"/>
-        </w:rPr>
-        <w:t xml:space="preserve"> the</w:t>
-      </w:r>
-      <w:r>
-        <w:rPr>
-          <w:rFonts w:cs="Calibri"/>
-        </w:rPr>
-        <w:t xml:space="preserve"> sector</w:t>
-      </w:r>
-      <w:r>
-        <w:rPr>
-          <w:rFonts w:cs="Calibri"/>
-        </w:rPr>
-        <w:t xml:space="preserve"> as a </w:t>
-      </w:r>
-      <w:r>
-        <w:rPr>
-          <w:rFonts w:cs="Calibri"/>
-        </w:rPr>
-        <w:t>principal</w:t>
-      </w:r>
-      <w:r>
-        <w:rPr>
-          <w:rFonts w:cs="Calibri"/>
-        </w:rPr>
-        <w:t xml:space="preserve"> driver of economic </w:t>
-      </w:r>
-      <w:r>
-        <w:rPr>
-          <w:rFonts w:cs="Calibri"/>
-        </w:rPr>
-        <w:t>growth</w:t>
-      </w:r>
-      <w:r>
-        <w:rPr>
-          <w:rFonts w:cs="Calibri"/>
-        </w:rPr>
-        <w:t>, employment, and foreign exchange earnings</w:t>
-      </w:r>
-      <w:r>
-        <w:rPr>
-          <w:rFonts w:cs="Calibri"/>
-        </w:rPr>
-        <w:t>. This high degree of tourism dependence increases Belize’s exposure to business cycle fluctuations and external demand shocks in major source markets, particularly the United States (US) and the European Union (EU).</w:t>
-      </w:r>
+        <w:ind w:right="-23"/>
+        <w:jc w:val="both"/>
+        <w:rPr>
+          <w:rFonts w:cs="Calibri"/>
+        </w:rPr>
+      </w:pPr>
+      <w:r>
+        <w:rPr>
+          <w:rFonts w:cs="Calibri"/>
+        </w:rPr>
+        <w:t xml:space="preserve">Panel 2 highlights a pronounced deceleration in Belize’s long-run growth trajectory over the past four decades. Average real GDP growth increased from 3.0% during 1980-84 to 10.9% in </w:t>
+      </w:r>
+      <w:r>
+        <w:rPr>
+          <w:rFonts w:cs="Calibri"/>
+        </w:rPr>
+        <w:t xml:space="preserve">1985-89, representing the strongest sustained period of expansion in the country’s post-independence history. Growth remained relatively strong during 1990-94, averaging 8.4%, before moderating to 3.9% during 1995-99. Although growth rebounded to 7.4% in 2000-04, this momentum </w:t>
+      </w:r>
+      <w:r>
+        <w:rPr>
+          <w:rFonts w:cs="Calibri"/>
+        </w:rPr>
+        <w:t>was</w:t>
+      </w:r>
+      <w:r>
+        <w:rPr>
+          <w:rFonts w:cs="Calibri"/>
+        </w:rPr>
+        <w:t xml:space="preserve"> short lived. From 2005 onward, Belize appears to have transitioned into a structurally lower-growth equilibrium, with average growth declining to 1.6% during 2005-09 and remaining subdued thereafter.</w:t>
+      </w:r>
+      <w:r>
+        <w:rPr>
+          <w:rFonts w:cs="Calibri"/>
+        </w:rPr>
+        <w:t xml:space="preserve"> While average growth recovered to 3.4% during 202-25, this largely reflects the rebound from the pandemic-induced contraction rather than a fundamental strengthening of the economy’s long-term growth potential.</w:t>
+      </w:r>
+    </w:p>
+    <w:p>
+      <w:pPr>
+        <w:pStyle w:val="BodyText"/>
+        <w:ind w:right="-23"/>
+        <w:jc w:val="both"/>
+        <w:rPr>
+          <w:rFonts w:cs="Calibri"/>
+        </w:rPr>
+      </w:pPr>
+    </w:p>
+    <w:p>
+      <w:pPr>
+        <w:pStyle w:val="BodyText"/>
+        <w:ind w:right="-23"/>
+        <w:jc w:val="both"/>
+        <w:rPr>
+          <w:rFonts w:cs="Calibri"/>
+        </w:rPr>
+      </w:pPr>
+      <w:r>
+        <w:rPr>
+          <w:rFonts w:cs="Calibri"/>
+        </w:rPr>
+        <w:t>Overall, the evidence suggests that Belize has moved from a high-growth convergence phase toward a more mature low-growth equilibrium characterized by weaker productivity growth, reduced structural dynamism, and heightened macroeconomic vulnerability. This pattern is consistent with concerns regarding declining total factor productivity, limited export diversification, low investment efficiency, and persistent labour market constraints. These macroeconomic trends have important implications for labour market outcomes, as prolonged periods of weak and volatile growth tend to constrain employment generation, reduce productivity gains, and exacerbate labour market insecurity, particularly among youth, women, and workers concentrated in tourism- and agriculture-dependent sectors. Addressing these structural constraints will require policies aimed at increasing female labour force participation, improving access to finance for small and medium-sized enterprises, strengthening the business environment, and reducing crime.</w:t>
+      </w:r>
+    </w:p>
+    <w:p>
+      <w:pPr>
+        <w:pStyle w:val="BodyText"/>
+        <w:ind w:right="-23"/>
+        <w:jc w:val="both"/>
+        <w:rPr>
+          <w:del w:id="6" w:author="Tommy Descartes" w:date="2026-05-26T14:36:00Z" w16du:dateUtc="2026-05-26T18:36:00Z"/>
+          <w:rFonts w:cs="Calibri"/>
+        </w:rPr>
+      </w:pPr>
+    </w:p>
+    <w:p>
+      <w:pPr>
+        <w:pStyle w:val="Heading2"/>
+        <w:rPr>
+          <w:rFonts w:ascii="Trebuchet MS" w:hAnsi="Trebuchet MS"/>
+          <w:b/>
+          <w:bCs/>
+          <w:sz w:val="24"/>
+          <w:szCs w:val="24"/>
+        </w:rPr>
+      </w:pPr>
+      <w:r>
+        <w:rPr>
+          <w:rFonts w:ascii="Trebuchet MS" w:hAnsi="Trebuchet MS"/>
+          <w:b/>
+          <w:bCs/>
+          <w:sz w:val="24"/>
+          <w:szCs w:val="24"/>
+        </w:rPr>
+        <w:t xml:space="preserve">Sectoral </w:t>
+      </w:r>
+      <w:r>
+        <w:rPr>
+          <w:rFonts w:ascii="Trebuchet MS" w:hAnsi="Trebuchet MS"/>
+          <w:b/>
+          <w:bCs/>
+          <w:sz w:val="24"/>
+          <w:szCs w:val="24"/>
+        </w:rPr>
+        <w:t>Performance</w:t>
+      </w:r>
+    </w:p>
+    <w:p>
+      <w:pPr>
+        <w:pStyle w:val="BodyText"/>
+        <w:ind w:right="-23"/>
+        <w:jc w:val="both"/>
+        <w:rPr>
+          <w:rFonts w:cs="Calibri"/>
+          <w:b/>
+          <w:bCs/>
+        </w:rPr>
+      </w:pPr>
     </w:p>
     <w:p>
       <w:pPr>
@@ -3238,6 +2725,202 @@
           <w:rFonts w:cs="Calibri"/>
         </w:rPr>
       </w:pPr>
+      <w:commentRangeStart w:id="7"/>
+      <w:r>
+        <w:rPr>
+          <w:rFonts w:cs="Calibri"/>
+          <w:highlight w:val="yellow"/>
+        </w:rPr>
+        <w:t>T</w:t>
+      </w:r>
+      <w:r>
+        <w:rPr>
+          <w:rFonts w:cs="Calibri"/>
+          <w:highlight w:val="yellow"/>
+        </w:rPr>
+        <w:t>he development of tourism services in</w:t>
+      </w:r>
+      <w:r>
+        <w:rPr>
+          <w:rFonts w:cs="Calibri"/>
+          <w:highlight w:val="yellow"/>
+        </w:rPr>
+        <w:t xml:space="preserve"> Belize</w:t>
+      </w:r>
+      <w:r>
+        <w:rPr>
+          <w:rFonts w:cs="Calibri"/>
+          <w:highlight w:val="yellow"/>
+        </w:rPr>
+        <w:t xml:space="preserve"> has contributed </w:t>
+      </w:r>
+      <w:r>
+        <w:rPr>
+          <w:rFonts w:cs="Calibri"/>
+          <w:highlight w:val="yellow"/>
+        </w:rPr>
+        <w:t xml:space="preserve">significantly </w:t>
+      </w:r>
+      <w:r>
+        <w:rPr>
+          <w:rFonts w:cs="Calibri"/>
+          <w:highlight w:val="yellow"/>
+        </w:rPr>
+        <w:t>to</w:t>
+      </w:r>
+      <w:r>
+        <w:rPr>
+          <w:rFonts w:cs="Calibri"/>
+          <w:highlight w:val="yellow"/>
+        </w:rPr>
+        <w:t xml:space="preserve"> the country’s</w:t>
+      </w:r>
+      <w:r>
+        <w:rPr>
+          <w:rFonts w:cs="Calibri"/>
+          <w:highlight w:val="yellow"/>
+        </w:rPr>
+        <w:t xml:space="preserve"> </w:t>
+      </w:r>
+      <w:r>
+        <w:rPr>
+          <w:rFonts w:cs="Calibri"/>
+          <w:highlight w:val="yellow"/>
+        </w:rPr>
+        <w:t xml:space="preserve">economic </w:t>
+      </w:r>
+      <w:r>
+        <w:rPr>
+          <w:rFonts w:cs="Calibri"/>
+          <w:highlight w:val="yellow"/>
+        </w:rPr>
+        <w:t>diversification</w:t>
+      </w:r>
+      <w:r>
+        <w:rPr>
+          <w:rFonts w:cs="Calibri"/>
+          <w:highlight w:val="yellow"/>
+        </w:rPr>
+        <w:t xml:space="preserve"> efforts.</w:t>
+      </w:r>
+      <w:r>
+        <w:rPr>
+          <w:rFonts w:cs="Calibri"/>
+        </w:rPr>
+        <w:t xml:space="preserve"> </w:t>
+      </w:r>
+      <w:commentRangeEnd w:id="7"/>
+      <w:r>
+        <w:rPr>
+          <w:rStyle w:val="CommentReference"/>
+          <w:rFonts w:cs="Calibri"/>
+          <w:sz w:val="22"/>
+          <w:szCs w:val="22"/>
+        </w:rPr>
+        <w:commentReference w:id="7"/>
+      </w:r>
+      <w:r>
+        <w:rPr>
+          <w:rFonts w:cs="Calibri"/>
+        </w:rPr>
+        <w:t>Over time, however, t</w:t>
+      </w:r>
+      <w:r>
+        <w:rPr>
+          <w:rFonts w:cs="Calibri"/>
+        </w:rPr>
+        <w:t xml:space="preserve">he </w:t>
+      </w:r>
+      <w:r>
+        <w:rPr>
+          <w:rFonts w:cs="Calibri"/>
+        </w:rPr>
+        <w:t>economy</w:t>
+      </w:r>
+      <w:r>
+        <w:rPr>
+          <w:rFonts w:cs="Calibri"/>
+        </w:rPr>
+        <w:t xml:space="preserve"> </w:t>
+      </w:r>
+      <w:r>
+        <w:rPr>
+          <w:rFonts w:cs="Calibri"/>
+        </w:rPr>
+        <w:t>has become increasingly concentrated in tourism-related activities</w:t>
+      </w:r>
+      <w:r>
+        <w:rPr>
+          <w:rFonts w:cs="Calibri"/>
+        </w:rPr>
+        <w:t xml:space="preserve">, </w:t>
+      </w:r>
+      <w:r>
+        <w:rPr>
+          <w:rFonts w:cs="Calibri"/>
+        </w:rPr>
+        <w:t>p</w:t>
+      </w:r>
+      <w:r>
+        <w:rPr>
+          <w:rFonts w:cs="Calibri"/>
+        </w:rPr>
+        <w:t>osition</w:t>
+      </w:r>
+      <w:r>
+        <w:rPr>
+          <w:rFonts w:cs="Calibri"/>
+        </w:rPr>
+        <w:t>ing</w:t>
+      </w:r>
+      <w:r>
+        <w:rPr>
+          <w:rFonts w:cs="Calibri"/>
+        </w:rPr>
+        <w:t xml:space="preserve"> the</w:t>
+      </w:r>
+      <w:r>
+        <w:rPr>
+          <w:rFonts w:cs="Calibri"/>
+        </w:rPr>
+        <w:t xml:space="preserve"> sector</w:t>
+      </w:r>
+      <w:r>
+        <w:rPr>
+          <w:rFonts w:cs="Calibri"/>
+        </w:rPr>
+        <w:t xml:space="preserve"> as a </w:t>
+      </w:r>
+      <w:r>
+        <w:rPr>
+          <w:rFonts w:cs="Calibri"/>
+        </w:rPr>
+        <w:t>principal</w:t>
+      </w:r>
+      <w:r>
+        <w:rPr>
+          <w:rFonts w:cs="Calibri"/>
+        </w:rPr>
+        <w:t xml:space="preserve"> driver of economic </w:t>
+      </w:r>
+      <w:r>
+        <w:rPr>
+          <w:rFonts w:cs="Calibri"/>
+        </w:rPr>
+        <w:t>growth</w:t>
+      </w:r>
+      <w:r>
+        <w:rPr>
+          <w:rFonts w:cs="Calibri"/>
+        </w:rPr>
+        <w:t>, employment, and foreign exchange earnings</w:t>
+      </w:r>
+      <w:r>
+        <w:rPr>
+          <w:rFonts w:cs="Calibri"/>
+        </w:rPr>
+        <w:t>. This high degree of tourism dependence increases Belize’s exposure to business cycle fluctuations and external demand shocks in major source markets, particularly the United States (US) and the European Union (EU).</w:t>
+      </w:r>
     </w:p>
     <w:p>
       <w:pPr>
@@ -3248,225 +2931,6 @@
           <w:rFonts w:cs="Calibri"/>
         </w:rPr>
       </w:pPr>
-      <w:r>
-        <w:rPr>
-          <w:rFonts w:cs="Calibri"/>
-          <w:highlight w:val="yellow"/>
-        </w:rPr>
-        <w:t xml:space="preserve">The rapid expansion of tourism has significantly reshaped </w:t>
-      </w:r>
-      <w:r>
-        <w:rPr>
-          <w:rFonts w:cs="Calibri"/>
-          <w:highlight w:val="yellow"/>
-        </w:rPr>
-        <w:t xml:space="preserve">the </w:t>
-      </w:r>
-      <w:r>
-        <w:rPr>
-          <w:rFonts w:cs="Calibri"/>
-          <w:highlight w:val="yellow"/>
-        </w:rPr>
-        <w:t>economic landscape of Belize over the past two decades.</w:t>
-      </w:r>
-      <w:r>
-        <w:rPr>
-          <w:rFonts w:cs="Calibri"/>
-        </w:rPr>
-        <w:t xml:space="preserve"> </w:t>
-      </w:r>
-      <w:commentRangeStart w:id="12"/>
-      <w:r>
-        <w:rPr>
-          <w:rFonts w:cs="Calibri"/>
-        </w:rPr>
-        <w:t xml:space="preserve">Estimates from the </w:t>
-      </w:r>
-      <w:r>
-        <w:rPr>
-          <w:rFonts w:cs="Calibri"/>
-        </w:rPr>
-        <w:t>World Travel and Tourism Council (WTTC)</w:t>
-      </w:r>
-      <w:r>
-        <w:rPr>
-          <w:rFonts w:cs="Calibri"/>
-        </w:rPr>
-        <w:t xml:space="preserve"> indicate that the sector </w:t>
-      </w:r>
-      <w:r>
-        <w:rPr>
-          <w:rFonts w:cs="Calibri"/>
-        </w:rPr>
-        <w:t xml:space="preserve">directly and indirectly accounted for </w:t>
-      </w:r>
-      <w:r>
-        <w:rPr>
-          <w:rFonts w:cs="Calibri"/>
-        </w:rPr>
-        <w:t>approximately</w:t>
-      </w:r>
-      <w:r>
-        <w:rPr>
-          <w:rFonts w:cs="Calibri"/>
-        </w:rPr>
-        <w:t xml:space="preserve"> 44.4% of GDP in</w:t>
-      </w:r>
-      <w:r>
-        <w:rPr>
-          <w:rFonts w:cs="Calibri"/>
-        </w:rPr>
-        <w:t xml:space="preserve"> both</w:t>
-      </w:r>
-      <w:r>
-        <w:rPr>
-          <w:rFonts w:cs="Calibri"/>
-        </w:rPr>
-        <w:t xml:space="preserve"> </w:t>
-      </w:r>
-      <w:r>
-        <w:rPr>
-          <w:rFonts w:cs="Calibri"/>
-        </w:rPr>
-        <w:t xml:space="preserve">2024 and </w:t>
-      </w:r>
-      <w:r>
-        <w:rPr>
-          <w:rFonts w:cs="Calibri"/>
-        </w:rPr>
-        <w:t>2025 and is projected to increase to approximately 53.7% by 2035.</w:t>
-      </w:r>
-      <w:commentRangeEnd w:id="12"/>
-      <w:r>
-        <w:rPr>
-          <w:rStyle w:val="CommentReference"/>
-          <w:rFonts w:cs="Calibri"/>
-          <w:sz w:val="22"/>
-          <w:szCs w:val="22"/>
-        </w:rPr>
-        <w:commentReference w:id="12"/>
-      </w:r>
-      <w:r>
-        <w:rPr>
-          <w:rFonts w:cs="Calibri"/>
-        </w:rPr>
-        <w:t xml:space="preserve"> </w:t>
-      </w:r>
-      <w:r>
-        <w:rPr>
-          <w:rFonts w:cs="Calibri"/>
-        </w:rPr>
-        <w:t>T</w:t>
-      </w:r>
-      <w:r>
-        <w:rPr>
-          <w:rFonts w:cs="Calibri"/>
-        </w:rPr>
-        <w:t>ourism</w:t>
-      </w:r>
-      <w:r>
-        <w:rPr>
-          <w:rFonts w:cs="Calibri"/>
-        </w:rPr>
-        <w:t xml:space="preserve"> and its </w:t>
-      </w:r>
-      <w:r>
-        <w:rPr>
-          <w:rFonts w:cs="Calibri"/>
-        </w:rPr>
-        <w:t>ancillary services</w:t>
-      </w:r>
-      <w:r>
-        <w:rPr>
-          <w:rFonts w:cs="Calibri"/>
-        </w:rPr>
-        <w:t xml:space="preserve"> are </w:t>
-      </w:r>
-      <w:r>
-        <w:rPr>
-          <w:rFonts w:cs="Calibri"/>
-        </w:rPr>
-        <w:t>projected</w:t>
-      </w:r>
-      <w:r>
-        <w:rPr>
-          <w:rFonts w:cs="Calibri"/>
-        </w:rPr>
-        <w:t xml:space="preserve"> to </w:t>
-      </w:r>
-      <w:r>
-        <w:rPr>
-          <w:rFonts w:cs="Calibri"/>
-        </w:rPr>
-        <w:t>h</w:t>
-      </w:r>
-      <w:r>
-        <w:rPr>
-          <w:rFonts w:cs="Calibri"/>
-        </w:rPr>
-        <w:t xml:space="preserve">ave </w:t>
-      </w:r>
-      <w:r>
-        <w:rPr>
-          <w:rFonts w:cs="Calibri"/>
-        </w:rPr>
-        <w:t>created</w:t>
-      </w:r>
-      <w:r>
-        <w:rPr>
-          <w:rFonts w:cs="Calibri"/>
-        </w:rPr>
-        <w:t xml:space="preserve"> </w:t>
-      </w:r>
-      <w:r>
-        <w:rPr>
-          <w:rFonts w:cs="Calibri"/>
-        </w:rPr>
-        <w:t xml:space="preserve">approximately </w:t>
-      </w:r>
-      <w:r>
-        <w:rPr>
-          <w:rFonts w:cs="Calibri"/>
-        </w:rPr>
-        <w:t>67,900 jobs</w:t>
-      </w:r>
-      <w:r>
-        <w:rPr>
-          <w:rFonts w:cs="Calibri"/>
-        </w:rPr>
-        <w:t xml:space="preserve"> </w:t>
-      </w:r>
-      <w:r>
-        <w:rPr>
-          <w:rFonts w:cs="Calibri"/>
-        </w:rPr>
-        <w:t>over the same period</w:t>
-      </w:r>
-      <w:r>
-        <w:rPr>
-          <w:rFonts w:cs="Calibri"/>
-        </w:rPr>
-        <w:t>, equivalent to 42.8% of total employment, underscoring Belize’s high degree of tourism dependence</w:t>
-      </w:r>
-      <w:r>
-        <w:rPr>
-          <w:rStyle w:val="FootnoteReference"/>
-          <w:rFonts w:cs="Calibri"/>
-        </w:rPr>
-        <w:footnoteReference w:id="2"/>
-      </w:r>
-      <w:r>
-        <w:rPr>
-          <w:rFonts w:cs="Calibri"/>
-        </w:rPr>
-        <w:t>.</w:t>
-      </w:r>
-      <w:r>
-        <w:rPr>
-          <w:rFonts w:cs="Calibri"/>
-        </w:rPr>
-        <w:t xml:space="preserve"> In contrast, the agricultural sector, while critical for rural livelihoods, its contribution to economic activity has declined over time, falling from 13.0% in 2001 to an estimated 7.9% of GDP in 2024.</w:t>
-      </w:r>
     </w:p>
     <w:p>
       <w:pPr>
@@ -3477,6 +2941,232 @@
           <w:rFonts w:cs="Calibri"/>
         </w:rPr>
       </w:pPr>
+      <w:r>
+        <w:rPr>
+          <w:rFonts w:cs="Calibri"/>
+          <w:highlight w:val="yellow"/>
+        </w:rPr>
+        <w:t xml:space="preserve">The rapid expansion of tourism has significantly reshaped </w:t>
+      </w:r>
+      <w:r>
+        <w:rPr>
+          <w:rFonts w:cs="Calibri"/>
+          <w:highlight w:val="yellow"/>
+        </w:rPr>
+        <w:t xml:space="preserve">the </w:t>
+      </w:r>
+      <w:r>
+        <w:rPr>
+          <w:rFonts w:cs="Calibri"/>
+          <w:highlight w:val="yellow"/>
+        </w:rPr>
+        <w:t>economic landscape of Belize over the past two decades.</w:t>
+      </w:r>
+      <w:r>
+        <w:rPr>
+          <w:rFonts w:cs="Calibri"/>
+        </w:rPr>
+        <w:t xml:space="preserve"> </w:t>
+      </w:r>
+      <w:commentRangeStart w:id="8"/>
+      <w:r>
+        <w:rPr>
+          <w:rFonts w:cs="Calibri"/>
+        </w:rPr>
+        <w:t xml:space="preserve">Estimates from the </w:t>
+      </w:r>
+      <w:r>
+        <w:rPr>
+          <w:rFonts w:cs="Calibri"/>
+        </w:rPr>
+        <w:t>World Travel and Tourism Council (WTTC)</w:t>
+      </w:r>
+      <w:r>
+        <w:rPr>
+          <w:rFonts w:cs="Calibri"/>
+        </w:rPr>
+        <w:t xml:space="preserve"> indicate that the sector </w:t>
+      </w:r>
+      <w:r>
+        <w:rPr>
+          <w:rFonts w:cs="Calibri"/>
+        </w:rPr>
+        <w:t xml:space="preserve">directly and indirectly accounted for </w:t>
+      </w:r>
+      <w:r>
+        <w:rPr>
+          <w:rFonts w:cs="Calibri"/>
+        </w:rPr>
+        <w:t>approximately</w:t>
+      </w:r>
+      <w:r>
+        <w:rPr>
+          <w:rFonts w:cs="Calibri"/>
+        </w:rPr>
+        <w:t xml:space="preserve"> 44.4% of GDP in</w:t>
+      </w:r>
+      <w:r>
+        <w:rPr>
+          <w:rFonts w:cs="Calibri"/>
+        </w:rPr>
+        <w:t xml:space="preserve"> both</w:t>
+      </w:r>
+      <w:r>
+        <w:rPr>
+          <w:rFonts w:cs="Calibri"/>
+        </w:rPr>
+        <w:t xml:space="preserve"> </w:t>
+      </w:r>
+      <w:r>
+        <w:rPr>
+          <w:rFonts w:cs="Calibri"/>
+        </w:rPr>
+        <w:t xml:space="preserve">2024 and </w:t>
+      </w:r>
+      <w:r>
+        <w:rPr>
+          <w:rFonts w:cs="Calibri"/>
+        </w:rPr>
+        <w:t>2025 and is projected to increase to approximately 53.7% by 2035.</w:t>
+      </w:r>
+      <w:commentRangeEnd w:id="8"/>
+      <w:r>
+        <w:rPr>
+          <w:rStyle w:val="CommentReference"/>
+          <w:rFonts w:cs="Calibri"/>
+          <w:sz w:val="22"/>
+          <w:szCs w:val="22"/>
+        </w:rPr>
+        <w:commentReference w:id="8"/>
+      </w:r>
+      <w:r>
+        <w:rPr>
+          <w:rFonts w:cs="Calibri"/>
+        </w:rPr>
+        <w:t xml:space="preserve"> </w:t>
+      </w:r>
+      <w:r>
+        <w:rPr>
+          <w:rFonts w:cs="Calibri"/>
+        </w:rPr>
+        <w:t>T</w:t>
+      </w:r>
+      <w:r>
+        <w:rPr>
+          <w:rFonts w:cs="Calibri"/>
+        </w:rPr>
+        <w:t>ourism</w:t>
+      </w:r>
+      <w:r>
+        <w:rPr>
+          <w:rFonts w:cs="Calibri"/>
+        </w:rPr>
+        <w:t xml:space="preserve"> and </w:t>
+      </w:r>
+      <w:r>
+        <w:rPr>
+          <w:rFonts w:cs="Calibri"/>
+        </w:rPr>
+        <w:lastRenderedPageBreak/>
+        <w:t xml:space="preserve">its </w:t>
+      </w:r>
+      <w:r>
+        <w:rPr>
+          <w:rFonts w:cs="Calibri"/>
+        </w:rPr>
+        <w:t>ancillary services</w:t>
+      </w:r>
+      <w:r>
+        <w:rPr>
+          <w:rFonts w:cs="Calibri"/>
+        </w:rPr>
+        <w:t xml:space="preserve"> are </w:t>
+      </w:r>
+      <w:r>
+        <w:rPr>
+          <w:rFonts w:cs="Calibri"/>
+        </w:rPr>
+        <w:t>projected</w:t>
+      </w:r>
+      <w:r>
+        <w:rPr>
+          <w:rFonts w:cs="Calibri"/>
+        </w:rPr>
+        <w:t xml:space="preserve"> to </w:t>
+      </w:r>
+      <w:r>
+        <w:rPr>
+          <w:rFonts w:cs="Calibri"/>
+        </w:rPr>
+        <w:t>h</w:t>
+      </w:r>
+      <w:r>
+        <w:rPr>
+          <w:rFonts w:cs="Calibri"/>
+        </w:rPr>
+        <w:t xml:space="preserve">ave </w:t>
+      </w:r>
+      <w:r>
+        <w:rPr>
+          <w:rFonts w:cs="Calibri"/>
+        </w:rPr>
+        <w:t>created</w:t>
+      </w:r>
+      <w:r>
+        <w:rPr>
+          <w:rFonts w:cs="Calibri"/>
+        </w:rPr>
+        <w:t xml:space="preserve"> </w:t>
+      </w:r>
+      <w:r>
+        <w:rPr>
+          <w:rFonts w:cs="Calibri"/>
+        </w:rPr>
+        <w:t xml:space="preserve">approximately </w:t>
+      </w:r>
+      <w:r>
+        <w:rPr>
+          <w:rFonts w:cs="Calibri"/>
+        </w:rPr>
+        <w:t>67,900 jobs</w:t>
+      </w:r>
+      <w:r>
+        <w:rPr>
+          <w:rFonts w:cs="Calibri"/>
+        </w:rPr>
+        <w:t xml:space="preserve"> </w:t>
+      </w:r>
+      <w:r>
+        <w:rPr>
+          <w:rFonts w:cs="Calibri"/>
+        </w:rPr>
+        <w:t>over the same period</w:t>
+      </w:r>
+      <w:r>
+        <w:rPr>
+          <w:rFonts w:cs="Calibri"/>
+        </w:rPr>
+        <w:t>, equivalent to 42.8% of total employment, underscoring Belize’s high degree of tourism dependence</w:t>
+      </w:r>
+      <w:r>
+        <w:rPr>
+          <w:rStyle w:val="FootnoteReference"/>
+          <w:rFonts w:cs="Calibri"/>
+        </w:rPr>
+        <w:footnoteReference w:id="4"/>
+      </w:r>
+      <w:r>
+        <w:rPr>
+          <w:rFonts w:cs="Calibri"/>
+        </w:rPr>
+        <w:t>.</w:t>
+      </w:r>
+      <w:r>
+        <w:rPr>
+          <w:rFonts w:cs="Calibri"/>
+        </w:rPr>
+        <w:t xml:space="preserve"> In contrast, the agricultural sector, while critical for rural livelihoods, its contribution to economic activity has declined over time, falling from 13.0% in 2001 to an estimated 7.9% of GDP in 2024.</w:t>
+      </w:r>
     </w:p>
     <w:p>
       <w:pPr>
@@ -3487,155 +3177,6 @@
           <w:rFonts w:cs="Calibri"/>
         </w:rPr>
       </w:pPr>
-      <w:r>
-        <w:rPr>
-          <w:rFonts w:cs="Calibri"/>
-        </w:rPr>
-        <w:t>T</w:t>
-      </w:r>
-      <w:r>
-        <w:rPr>
-          <w:rFonts w:cs="Calibri"/>
-        </w:rPr>
-        <w:t>he country</w:t>
-      </w:r>
-      <w:r>
-        <w:rPr>
-          <w:rFonts w:cs="Calibri"/>
-        </w:rPr>
-        <w:t xml:space="preserve"> </w:t>
-      </w:r>
-      <w:r>
-        <w:rPr>
-          <w:rFonts w:cs="Calibri"/>
-        </w:rPr>
-        <w:t>recorded</w:t>
-      </w:r>
-      <w:r>
-        <w:rPr>
-          <w:rFonts w:cs="Calibri"/>
-        </w:rPr>
-        <w:t xml:space="preserve"> a five-fold increase in visitor arrivals, </w:t>
-      </w:r>
-      <w:r>
-        <w:rPr>
-          <w:rFonts w:cs="Calibri"/>
-        </w:rPr>
-        <w:t>rising</w:t>
-      </w:r>
-      <w:r>
-        <w:rPr>
-          <w:rFonts w:cs="Calibri"/>
-        </w:rPr>
-        <w:t xml:space="preserve"> from 216,932 in 2001 to a peak of 1.09 million (mn) in 2018. </w:t>
-      </w:r>
-      <w:r>
-        <w:rPr>
-          <w:rFonts w:cs="Calibri"/>
-        </w:rPr>
-        <w:t>Of that total, c</w:t>
-      </w:r>
-      <w:r>
-        <w:rPr>
-          <w:rFonts w:cs="Calibri"/>
-        </w:rPr>
-        <w:t>ruise</w:t>
-      </w:r>
-      <w:r>
-        <w:rPr>
-          <w:rFonts w:cs="Calibri"/>
-        </w:rPr>
-        <w:t xml:space="preserve"> arrivals on average</w:t>
-      </w:r>
-      <w:r>
-        <w:rPr>
-          <w:rFonts w:cs="Calibri"/>
-        </w:rPr>
-        <w:t xml:space="preserve"> account</w:t>
-      </w:r>
-      <w:r>
-        <w:rPr>
-          <w:rFonts w:cs="Calibri"/>
-        </w:rPr>
-        <w:t>ed</w:t>
-      </w:r>
-      <w:r>
-        <w:rPr>
-          <w:rFonts w:cs="Calibri"/>
-        </w:rPr>
-        <w:t xml:space="preserve"> for </w:t>
-      </w:r>
-      <w:r>
-        <w:rPr>
-          <w:rFonts w:cs="Calibri"/>
-        </w:rPr>
-        <w:t>around</w:t>
-      </w:r>
-      <w:r>
-        <w:rPr>
-          <w:rFonts w:cs="Calibri"/>
-        </w:rPr>
-        <w:t xml:space="preserve"> 69.0%</w:t>
-      </w:r>
-      <w:r>
-        <w:rPr>
-          <w:rFonts w:cs="Calibri"/>
-        </w:rPr>
-        <w:t>.</w:t>
-      </w:r>
-      <w:r>
-        <w:rPr>
-          <w:rFonts w:cs="Calibri"/>
-        </w:rPr>
-        <w:t xml:space="preserve"> </w:t>
-      </w:r>
-      <w:r>
-        <w:rPr>
-          <w:rFonts w:cs="Calibri"/>
-        </w:rPr>
-        <w:t>Accordingly, t</w:t>
-      </w:r>
-      <w:r>
-        <w:rPr>
-          <w:rFonts w:cs="Calibri"/>
-        </w:rPr>
-        <w:t xml:space="preserve">ravel receipts have become an increasingly important component of Belize’s external services account, rising from </w:t>
-      </w:r>
-      <w:commentRangeStart w:id="13"/>
-      <w:r>
-        <w:rPr>
-          <w:rFonts w:cs="Calibri"/>
-        </w:rPr>
-        <w:t>BZ$316.6 mn in 2001 to BZ$2.4 billion</w:t>
-      </w:r>
-      <w:r>
-        <w:rPr>
-          <w:rFonts w:cs="Calibri"/>
-        </w:rPr>
-        <w:t xml:space="preserve"> (bn)</w:t>
-      </w:r>
-      <w:r>
-        <w:rPr>
-          <w:rFonts w:cs="Calibri"/>
-        </w:rPr>
-        <w:t xml:space="preserve"> in 2024.</w:t>
-      </w:r>
-      <w:commentRangeEnd w:id="13"/>
-      <w:r>
-        <w:rPr>
-          <w:rStyle w:val="CommentReference"/>
-          <w:rFonts w:cs="Calibri"/>
-          <w:sz w:val="22"/>
-          <w:szCs w:val="22"/>
-        </w:rPr>
-        <w:commentReference w:id="13"/>
-      </w:r>
-      <w:r>
-        <w:rPr>
-          <w:rFonts w:cs="Calibri"/>
-        </w:rPr>
-        <w:t xml:space="preserve"> This underscores tourism’s role as a critical source of foreign exchange earnings and its importance in supporting the country’s balance of payments position.</w:t>
-      </w:r>
     </w:p>
     <w:p>
       <w:pPr>
@@ -3646,6 +3187,155 @@
           <w:rFonts w:cs="Calibri"/>
         </w:rPr>
       </w:pPr>
+      <w:r>
+        <w:rPr>
+          <w:rFonts w:cs="Calibri"/>
+        </w:rPr>
+        <w:t>T</w:t>
+      </w:r>
+      <w:r>
+        <w:rPr>
+          <w:rFonts w:cs="Calibri"/>
+        </w:rPr>
+        <w:t>he country</w:t>
+      </w:r>
+      <w:r>
+        <w:rPr>
+          <w:rFonts w:cs="Calibri"/>
+        </w:rPr>
+        <w:t xml:space="preserve"> </w:t>
+      </w:r>
+      <w:r>
+        <w:rPr>
+          <w:rFonts w:cs="Calibri"/>
+        </w:rPr>
+        <w:t>recorded</w:t>
+      </w:r>
+      <w:r>
+        <w:rPr>
+          <w:rFonts w:cs="Calibri"/>
+        </w:rPr>
+        <w:t xml:space="preserve"> a five-fold increase in visitor arrivals, </w:t>
+      </w:r>
+      <w:r>
+        <w:rPr>
+          <w:rFonts w:cs="Calibri"/>
+        </w:rPr>
+        <w:t>rising</w:t>
+      </w:r>
+      <w:r>
+        <w:rPr>
+          <w:rFonts w:cs="Calibri"/>
+        </w:rPr>
+        <w:t xml:space="preserve"> from 216,932 in 2001 to a peak of 1.09 million (mn) in 2018. </w:t>
+      </w:r>
+      <w:r>
+        <w:rPr>
+          <w:rFonts w:cs="Calibri"/>
+        </w:rPr>
+        <w:t>Of that total, c</w:t>
+      </w:r>
+      <w:r>
+        <w:rPr>
+          <w:rFonts w:cs="Calibri"/>
+        </w:rPr>
+        <w:t>ruise</w:t>
+      </w:r>
+      <w:r>
+        <w:rPr>
+          <w:rFonts w:cs="Calibri"/>
+        </w:rPr>
+        <w:t xml:space="preserve"> arrivals on average</w:t>
+      </w:r>
+      <w:r>
+        <w:rPr>
+          <w:rFonts w:cs="Calibri"/>
+        </w:rPr>
+        <w:t xml:space="preserve"> account</w:t>
+      </w:r>
+      <w:r>
+        <w:rPr>
+          <w:rFonts w:cs="Calibri"/>
+        </w:rPr>
+        <w:t>ed</w:t>
+      </w:r>
+      <w:r>
+        <w:rPr>
+          <w:rFonts w:cs="Calibri"/>
+        </w:rPr>
+        <w:t xml:space="preserve"> for </w:t>
+      </w:r>
+      <w:r>
+        <w:rPr>
+          <w:rFonts w:cs="Calibri"/>
+        </w:rPr>
+        <w:t>around</w:t>
+      </w:r>
+      <w:r>
+        <w:rPr>
+          <w:rFonts w:cs="Calibri"/>
+        </w:rPr>
+        <w:t xml:space="preserve"> 69.0%</w:t>
+      </w:r>
+      <w:r>
+        <w:rPr>
+          <w:rFonts w:cs="Calibri"/>
+        </w:rPr>
+        <w:t>.</w:t>
+      </w:r>
+      <w:r>
+        <w:rPr>
+          <w:rFonts w:cs="Calibri"/>
+        </w:rPr>
+        <w:t xml:space="preserve"> </w:t>
+      </w:r>
+      <w:r>
+        <w:rPr>
+          <w:rFonts w:cs="Calibri"/>
+        </w:rPr>
+        <w:t>Accordingly, t</w:t>
+      </w:r>
+      <w:r>
+        <w:rPr>
+          <w:rFonts w:cs="Calibri"/>
+        </w:rPr>
+        <w:t xml:space="preserve">ravel receipts have become an increasingly important component of Belize’s external services account, rising from </w:t>
+      </w:r>
+      <w:commentRangeStart w:id="9"/>
+      <w:r>
+        <w:rPr>
+          <w:rFonts w:cs="Calibri"/>
+        </w:rPr>
+        <w:t>BZ$316.6 mn in 2001 to BZ$2.4 billion</w:t>
+      </w:r>
+      <w:r>
+        <w:rPr>
+          <w:rFonts w:cs="Calibri"/>
+        </w:rPr>
+        <w:t xml:space="preserve"> (bn)</w:t>
+      </w:r>
+      <w:r>
+        <w:rPr>
+          <w:rFonts w:cs="Calibri"/>
+        </w:rPr>
+        <w:t xml:space="preserve"> in 2024.</w:t>
+      </w:r>
+      <w:commentRangeEnd w:id="9"/>
+      <w:r>
+        <w:rPr>
+          <w:rStyle w:val="CommentReference"/>
+          <w:rFonts w:cs="Calibri"/>
+          <w:sz w:val="22"/>
+          <w:szCs w:val="22"/>
+        </w:rPr>
+        <w:commentReference w:id="9"/>
+      </w:r>
+      <w:r>
+        <w:rPr>
+          <w:rFonts w:cs="Calibri"/>
+        </w:rPr>
+        <w:t xml:space="preserve"> This underscores tourism’s role as a critical source of foreign exchange earnings and its importance in supporting the country’s balance of payments position.</w:t>
+      </w:r>
     </w:p>
     <w:p>
       <w:pPr>
@@ -3654,6 +3344,16 @@
         <w:jc w:val="both"/>
         <w:rPr>
           <w:rFonts w:cs="Calibri"/>
+        </w:rPr>
+      </w:pPr>
+    </w:p>
+    <w:p>
+      <w:pPr>
+        <w:pStyle w:val="BodyText"/>
+        <w:ind w:right="4"/>
+        <w:jc w:val="both"/>
+        <w:rPr>
+          <w:rFonts w:cs="Calibri"/>
           <w:b/>
           <w:bCs/>
         </w:rPr>
@@ -3677,22 +3377,32 @@
     </w:p>
     <w:p>
       <w:pPr>
-        <w:pStyle w:val="Heading3"/>
-        <w:rPr>
+        <w:pStyle w:val="Heading2"/>
+        <w:rPr>
+          <w:rFonts w:ascii="Trebuchet MS" w:hAnsi="Trebuchet MS"/>
+          <w:b/>
+          <w:bCs/>
+        </w:rPr>
+      </w:pPr>
+      <w:r>
+        <w:rPr>
+          <w:rFonts w:ascii="Trebuchet MS" w:hAnsi="Trebuchet MS"/>
           <w:b/>
           <w:bCs/>
           <w:sz w:val="24"/>
           <w:szCs w:val="24"/>
         </w:rPr>
-      </w:pPr>
-      <w:r>
-        <w:rPr>
+        <w:t>Productivity</w:t>
+      </w:r>
+      <w:r>
+        <w:rPr>
+          <w:rFonts w:ascii="Trebuchet MS" w:hAnsi="Trebuchet MS"/>
           <w:b/>
           <w:bCs/>
           <w:sz w:val="24"/>
           <w:szCs w:val="24"/>
         </w:rPr>
-        <w:t>Productivity</w:t>
+        <w:t xml:space="preserve"> Analysis</w:t>
       </w:r>
     </w:p>
     <w:p>
@@ -3708,14 +3418,7 @@
         <w:rPr>
           <w:rFonts w:cs="Calibri"/>
         </w:rPr>
-        <w:t xml:space="preserve">The factors that contributed to economic growth in Belize over the past three decades have gradually changed. During the 1991-1995 period, economic growth was driven primarily by physical capital accumulation, which contributed approximately 3.5 percentage points to </w:t>
-      </w:r>
-      <w:r>
-        <w:rPr>
-          <w:rFonts w:cs="Calibri"/>
-        </w:rPr>
-        <w:lastRenderedPageBreak/>
-        <w:t>annual GDP growth</w:t>
+        <w:t>The factors that contributed to economic growth in Belize over the past three decades have gradually changed. During the 1991-1995 period, economic growth was driven primarily by physical capital accumulation, which contributed approximately 3.5 percentage points to annual GDP growth</w:t>
       </w:r>
       <w:r>
         <w:rPr>
@@ -3789,7 +3492,7 @@
           <w:szCs w:val="22"/>
         </w:rPr>
       </w:pPr>
-      <w:commentRangeStart w:id="14"/>
+      <w:commentRangeStart w:id="10"/>
       <w:r>
         <w:rPr>
           <w:b/>
@@ -3799,6 +3502,7 @@
           <w:sz w:val="22"/>
           <w:szCs w:val="22"/>
         </w:rPr>
+        <w:lastRenderedPageBreak/>
         <w:t xml:space="preserve">Figure </w:t>
       </w:r>
       <w:r>
@@ -3895,7 +3599,7 @@
         </w:rPr>
         <w:t>Belize Growth Accounting Decomposition (Avg. Annual Contribution to Real GDP)</w:t>
       </w:r>
-      <w:commentRangeEnd w:id="14"/>
+      <w:commentRangeEnd w:id="10"/>
       <w:r>
         <w:rPr>
           <w:rStyle w:val="CommentReference"/>
@@ -3906,7 +3610,7 @@
           <w:sz w:val="22"/>
           <w:szCs w:val="22"/>
         </w:rPr>
-        <w:commentReference w:id="14"/>
+        <w:commentReference w:id="10"/>
       </w:r>
     </w:p>
     <w:p>
@@ -3918,6 +3622,7 @@
           <w:rFonts w:cs="Calibri"/>
         </w:rPr>
       </w:pPr>
+      <w:commentRangeStart w:id="11"/>
       <w:r>
         <w:rPr>
           <w:rFonts w:cs="Calibri"/>
@@ -3959,6 +3664,16 @@
           </wp:inline>
         </w:drawing>
       </w:r>
+      <w:commentRangeEnd w:id="11"/>
+      <w:r>
+        <w:rPr>
+          <w:rStyle w:val="CommentReference"/>
+          <w:rFonts w:cs="Calibri"/>
+          <w:sz w:val="22"/>
+          <w:szCs w:val="22"/>
+        </w:rPr>
+        <w:commentReference w:id="11"/>
+      </w:r>
     </w:p>
     <w:p>
       <w:pPr>
@@ -4001,14 +3716,7 @@
         <w:rPr>
           <w:rFonts w:cs="Calibri"/>
         </w:rPr>
-        <w:t xml:space="preserve"> the efficiency with which  these factors were utilized reduced. The findings may reflect several structural constraints facing Belize, including low productivity growth, weak technological diffusion, infrastructure bottlenecks, institutional </w:t>
-      </w:r>
-      <w:r>
-        <w:rPr>
-          <w:rFonts w:cs="Calibri"/>
-        </w:rPr>
-        <w:lastRenderedPageBreak/>
-        <w:t xml:space="preserve">inefficiencies, </w:t>
+        <w:t xml:space="preserve"> the efficiency with which  these factors were utilized reduced. The findings may reflect several structural constraints facing Belize, including low productivity growth, weak technological diffusion, infrastructure bottlenecks, institutional inefficiencies, </w:t>
       </w:r>
       <w:r>
         <w:rPr>
@@ -4073,7 +3781,14 @@
         <w:rPr>
           <w:rFonts w:cs="Calibri"/>
         </w:rPr>
-        <w:t>The 2020–2023 period reflects the extraordinary disruptions associated with the COVID-19 pandemic and the subsequent recovery. Despite severe economic contraction during 2020, the average period still shows positive contributions from capital and labour, reflecting the rapid rebound in tourism, employment recovery, and post-pandemic investment activity. TFP appears close to neutral over this period, suggesting that the recovery was driven more by cyclical reopening effects than by deeper productivity-enhancing structural transformation.</w:t>
+        <w:t xml:space="preserve">The 2020–2023 period reflects the extraordinary disruptions associated with the COVID-19 pandemic and the subsequent recovery. Despite severe economic contraction during 2020, the </w:t>
+      </w:r>
+      <w:r>
+        <w:rPr>
+          <w:rFonts w:cs="Calibri"/>
+        </w:rPr>
+        <w:lastRenderedPageBreak/>
+        <w:t>average period still shows positive contributions from capital and labour, reflecting the rapid rebound in tourism, employment recovery, and post-pandemic investment activity. TFP appears close to neutral over this period, suggesting that the recovery was driven more by cyclical reopening effects than by deeper productivity-enhancing structural transformation.</w:t>
       </w:r>
     </w:p>
     <w:p>
@@ -4121,15 +3836,15 @@
           <w:rFonts w:cs="Calibri"/>
         </w:rPr>
       </w:pPr>
-      <w:commentRangeStart w:id="15"/>
-      <w:commentRangeStart w:id="16"/>
+      <w:commentRangeStart w:id="12"/>
+      <w:commentRangeStart w:id="13"/>
       <w:r>
         <w:rPr>
           <w:rFonts w:cs="Calibri"/>
         </w:rPr>
         <w:t xml:space="preserve">Comparator economies such as Costa Rica, the Dominican Republic, and Mauritius provide </w:t>
       </w:r>
-      <w:commentRangeEnd w:id="16"/>
+      <w:commentRangeEnd w:id="13"/>
       <w:r>
         <w:rPr>
           <w:rStyle w:val="CommentReference"/>
@@ -4137,7 +3852,7 @@
           <w:sz w:val="22"/>
           <w:szCs w:val="22"/>
         </w:rPr>
-        <w:commentReference w:id="16"/>
+        <w:commentReference w:id="13"/>
       </w:r>
       <w:r>
         <w:rPr>
@@ -4169,7 +3884,7 @@
         </w:rPr>
         <w:t xml:space="preserve">GNI grew by only 19.3%, reflecting the presence of a persistent middle-income trap dynamics, which is limiting long-term income convergence relative to the selected comparator countries. </w:t>
       </w:r>
-      <w:commentRangeEnd w:id="15"/>
+      <w:commentRangeEnd w:id="12"/>
       <w:r>
         <w:rPr>
           <w:rStyle w:val="CommentReference"/>
@@ -4177,7 +3892,7 @@
           <w:sz w:val="22"/>
           <w:szCs w:val="22"/>
         </w:rPr>
-        <w:commentReference w:id="15"/>
+        <w:commentReference w:id="12"/>
       </w:r>
     </w:p>
     <w:p>
@@ -4370,7 +4085,6 @@
         <w:rPr>
           <w:rFonts w:cs="Calibri"/>
         </w:rPr>
-        <w:lastRenderedPageBreak/>
         <w:t xml:space="preserve">In contrast, Belize’s real </w:t>
       </w:r>
       <w:r>
@@ -4436,7 +4150,7 @@
           <w:szCs w:val="22"/>
         </w:rPr>
       </w:pPr>
-      <w:commentRangeStart w:id="17"/>
+      <w:commentRangeStart w:id="14"/>
       <w:r>
         <w:rPr>
           <w:rFonts w:cs="Calibri"/>
@@ -4447,6 +4161,7 @@
           <w:sz w:val="22"/>
           <w:szCs w:val="22"/>
         </w:rPr>
+        <w:lastRenderedPageBreak/>
         <w:t xml:space="preserve">Figure </w:t>
       </w:r>
       <w:r>
@@ -4551,7 +4266,7 @@
         </w:rPr>
         <w:t xml:space="preserve">Gross National Income Per Capita, PPP (Constant 2021 Internation $) </w:t>
       </w:r>
-      <w:commentRangeEnd w:id="17"/>
+      <w:commentRangeEnd w:id="14"/>
       <w:r>
         <w:rPr>
           <w:rStyle w:val="CommentReference"/>
@@ -4563,7 +4278,7 @@
           <w:sz w:val="22"/>
           <w:szCs w:val="22"/>
         </w:rPr>
-        <w:commentReference w:id="17"/>
+        <w:commentReference w:id="14"/>
       </w:r>
     </w:p>
     <w:p>
@@ -4889,7 +4604,6 @@
           <w:sz w:val="28"/>
           <w:szCs w:val="28"/>
         </w:rPr>
-        <w:lastRenderedPageBreak/>
         <w:t>Demographic</w:t>
       </w:r>
       <w:r>
@@ -4902,7 +4616,7 @@
         </w:rPr>
         <w:t xml:space="preserve"> </w:t>
       </w:r>
-      <w:commentRangeStart w:id="18"/>
+      <w:commentRangeStart w:id="15"/>
       <w:r>
         <w:rPr>
           <w:rFonts w:ascii="Trebuchet MS" w:hAnsi="Trebuchet MS"/>
@@ -4933,7 +4647,7 @@
         </w:rPr>
         <w:t>Trends</w:t>
       </w:r>
-      <w:commentRangeEnd w:id="18"/>
+      <w:commentRangeEnd w:id="15"/>
       <w:r>
         <w:rPr>
           <w:rStyle w:val="CommentReference"/>
@@ -4943,7 +4657,7 @@
           <w:sz w:val="28"/>
           <w:szCs w:val="28"/>
         </w:rPr>
-        <w:commentReference w:id="18"/>
+        <w:commentReference w:id="15"/>
       </w:r>
     </w:p>
     <w:p>
@@ -4968,14 +4682,14 @@
           <w:rFonts w:cs="Calibri"/>
         </w:rPr>
       </w:pPr>
-      <w:commentRangeStart w:id="19"/>
+      <w:commentRangeStart w:id="16"/>
       <w:r>
         <w:rPr>
           <w:rFonts w:cs="Calibri"/>
         </w:rPr>
         <w:t xml:space="preserve">Belize’s estimated mid-year population in 2026 stood at </w:t>
       </w:r>
-      <w:commentRangeStart w:id="20"/>
+      <w:commentRangeStart w:id="17"/>
       <w:r>
         <w:rPr>
           <w:rFonts w:cs="Calibri"/>
@@ -4988,7 +4702,7 @@
         </w:rPr>
         <w:t>, comprising 210,525 males and 217,869 females,</w:t>
       </w:r>
-      <w:commentRangeEnd w:id="20"/>
+      <w:commentRangeEnd w:id="17"/>
       <w:r>
         <w:rPr>
           <w:rStyle w:val="CommentReference"/>
@@ -4996,7 +4710,7 @@
           <w:sz w:val="22"/>
           <w:szCs w:val="22"/>
         </w:rPr>
-        <w:commentReference w:id="20"/>
+        <w:commentReference w:id="17"/>
       </w:r>
       <w:r>
         <w:rPr>
@@ -5010,7 +4724,7 @@
         </w:rPr>
         <w:t xml:space="preserve">. </w:t>
       </w:r>
-      <w:commentRangeEnd w:id="19"/>
+      <w:commentRangeEnd w:id="16"/>
       <w:r>
         <w:rPr>
           <w:rStyle w:val="CommentReference"/>
@@ -5018,7 +4732,7 @@
           <w:sz w:val="22"/>
           <w:szCs w:val="22"/>
         </w:rPr>
-        <w:commentReference w:id="19"/>
+        <w:commentReference w:id="16"/>
       </w:r>
       <w:r>
         <w:rPr>
@@ -5026,7 +4740,7 @@
         </w:rPr>
         <w:t xml:space="preserve">Between 2015 and 2026, </w:t>
       </w:r>
-      <w:commentRangeStart w:id="21"/>
+      <w:commentRangeStart w:id="18"/>
       <w:r>
         <w:rPr>
           <w:rFonts w:cs="Calibri"/>
@@ -5051,7 +4765,7 @@
         </w:rPr>
         <w:t xml:space="preserve"> </w:t>
       </w:r>
-      <w:commentRangeEnd w:id="21"/>
+      <w:commentRangeEnd w:id="18"/>
       <w:r>
         <w:rPr>
           <w:rStyle w:val="CommentReference"/>
@@ -5059,7 +4773,7 @@
           <w:sz w:val="22"/>
           <w:szCs w:val="22"/>
         </w:rPr>
-        <w:commentReference w:id="21"/>
+        <w:commentReference w:id="18"/>
       </w:r>
     </w:p>
     <w:p>
@@ -5103,14 +4817,14 @@
         </w:rPr>
         <w:t xml:space="preserve">small developing </w:t>
       </w:r>
-      <w:commentRangeStart w:id="22"/>
+      <w:commentRangeStart w:id="19"/>
       <w:r>
         <w:rPr>
           <w:rFonts w:cs="Calibri"/>
         </w:rPr>
         <w:t>states</w:t>
       </w:r>
-      <w:commentRangeEnd w:id="22"/>
+      <w:commentRangeEnd w:id="19"/>
       <w:r>
         <w:rPr>
           <w:rStyle w:val="CommentReference"/>
@@ -5118,7 +4832,7 @@
           <w:sz w:val="22"/>
           <w:szCs w:val="22"/>
         </w:rPr>
-        <w:commentReference w:id="22"/>
+        <w:commentReference w:id="19"/>
       </w:r>
       <w:r>
         <w:rPr>
@@ -5132,7 +4846,7 @@
         </w:rPr>
         <w:t xml:space="preserve"> is becoming increasingly ruralized. </w:t>
       </w:r>
-      <w:commentRangeStart w:id="23"/>
+      <w:commentRangeStart w:id="20"/>
       <w:r>
         <w:rPr>
           <w:rFonts w:cs="Calibri"/>
@@ -5169,7 +4883,7 @@
         </w:rPr>
         <w:t xml:space="preserve"> several districts emerging as key labour supply centers</w:t>
       </w:r>
-      <w:commentRangeEnd w:id="23"/>
+      <w:commentRangeEnd w:id="20"/>
       <w:r>
         <w:rPr>
           <w:rStyle w:val="CommentReference"/>
@@ -5177,7 +4891,7 @@
           <w:sz w:val="22"/>
           <w:szCs w:val="22"/>
         </w:rPr>
-        <w:commentReference w:id="23"/>
+        <w:commentReference w:id="20"/>
       </w:r>
       <w:r>
         <w:rPr>
@@ -5241,7 +4955,7 @@
         </w:rPr>
         <w:t xml:space="preserve"> </w:t>
       </w:r>
-      <w:commentRangeStart w:id="24"/>
+      <w:commentRangeStart w:id="21"/>
       <w:r>
         <w:rPr>
           <w:rFonts w:cs="Calibri"/>
@@ -5260,7 +4974,7 @@
         </w:rPr>
         <w:t xml:space="preserve">  </w:t>
       </w:r>
-      <w:commentRangeEnd w:id="24"/>
+      <w:commentRangeEnd w:id="21"/>
       <w:r>
         <w:rPr>
           <w:rStyle w:val="CommentReference"/>
@@ -5268,7 +4982,7 @@
           <w:sz w:val="22"/>
           <w:szCs w:val="22"/>
         </w:rPr>
-        <w:commentReference w:id="24"/>
+        <w:commentReference w:id="21"/>
       </w:r>
     </w:p>
     <w:p>
@@ -5342,14 +5056,14 @@
         </w:rPr>
         <w:t xml:space="preserve"> pressures on the economy’s capacity to generate productive employment opportunities, particularly for youth entering the labor market. At the same time, </w:t>
       </w:r>
-      <w:commentRangeStart w:id="25"/>
+      <w:commentRangeStart w:id="22"/>
       <w:r>
         <w:rPr>
           <w:rFonts w:cs="Calibri"/>
         </w:rPr>
         <w:t>sustained population growth raises demand for housing, education, healthcare, transportation, and other public infrastructure</w:t>
       </w:r>
-      <w:commentRangeEnd w:id="25"/>
+      <w:commentRangeEnd w:id="22"/>
       <w:r>
         <w:rPr>
           <w:rStyle w:val="CommentReference"/>
@@ -5357,7 +5071,7 @@
           <w:sz w:val="22"/>
           <w:szCs w:val="22"/>
         </w:rPr>
-        <w:commentReference w:id="25"/>
+        <w:commentReference w:id="22"/>
       </w:r>
       <w:r>
         <w:rPr>
@@ -5463,7 +5177,7 @@
           <w:rFonts w:cs="Calibri"/>
         </w:rPr>
       </w:pPr>
-      <w:commentRangeStart w:id="26"/>
+      <w:commentRangeStart w:id="23"/>
       <w:r>
         <w:rPr>
           <w:rFonts w:cs="Calibri"/>
@@ -5475,7 +5189,7 @@
           <w:rStyle w:val="FootnoteReference"/>
           <w:rFonts w:cs="Calibri"/>
         </w:rPr>
-        <w:footnoteReference w:id="3"/>
+        <w:footnoteReference w:id="5"/>
       </w:r>
       <w:r>
         <w:rPr>
@@ -5489,7 +5203,7 @@
         </w:rPr>
         <w:t>, reflecting a relatively youthful demographic structure. The dependency burden is concentrated among the younger cohort of the population, as evidenced by a youth dependence ratio of 43.8%, while the old-age dependency ratio is comparatively low at 10.9</w:t>
       </w:r>
-      <w:commentRangeEnd w:id="26"/>
+      <w:commentRangeEnd w:id="23"/>
       <w:r>
         <w:rPr>
           <w:rStyle w:val="CommentReference"/>
@@ -5497,7 +5211,7 @@
           <w:sz w:val="22"/>
           <w:szCs w:val="22"/>
         </w:rPr>
-        <w:commentReference w:id="26"/>
+        <w:commentReference w:id="23"/>
       </w:r>
       <w:r>
         <w:rPr>
@@ -5612,7 +5326,7 @@
           <w:szCs w:val="22"/>
         </w:rPr>
       </w:pPr>
-      <w:commentRangeStart w:id="27"/>
+      <w:commentRangeStart w:id="24"/>
       <w:r>
         <w:rPr>
           <w:rFonts w:cs="Calibri"/>
@@ -5623,7 +5337,6 @@
           <w:sz w:val="22"/>
           <w:szCs w:val="22"/>
         </w:rPr>
-        <w:lastRenderedPageBreak/>
         <w:t xml:space="preserve">Figure </w:t>
       </w:r>
       <w:r>
@@ -5699,7 +5412,7 @@
         </w:rPr>
         <w:t xml:space="preserve">: </w:t>
       </w:r>
-      <w:commentRangeEnd w:id="27"/>
+      <w:commentRangeEnd w:id="24"/>
       <w:r>
         <w:rPr>
           <w:rStyle w:val="CommentReference"/>
@@ -5711,7 +5424,7 @@
           <w:sz w:val="22"/>
           <w:szCs w:val="22"/>
         </w:rPr>
-        <w:commentReference w:id="27"/>
+        <w:commentReference w:id="24"/>
       </w:r>
     </w:p>
     <w:p>
@@ -5873,7 +5586,7 @@
         </w:rPr>
         <w:t xml:space="preserve"> </w:t>
       </w:r>
-      <w:commentRangeStart w:id="28"/>
+      <w:commentRangeStart w:id="25"/>
       <w:r>
         <w:rPr>
           <w:rFonts w:cs="Calibri"/>
@@ -5904,7 +5617,7 @@
         </w:rPr>
         <w:t xml:space="preserve"> are macro-critical, as it can weaken human capital deepening and constrain domestic labour market dynamism.</w:t>
       </w:r>
-      <w:commentRangeEnd w:id="28"/>
+      <w:commentRangeEnd w:id="25"/>
       <w:r>
         <w:rPr>
           <w:rStyle w:val="CommentReference"/>
@@ -5912,7 +5625,7 @@
           <w:sz w:val="22"/>
           <w:szCs w:val="22"/>
         </w:rPr>
-        <w:commentReference w:id="28"/>
+        <w:commentReference w:id="25"/>
       </w:r>
     </w:p>
     <w:p>
@@ -6080,7 +5793,7 @@
           <w:szCs w:val="22"/>
         </w:rPr>
       </w:pPr>
-      <w:commentRangeStart w:id="29"/>
+      <w:commentRangeStart w:id="26"/>
       <w:r>
         <w:rPr>
           <w:b/>
@@ -6090,7 +5803,6 @@
           <w:sz w:val="22"/>
           <w:szCs w:val="22"/>
         </w:rPr>
-        <w:lastRenderedPageBreak/>
         <w:t xml:space="preserve">Figure </w:t>
       </w:r>
       <w:r>
@@ -6187,7 +5899,7 @@
         </w:rPr>
         <w:t>Belize Demographic Transition, 2015-2025</w:t>
       </w:r>
-      <w:commentRangeEnd w:id="29"/>
+      <w:commentRangeEnd w:id="26"/>
       <w:r>
         <w:rPr>
           <w:rStyle w:val="CommentReference"/>
@@ -6198,7 +5910,7 @@
           <w:sz w:val="22"/>
           <w:szCs w:val="22"/>
         </w:rPr>
-        <w:commentReference w:id="29"/>
+        <w:commentReference w:id="26"/>
       </w:r>
     </w:p>
     <w:p>
@@ -6449,14 +6161,14 @@
         </w:rPr>
         <w:t xml:space="preserve"> likely reflects expanding economic opportunities associated with the growth of the tourism sector as well as inward migration from neighbouring Central American countries. Net migration flows strengthened during the 2000s, contributing to the expansion of the labour force and total population growth. Migration patterns, however, remain highly sensitive to economic conditions, </w:t>
       </w:r>
-      <w:commentRangeStart w:id="30"/>
+      <w:commentRangeStart w:id="27"/>
       <w:r>
         <w:rPr>
           <w:rFonts w:cs="Calibri"/>
         </w:rPr>
         <w:t>as evidenced by the sharp decline during the COVID-19 pandemic and the subsequent rebound in 2022</w:t>
       </w:r>
-      <w:commentRangeEnd w:id="30"/>
+      <w:commentRangeEnd w:id="27"/>
       <w:r>
         <w:rPr>
           <w:rStyle w:val="CommentReference"/>
@@ -6464,7 +6176,7 @@
           <w:sz w:val="22"/>
           <w:szCs w:val="22"/>
         </w:rPr>
-        <w:commentReference w:id="30"/>
+        <w:commentReference w:id="27"/>
       </w:r>
       <w:r>
         <w:rPr>
@@ -6515,7 +6227,7 @@
           <w:rStyle w:val="FootnoteReference"/>
           <w:rFonts w:cs="Calibri"/>
         </w:rPr>
-        <w:footnoteReference w:id="4"/>
+        <w:footnoteReference w:id="6"/>
       </w:r>
       <w:r>
         <w:rPr>
@@ -6971,7 +6683,7 @@
           <w:szCs w:val="28"/>
         </w:rPr>
       </w:pPr>
-      <w:commentRangeStart w:id="31"/>
+      <w:commentRangeStart w:id="28"/>
       <w:r>
         <w:rPr>
           <w:rFonts w:ascii="Trebuchet MS" w:hAnsi="Trebuchet MS"/>
@@ -6980,10 +6692,9 @@
           <w:sz w:val="28"/>
           <w:szCs w:val="28"/>
         </w:rPr>
-        <w:lastRenderedPageBreak/>
         <w:t>Labour Market Assessment</w:t>
       </w:r>
-      <w:commentRangeEnd w:id="31"/>
+      <w:commentRangeEnd w:id="28"/>
       <w:r>
         <w:rPr>
           <w:rStyle w:val="CommentReference"/>
@@ -6993,7 +6704,7 @@
           <w:sz w:val="28"/>
           <w:szCs w:val="28"/>
         </w:rPr>
-        <w:commentReference w:id="31"/>
+        <w:commentReference w:id="28"/>
       </w:r>
     </w:p>
     <w:bookmarkEnd w:id="0"/>
@@ -7470,7 +7181,6 @@
         <w:rPr>
           <w:rFonts w:cs="Aptos Serif"/>
         </w:rPr>
-        <w:lastRenderedPageBreak/>
         <w:t xml:space="preserve">The diverging trajectories of younger and older working </w:t>
       </w:r>
       <w:r>
@@ -7585,7 +7295,7 @@
           <w:rFonts w:cs="Aptos Serif"/>
         </w:rPr>
       </w:pPr>
-      <w:commentRangeStart w:id="32"/>
+      <w:commentRangeStart w:id="29"/>
       <w:r>
         <w:rPr>
           <w:rFonts w:cs="Aptos Serif"/>
@@ -7714,7 +7424,7 @@
         </w:rPr>
         <w:t xml:space="preserve"> The population with secondary education increased from 50,037 persons in 2015 to 70,051 persons in 2024, equivalent to 40.0%. Similarly, the number of persons with tertiary education expanded from 35,229 to 54,025 over the same period, representing an increase of nearly 53.4%. This growth in tertiary education attainment suggests a gradual deepening of Belize’s skilled labour force and may reflect expanded access to higher education, increased educational participation and changing labour market demands.</w:t>
       </w:r>
-      <w:commentRangeEnd w:id="32"/>
+      <w:commentRangeEnd w:id="29"/>
       <w:r>
         <w:rPr>
           <w:rStyle w:val="CommentReference"/>
@@ -7722,7 +7432,7 @@
           <w:sz w:val="22"/>
           <w:szCs w:val="22"/>
         </w:rPr>
-        <w:commentReference w:id="32"/>
+        <w:commentReference w:id="29"/>
       </w:r>
     </w:p>
     <w:p>
@@ -7790,14 +7500,7 @@
         <w:rPr>
           <w:rFonts w:cs="Aptos Serif"/>
         </w:rPr>
-        <w:t xml:space="preserve">Although the expansion in secondary and tertiary education is encouraging from a labour productivity and competitiveness standpoint, the continued dominance of primary-level </w:t>
-      </w:r>
-      <w:r>
-        <w:rPr>
-          <w:rFonts w:cs="Aptos Serif"/>
-        </w:rPr>
-        <w:lastRenderedPageBreak/>
-        <w:t xml:space="preserve">attainment points to persistent structural constraints withing the education and training system in Belize. The composition of educational attainment reflects the economic structure of Belize, which is concentrated in labour intensive low skills sector such as tourism services and agriculture. </w:t>
+        <w:t xml:space="preserve">Although the expansion in secondary and tertiary education is encouraging from a labour productivity and competitiveness standpoint, the continued dominance of primary-level attainment points to persistent structural constraints withing the education and training system in Belize. The composition of educational attainment reflects the economic structure of Belize, which is concentrated in labour intensive low skills sector such as tourism services and agriculture. </w:t>
       </w:r>
       <w:r>
         <w:rPr>
@@ -8017,14 +7720,7 @@
         <w:rPr>
           <w:rFonts w:cs="Calibri"/>
         </w:rPr>
-        <w:t xml:space="preserve">Overall, the evidence suggests that Belize is at an important stage of its demographic and labour market transition. The country continues to benefit from an expanding working-age population and gradual improvements in educational attainment, both of which present opportunities to strengthen productivity, enhance labour market competitiveness and support higher long-term economic growth. At the same time, emerging structural shifts, including the ageing of the working-age population, continued rural concentration and the relatively slow pace of human capital upgrading, highlight the need for targeted policy intervention. Successfully harnessing Belize’s demographic potential will therefore depend on the country’s ability to generate sustained productive employment, deepen investments in education and skills development, </w:t>
-      </w:r>
-      <w:r>
-        <w:rPr>
-          <w:rFonts w:cs="Calibri"/>
-        </w:rPr>
-        <w:lastRenderedPageBreak/>
-        <w:t>improve labour market inclusion and facilitate the transition toward more diversified, knowledge-intensive and higher value-added economic activities.</w:t>
+        <w:t>Overall, the evidence suggests that Belize is at an important stage of its demographic and labour market transition. The country continues to benefit from an expanding working-age population and gradual improvements in educational attainment, both of which present opportunities to strengthen productivity, enhance labour market competitiveness and support higher long-term economic growth. At the same time, emerging structural shifts, including the ageing of the working-age population, continued rural concentration and the relatively slow pace of human capital upgrading, highlight the need for targeted policy intervention. Successfully harnessing Belize’s demographic potential will therefore depend on the country’s ability to generate sustained productive employment, deepen investments in education and skills development, improve labour market inclusion and facilitate the transition toward more diversified, knowledge-intensive and higher value-added economic activities.</w:t>
       </w:r>
     </w:p>
     <w:p>
@@ -10034,7 +9730,7 @@
                 <w:szCs w:val="20"/>
               </w:rPr>
             </w:pPr>
-            <w:commentRangeStart w:id="33"/>
+            <w:commentRangeStart w:id="30"/>
             <w:r>
               <w:rPr>
                 <w:rFonts w:cs="Calibri"/>
@@ -10061,7 +9757,7 @@
               </w:rPr>
               <w:t xml:space="preserve">175,944 </w:t>
             </w:r>
-            <w:commentRangeEnd w:id="33"/>
+            <w:commentRangeEnd w:id="30"/>
             <w:r>
               <w:rPr>
                 <w:rStyle w:val="CommentReference"/>
@@ -10069,7 +9765,7 @@
                 <w:sz w:val="20"/>
                 <w:szCs w:val="20"/>
               </w:rPr>
-              <w:commentReference w:id="33"/>
+              <w:commentReference w:id="30"/>
             </w:r>
           </w:p>
         </w:tc>
@@ -10234,7 +9930,7 @@
           <w:szCs w:val="24"/>
         </w:rPr>
       </w:pPr>
-      <w:commentRangeStart w:id="34"/>
+      <w:commentRangeStart w:id="31"/>
       <w:r>
         <w:rPr>
           <w:b/>
@@ -10242,10 +9938,9 @@
           <w:sz w:val="24"/>
           <w:szCs w:val="24"/>
         </w:rPr>
-        <w:lastRenderedPageBreak/>
         <w:t>Gender Participation Gap</w:t>
       </w:r>
-      <w:commentRangeEnd w:id="34"/>
+      <w:commentRangeEnd w:id="31"/>
       <w:r>
         <w:rPr>
           <w:rStyle w:val="CommentReference"/>
@@ -10254,7 +9949,7 @@
           <w:sz w:val="24"/>
           <w:szCs w:val="24"/>
         </w:rPr>
-        <w:commentReference w:id="34"/>
+        <w:commentReference w:id="31"/>
       </w:r>
     </w:p>
     <w:p>
@@ -10365,7 +10060,7 @@
           <w:szCs w:val="22"/>
         </w:rPr>
       </w:pPr>
-      <w:commentRangeStart w:id="35"/>
+      <w:commentRangeStart w:id="32"/>
       <w:r>
         <w:rPr>
           <w:b/>
@@ -10471,7 +10166,7 @@
         </w:rPr>
         <w:t>Belize: Labour Force Participation and Gender Gap</w:t>
       </w:r>
-      <w:commentRangeEnd w:id="35"/>
+      <w:commentRangeEnd w:id="32"/>
       <w:r>
         <w:rPr>
           <w:rStyle w:val="CommentReference"/>
@@ -10482,7 +10177,7 @@
           <w:sz w:val="22"/>
           <w:szCs w:val="22"/>
         </w:rPr>
-        <w:commentReference w:id="35"/>
+        <w:commentReference w:id="32"/>
       </w:r>
     </w:p>
     <w:p>
@@ -10599,23 +10294,16 @@
         <w:rPr>
           <w:rFonts w:cs="Calibri"/>
         </w:rPr>
-        <w:t xml:space="preserve">The persistence of this participation gap points to the existence of structural barriers limiting women’s attachment to the labour market. These barriers may include unpaid care and </w:t>
-      </w:r>
-      <w:r>
-        <w:rPr>
-          <w:rFonts w:cs="Calibri"/>
-        </w:rPr>
-        <w:lastRenderedPageBreak/>
-        <w:t xml:space="preserve">domestic responsibilities, transportation limitations, </w:t>
-      </w:r>
-      <w:commentRangeStart w:id="36"/>
+        <w:t xml:space="preserve">The persistence of this participation gap points to the existence of structural barriers limiting women’s attachment to the labour market. These barriers may include unpaid care and domestic responsibilities, transportation limitations, </w:t>
+      </w:r>
+      <w:commentRangeStart w:id="33"/>
       <w:r>
         <w:rPr>
           <w:rFonts w:cs="Calibri"/>
         </w:rPr>
         <w:t xml:space="preserve">occupational segregation, </w:t>
       </w:r>
-      <w:commentRangeEnd w:id="36"/>
+      <w:commentRangeEnd w:id="33"/>
       <w:r>
         <w:rPr>
           <w:rStyle w:val="CommentReference"/>
@@ -10623,7 +10311,7 @@
           <w:sz w:val="22"/>
           <w:szCs w:val="22"/>
         </w:rPr>
-        <w:commentReference w:id="36"/>
+        <w:commentReference w:id="33"/>
       </w:r>
       <w:r>
         <w:rPr>
@@ -10889,14 +10577,7 @@
         <w:rPr>
           <w:rFonts w:cs="Calibri"/>
         </w:rPr>
-        <w:t xml:space="preserve">These constraints likely </w:t>
-      </w:r>
-      <w:r>
-        <w:rPr>
-          <w:rFonts w:cs="Calibri"/>
-        </w:rPr>
-        <w:lastRenderedPageBreak/>
-        <w:t>contribute to lower female labour force participation and higher levels of labour market inactivity among women, particularly mothers.</w:t>
+        <w:t>These constraints likely contribute to lower female labour force participation and higher levels of labour market inactivity among women, particularly mothers.</w:t>
       </w:r>
     </w:p>
     <w:p>
@@ -11102,7 +10783,6 @@
         <w:rPr>
           <w:rFonts w:cs="Calibri"/>
         </w:rPr>
-        <w:lastRenderedPageBreak/>
         <w:t xml:space="preserve">From 2021 onward, Belize experienced a gradual but sustained labour market recovery. The most noticeable feature of this recovery was the rapid expansion of adequately employed persons. </w:t>
       </w:r>
       <w:r>
@@ -11375,7 +11055,6 @@
         <w:rPr>
           <w:rFonts w:cs="Calibri"/>
         </w:rPr>
-        <w:lastRenderedPageBreak/>
         <w:t xml:space="preserve">Despite the improvements noted in labour utilization conditions, the findings should be interpreted alongside the broader demographic trends affecting the labour market. Although employment quality improved and labour underutilization declined, labour force participation rates remain below </w:t>
       </w:r>
       <w:r>
@@ -11519,7 +11198,6 @@
         <w:rPr>
           <w:rFonts w:cs="Calibri"/>
         </w:rPr>
-        <w:lastRenderedPageBreak/>
         <w:t xml:space="preserve">The growth of these activities may indicate the gradual emergence of a more diversified urban services economy, particularly among younger workers and secondary urban centres. However, the absence of more granular labour market data constrains a precise assessment of the extent to which BPO, and other modern service industries are driving this trend. This points to an important data and policy gap within Belize’s labour market monitoring framework, particularly given the growing importance of non-traditional services </w:t>
       </w:r>
       <w:r>
@@ -11751,7 +11429,6 @@
           <w:sz w:val="24"/>
           <w:szCs w:val="24"/>
         </w:rPr>
-        <w:lastRenderedPageBreak/>
         <w:t>Unemployment</w:t>
       </w:r>
       <w:r>
@@ -11821,14 +11498,14 @@
         </w:rPr>
         <w:t xml:space="preserve">The decline in labour force participation has coincided with a substantial increase in the number </w:t>
       </w:r>
-      <w:commentRangeStart w:id="37"/>
+      <w:commentRangeStart w:id="34"/>
       <w:r>
         <w:rPr>
           <w:rFonts w:cs="Calibri"/>
         </w:rPr>
         <w:t>of persons remaining outside the labour force. The economically inactive working-age population increased from 81,344 persons in September 2019, equivalent to approximately 29.9% of the working-age population, to 130,909 persons by September 2025, representing approximately 41.9% of the working-age population. Overall, the number of economically inactive persons increased by 49,565 persons between 2019 and 2025, equivalent to a cumulative increase of approximately 60.9%.</w:t>
       </w:r>
-      <w:commentRangeEnd w:id="37"/>
+      <w:commentRangeEnd w:id="34"/>
       <w:r>
         <w:rPr>
           <w:rStyle w:val="CommentReference"/>
@@ -11836,7 +11513,7 @@
           <w:sz w:val="22"/>
           <w:szCs w:val="22"/>
         </w:rPr>
-        <w:commentReference w:id="37"/>
+        <w:commentReference w:id="34"/>
       </w:r>
     </w:p>
     <w:p>
@@ -12020,7 +11697,6 @@
           <w:sz w:val="22"/>
           <w:szCs w:val="22"/>
         </w:rPr>
-        <w:lastRenderedPageBreak/>
         <w:t xml:space="preserve">Figure </w:t>
       </w:r>
       <w:r>
@@ -12106,7 +11782,7 @@
           <w:szCs w:val="22"/>
         </w:rPr>
       </w:pPr>
-      <w:commentRangeStart w:id="38"/>
+      <w:commentRangeStart w:id="35"/>
       <w:r>
         <w:rPr>
           <w:b/>
@@ -12118,7 +11794,7 @@
         </w:rPr>
         <w:t>Belize: Persons Outside the Labour Force by Sex</w:t>
       </w:r>
-      <w:commentRangeEnd w:id="38"/>
+      <w:commentRangeEnd w:id="35"/>
       <w:r>
         <w:rPr>
           <w:rStyle w:val="CommentReference"/>
@@ -12129,7 +11805,7 @@
           <w:sz w:val="22"/>
           <w:szCs w:val="22"/>
         </w:rPr>
-        <w:commentReference w:id="38"/>
+        <w:commentReference w:id="35"/>
       </w:r>
     </w:p>
     <w:p>
@@ -12218,7 +11894,7 @@
           <w:rFonts w:cs="Calibri"/>
         </w:rPr>
       </w:pPr>
-      <w:commentRangeStart w:id="39"/>
+      <w:commentRangeStart w:id="36"/>
       <w:r>
         <w:rPr>
           <w:rFonts w:cs="Calibri"/>
@@ -12246,7 +11922,7 @@
         </w:rPr>
         <w:t xml:space="preserve"> </w:t>
       </w:r>
-      <w:commentRangeEnd w:id="39"/>
+      <w:commentRangeEnd w:id="36"/>
       <w:r>
         <w:rPr>
           <w:rStyle w:val="CommentReference"/>
@@ -12254,7 +11930,7 @@
           <w:sz w:val="22"/>
           <w:szCs w:val="22"/>
         </w:rPr>
-        <w:commentReference w:id="39"/>
+        <w:commentReference w:id="36"/>
       </w:r>
       <w:r>
         <w:rPr>
@@ -12284,21 +11960,14 @@
           <w:rFonts w:cs="Calibri"/>
         </w:rPr>
       </w:pPr>
-      <w:commentRangeStart w:id="40"/>
-      <w:r>
-        <w:rPr>
-          <w:rFonts w:cs="Calibri"/>
-        </w:rPr>
-        <w:t xml:space="preserve">From a broader macroeconomic perspective, persistently high female labour force inactivity </w:t>
-      </w:r>
-      <w:r>
-        <w:rPr>
-          <w:rFonts w:cs="Calibri"/>
-        </w:rPr>
-        <w:lastRenderedPageBreak/>
-        <w:t>may constrain labour utilization, productivity growth, household income generation, and the country’s ability to fully capitalize on its demographic dividend. These findings therefore underscore the importance of policies aimed at strengthening female labour market participation through investments in childcare services, transportation infrastructure, skills development, flexible work arrangements, and broader labour market inclusion initiatives.</w:t>
-      </w:r>
-      <w:commentRangeEnd w:id="40"/>
+      <w:commentRangeStart w:id="37"/>
+      <w:r>
+        <w:rPr>
+          <w:rFonts w:cs="Calibri"/>
+        </w:rPr>
+        <w:t>From a broader macroeconomic perspective, persistently high female labour force inactivity may constrain labour utilization, productivity growth, household income generation, and the country’s ability to fully capitalize on its demographic dividend. These findings therefore underscore the importance of policies aimed at strengthening female labour market participation through investments in childcare services, transportation infrastructure, skills development, flexible work arrangements, and broader labour market inclusion initiatives.</w:t>
+      </w:r>
+      <w:commentRangeEnd w:id="37"/>
       <w:r>
         <w:rPr>
           <w:rStyle w:val="CommentReference"/>
@@ -12306,7 +11975,7 @@
           <w:sz w:val="22"/>
           <w:szCs w:val="22"/>
         </w:rPr>
-        <w:commentReference w:id="40"/>
+        <w:commentReference w:id="37"/>
       </w:r>
     </w:p>
     <w:p>
@@ -12371,7 +12040,7 @@
       </w:r>
     </w:p>
   </w:comment>
-  <w:comment w:id="2" w:author="Tommy Descartes" w:date="2026-05-11T12:40:00Z" w:initials="TD">
+  <w:comment w:id="2" w:author="Tommy Descartes" w:date="2026-05-26T12:28:00Z" w:initials="TD">
     <w:p>
       <w:pPr>
         <w:pStyle w:val="CommentText"/>
@@ -12383,20 +12052,11 @@
         <w:annotationRef/>
       </w:r>
       <w:r>
-        <w:t>Belize is 15</w:t>
-      </w:r>
-      <w:r>
-        <w:rPr>
-          <w:vertAlign w:val="superscript"/>
-        </w:rPr>
-        <w:t>th</w:t>
-      </w:r>
-      <w:r>
-        <w:t>, globally as the most tourism dependent. Between 37-41% of GDP direct and indirect contribution.</w:t>
+        <w:t>Growth accounting done in later section.</w:t>
       </w:r>
     </w:p>
   </w:comment>
-  <w:comment w:id="3" w:author="Tommy Descartes" w:date="2026-05-11T12:43:00Z" w:initials="TD">
+  <w:comment w:id="3" w:author="Tommy Descartes" w:date="2026-05-25T18:32:00Z" w:initials="TD">
     <w:p>
       <w:pPr>
         <w:pStyle w:val="CommentText"/>
@@ -12408,11 +12068,11 @@
         <w:annotationRef/>
       </w:r>
       <w:r>
-        <w:t>What share of GDP?</w:t>
+        <w:t>Graph showing the decline in the average rate of growth.</w:t>
       </w:r>
     </w:p>
   </w:comment>
-  <w:comment w:id="4" w:author="Tommy Descartes" w:date="2026-05-13T10:34:00Z" w:initials="TD">
+  <w:comment w:id="4" w:author="Tommy Descartes" w:date="2026-05-26T12:30:00Z" w:initials="TD">
     <w:p>
       <w:pPr>
         <w:pStyle w:val="CommentText"/>
@@ -12424,11 +12084,11 @@
         <w:annotationRef/>
       </w:r>
       <w:r>
-        <w:t>Impact of the Global Financial Crisis??</w:t>
+        <w:t>Panel 2 of the graph show the subsequent declines for each 5-year period.</w:t>
       </w:r>
     </w:p>
   </w:comment>
-  <w:comment w:id="5" w:author="Tommy Descartes" w:date="2026-05-25T18:32:00Z" w:initials="TD">
+  <w:comment w:id="5" w:author="Tommy Descartes" w:date="2026-05-26T14:35:00Z" w:initials="TD">
     <w:p>
       <w:pPr>
         <w:pStyle w:val="CommentText"/>
@@ -12440,11 +12100,11 @@
         <w:annotationRef/>
       </w:r>
       <w:r>
-        <w:t>Graph showing the decline in the average rate of growth.</w:t>
+        <w:t>Standardize the graph. Use gridlines throughout and ensure the x and y axis are the same size.</w:t>
       </w:r>
     </w:p>
   </w:comment>
-  <w:comment w:id="8" w:author="Tommy Descartes" w:date="2026-05-14T09:03:00Z" w:initials="TD">
+  <w:comment w:id="7" w:author="Tommy Descartes" w:date="2026-05-25T18:34:00Z" w:initials="TD">
     <w:p>
       <w:pPr>
         <w:pStyle w:val="CommentText"/>
@@ -12456,11 +12116,11 @@
         <w:annotationRef/>
       </w:r>
       <w:r>
-        <w:t>What is the size of the BPO sector?</w:t>
+        <w:t>Merge the two statements.</w:t>
       </w:r>
     </w:p>
   </w:comment>
-  <w:comment w:id="10" w:author="Tommy Descartes" w:date="2026-05-12T17:37:00Z" w:initials="TD">
+  <w:comment w:id="8" w:author="Tommy Descartes" w:date="2026-05-14T10:57:00Z" w:initials="TD">
     <w:p>
       <w:pPr>
         <w:pStyle w:val="CommentText"/>
@@ -12472,11 +12132,11 @@
         <w:annotationRef/>
       </w:r>
       <w:r>
-        <w:t>Check that data</w:t>
+        <w:t>Tourism reciepts???</w:t>
       </w:r>
     </w:p>
   </w:comment>
-  <w:comment w:id="9" w:author="Tommy Descartes" w:date="2026-05-14T11:53:00Z" w:initials="TD">
+  <w:comment w:id="9" w:author="Tommy Descartes" w:date="2026-05-15T11:54:00Z" w:initials="TD">
     <w:p>
       <w:pPr>
         <w:pStyle w:val="CommentText"/>
@@ -12488,11 +12148,11 @@
         <w:annotationRef/>
       </w:r>
       <w:r>
-        <w:t>The placement of this paragraph might need revisiting. To be included in conclusion.</w:t>
+        <w:t>Cross check with the Central Bank data...</w:t>
       </w:r>
     </w:p>
   </w:comment>
-  <w:comment w:id="11" w:author="Tommy Descartes" w:date="2026-05-25T18:34:00Z" w:initials="TD">
+  <w:comment w:id="10" w:author="Tommy Descartes" w:date="2026-05-25T18:51:00Z" w:initials="TD">
     <w:p>
       <w:pPr>
         <w:pStyle w:val="CommentText"/>
@@ -12504,11 +12164,11 @@
         <w:annotationRef/>
       </w:r>
       <w:r>
-        <w:t>Merge the two statements.</w:t>
+        <w:t>Highlight the actual data.</w:t>
       </w:r>
     </w:p>
   </w:comment>
-  <w:comment w:id="12" w:author="Tommy Descartes" w:date="2026-05-14T10:57:00Z" w:initials="TD">
+  <w:comment w:id="11" w:author="Tommy Descartes" w:date="2026-05-26T14:39:00Z" w:initials="TD">
     <w:p>
       <w:pPr>
         <w:pStyle w:val="CommentText"/>
@@ -12520,11 +12180,11 @@
         <w:annotationRef/>
       </w:r>
       <w:r>
-        <w:t>Tourism reciepts???</w:t>
+        <w:t>There is more data so we need to extend the analysis.</w:t>
       </w:r>
     </w:p>
   </w:comment>
-  <w:comment w:id="13" w:author="Tommy Descartes" w:date="2026-05-15T11:54:00Z" w:initials="TD">
+  <w:comment w:id="13" w:author="Tommy Descartes" w:date="2026-05-14T12:09:00Z" w:initials="TD">
     <w:p>
       <w:pPr>
         <w:pStyle w:val="CommentText"/>
@@ -12536,11 +12196,11 @@
         <w:annotationRef/>
       </w:r>
       <w:r>
-        <w:t>Cross check with the Central Bank data...</w:t>
+        <w:t>Include a box in the appendix.</w:t>
       </w:r>
     </w:p>
   </w:comment>
-  <w:comment w:id="14" w:author="Tommy Descartes" w:date="2026-05-25T18:51:00Z" w:initials="TD">
+  <w:comment w:id="12" w:author="Tommy Descartes" w:date="2026-05-13T11:24:00Z" w:initials="TD">
     <w:p>
       <w:pPr>
         <w:pStyle w:val="CommentText"/>
@@ -12552,11 +12212,11 @@
         <w:annotationRef/>
       </w:r>
       <w:r>
-        <w:t>Highlight the actual data.</w:t>
+        <w:t>Perhaps this section can be enhanced by including a growth decomposition section.</w:t>
       </w:r>
     </w:p>
   </w:comment>
-  <w:comment w:id="16" w:author="Tommy Descartes" w:date="2026-05-14T12:09:00Z" w:initials="TD">
+  <w:comment w:id="14" w:author="Tommy Descartes" w:date="2026-05-12T17:36:00Z" w:initials="TD">
     <w:p>
       <w:pPr>
         <w:pStyle w:val="CommentText"/>
@@ -12568,11 +12228,11 @@
         <w:annotationRef/>
       </w:r>
       <w:r>
-        <w:t>Include a box in the appendix.</w:t>
+        <w:t>The graph can be improved.</w:t>
       </w:r>
     </w:p>
   </w:comment>
-  <w:comment w:id="15" w:author="Tommy Descartes" w:date="2026-05-13T11:24:00Z" w:initials="TD">
+  <w:comment w:id="15" w:author="Tommy Descartes" w:date="2026-05-15T03:16:00Z" w:initials="TD">
     <w:p>
       <w:pPr>
         <w:pStyle w:val="CommentText"/>
@@ -12584,11 +12244,11 @@
         <w:annotationRef/>
       </w:r>
       <w:r>
-        <w:t>Perhaps this section can be enhanced by including a growth decomposition section.</w:t>
+        <w:t>Youth, Elder and Working Age population. Birth rates etc. The issue of informality...</w:t>
       </w:r>
     </w:p>
   </w:comment>
-  <w:comment w:id="17" w:author="Tommy Descartes" w:date="2026-05-12T17:36:00Z" w:initials="TD">
+  <w:comment w:id="17" w:author="Tommy Descartes" w:date="2026-05-17T18:19:00Z" w:initials="TD">
     <w:p>
       <w:pPr>
         <w:pStyle w:val="CommentText"/>
@@ -12600,11 +12260,11 @@
         <w:annotationRef/>
       </w:r>
       <w:r>
-        <w:t>The graph can be improved.</w:t>
+        <w:t>These figures are different from the Labour Force Surveys..</w:t>
       </w:r>
     </w:p>
   </w:comment>
-  <w:comment w:id="18" w:author="Tommy Descartes" w:date="2026-05-15T03:16:00Z" w:initials="TD">
+  <w:comment w:id="16" w:author="Tommy Descartes" w:date="2026-05-13T08:29:00Z" w:initials="TD">
     <w:p>
       <w:pPr>
         <w:pStyle w:val="CommentText"/>
@@ -12616,11 +12276,11 @@
         <w:annotationRef/>
       </w:r>
       <w:r>
-        <w:t>Youth, Elder and Working Age population. Birth rates etc. The issue of informality...</w:t>
+        <w:t>Have a look at the migration data….</w:t>
       </w:r>
     </w:p>
   </w:comment>
-  <w:comment w:id="20" w:author="Tommy Descartes" w:date="2026-05-17T18:19:00Z" w:initials="TD">
+  <w:comment w:id="18" w:author="Tommy Descartes" w:date="2026-05-13T17:55:00Z" w:initials="TD">
     <w:p>
       <w:pPr>
         <w:pStyle w:val="CommentText"/>
@@ -12632,11 +12292,11 @@
         <w:annotationRef/>
       </w:r>
       <w:r>
-        <w:t>These figures are different from the Labour Force Surveys..</w:t>
+        <w:t>Urbanization and migration trends. Also population density</w:t>
       </w:r>
     </w:p>
   </w:comment>
-  <w:comment w:id="19" w:author="Tommy Descartes" w:date="2026-05-13T08:29:00Z" w:initials="TD">
+  <w:comment w:id="19" w:author="Tommy Descartes" w:date="2026-05-14T13:55:00Z" w:initials="TD">
     <w:p>
       <w:pPr>
         <w:pStyle w:val="CommentText"/>
@@ -12648,11 +12308,11 @@
         <w:annotationRef/>
       </w:r>
       <w:r>
-        <w:t>Have a look at the migration data….</w:t>
+        <w:t>Verify if this is the correct terminology used to refer to Belize.</w:t>
       </w:r>
     </w:p>
   </w:comment>
-  <w:comment w:id="21" w:author="Tommy Descartes" w:date="2026-05-13T17:55:00Z" w:initials="TD">
+  <w:comment w:id="20" w:author="Tommy Descartes" w:date="2026-05-25T19:05:00Z" w:initials="TD">
     <w:p>
       <w:pPr>
         <w:pStyle w:val="CommentText"/>
@@ -12664,11 +12324,11 @@
         <w:annotationRef/>
       </w:r>
       <w:r>
-        <w:t>Urbanization and migration trends. Also population density</w:t>
+        <w:t>Population density.</w:t>
       </w:r>
     </w:p>
   </w:comment>
-  <w:comment w:id="22" w:author="Tommy Descartes" w:date="2026-05-14T13:55:00Z" w:initials="TD">
+  <w:comment w:id="21" w:author="Tommy Descartes" w:date="2026-05-25T19:06:00Z" w:initials="TD">
     <w:p>
       <w:pPr>
         <w:pStyle w:val="CommentText"/>
@@ -12680,11 +12340,11 @@
         <w:annotationRef/>
       </w:r>
       <w:r>
-        <w:t>Verify if this is the correct terminology used to refer to Belize.</w:t>
+        <w:t>Land availability and cost of housing???</w:t>
       </w:r>
     </w:p>
   </w:comment>
-  <w:comment w:id="23" w:author="Tommy Descartes" w:date="2026-05-25T19:05:00Z" w:initials="TD">
+  <w:comment w:id="22" w:author="Tommy Descartes" w:date="2026-05-13T10:07:00Z" w:initials="TD">
     <w:p>
       <w:pPr>
         <w:pStyle w:val="CommentText"/>
@@ -12696,11 +12356,11 @@
         <w:annotationRef/>
       </w:r>
       <w:r>
-        <w:t>Population density.</w:t>
+        <w:t>The environmental pressures.</w:t>
       </w:r>
     </w:p>
   </w:comment>
-  <w:comment w:id="24" w:author="Tommy Descartes" w:date="2026-05-25T19:06:00Z" w:initials="TD">
+  <w:comment w:id="23" w:author="Tommy Descartes" w:date="2026-05-15T03:10:00Z" w:initials="TD">
     <w:p>
       <w:pPr>
         <w:pStyle w:val="CommentText"/>
@@ -12712,11 +12372,11 @@
         <w:annotationRef/>
       </w:r>
       <w:r>
-        <w:t>Land availability and cost of housing???</w:t>
+        <w:t>Need to elaborate on this more - Lower dependency ratios means more workers relative to dependents (Social Security), higher savings potential and stronger growth opportunity...</w:t>
       </w:r>
     </w:p>
   </w:comment>
-  <w:comment w:id="25" w:author="Tommy Descartes" w:date="2026-05-13T10:07:00Z" w:initials="TD">
+  <w:comment w:id="24" w:author="Tommy Descartes" w:date="2026-05-13T08:23:00Z" w:initials="TD">
     <w:p>
       <w:pPr>
         <w:pStyle w:val="CommentText"/>
@@ -12728,11 +12388,11 @@
         <w:annotationRef/>
       </w:r>
       <w:r>
-        <w:t>The environmental pressures.</w:t>
+        <w:t>I can compare this with 2015.</w:t>
       </w:r>
     </w:p>
   </w:comment>
-  <w:comment w:id="26" w:author="Tommy Descartes" w:date="2026-05-15T03:10:00Z" w:initials="TD">
+  <w:comment w:id="25" w:author="Tommy Descartes" w:date="2026-05-15T03:20:00Z" w:initials="TD">
     <w:p>
       <w:pPr>
         <w:pStyle w:val="CommentText"/>
@@ -12744,11 +12404,11 @@
         <w:annotationRef/>
       </w:r>
       <w:r>
-        <w:t>Need to elaborate on this more - Lower dependency ratios means more workers relative to dependents (Social Security), higher savings potential and stronger growth opportunity...</w:t>
+        <w:t>Need to speak about youth, children and elderly population as well.</w:t>
       </w:r>
     </w:p>
   </w:comment>
-  <w:comment w:id="27" w:author="Tommy Descartes" w:date="2026-05-13T08:23:00Z" w:initials="TD">
+  <w:comment w:id="26" w:author="Tommy Descartes" w:date="2026-05-25T19:20:00Z" w:initials="TD">
     <w:p>
       <w:pPr>
         <w:pStyle w:val="CommentText"/>
@@ -12760,11 +12420,11 @@
         <w:annotationRef/>
       </w:r>
       <w:r>
-        <w:t>I can compare this with 2015.</w:t>
+        <w:t>Go back further. 10 year averages stack bar.</w:t>
       </w:r>
     </w:p>
   </w:comment>
-  <w:comment w:id="28" w:author="Tommy Descartes" w:date="2026-05-15T03:20:00Z" w:initials="TD">
+  <w:comment w:id="27" w:author="Tommy Descartes" w:date="2026-05-15T11:29:00Z" w:initials="TD">
     <w:p>
       <w:pPr>
         <w:pStyle w:val="CommentText"/>
@@ -12776,11 +12436,11 @@
         <w:annotationRef/>
       </w:r>
       <w:r>
-        <w:t>Need to speak about youth, children and elderly population as well.</w:t>
+        <w:t>Possibly temporary workers from neighboring Central American countries.</w:t>
       </w:r>
     </w:p>
   </w:comment>
-  <w:comment w:id="29" w:author="Tommy Descartes" w:date="2026-05-25T19:20:00Z" w:initials="TD">
+  <w:comment w:id="28" w:author="Tommy Descartes" w:date="2026-05-17T18:31:00Z" w:initials="TD">
     <w:p>
       <w:pPr>
         <w:pStyle w:val="CommentText"/>
@@ -12792,11 +12452,24 @@
         <w:annotationRef/>
       </w:r>
       <w:r>
-        <w:t>Go back further. 10 year averages stack bar.</w:t>
+        <w:t>There is a substantial female labour market participation gap. This disguises the size of the labour force etc,,,, Also Female NEETS is a huge problem.</w:t>
+      </w:r>
+    </w:p>
+    <w:p>
+      <w:pPr>
+        <w:pStyle w:val="CommentText"/>
+      </w:pPr>
+    </w:p>
+    <w:p>
+      <w:pPr>
+        <w:pStyle w:val="CommentText"/>
+      </w:pPr>
+      <w:r>
+        <w:t>Childcare policy, transport, flexible work, parental leave, skills mismatch, female entrenpreneurship</w:t>
       </w:r>
     </w:p>
   </w:comment>
-  <w:comment w:id="30" w:author="Tommy Descartes" w:date="2026-05-15T11:29:00Z" w:initials="TD">
+  <w:comment w:id="29" w:author="Tommy Descartes" w:date="2026-05-25T19:29:00Z" w:initials="TD">
     <w:p>
       <w:pPr>
         <w:pStyle w:val="CommentText"/>
@@ -12808,11 +12481,11 @@
         <w:annotationRef/>
       </w:r>
       <w:r>
-        <w:t>Possibly temporary workers from neighboring Central American countries.</w:t>
+        <w:t>Place under Migration section.</w:t>
       </w:r>
     </w:p>
   </w:comment>
-  <w:comment w:id="31" w:author="Tommy Descartes" w:date="2026-05-17T18:31:00Z" w:initials="TD">
+  <w:comment w:id="30" w:author="Tommy Descartes" w:date="2026-05-19T17:04:00Z" w:initials="TD">
     <w:p>
       <w:pPr>
         <w:pStyle w:val="CommentText"/>
@@ -12824,24 +12497,43 @@
         <w:annotationRef/>
       </w:r>
       <w:r>
-        <w:t>There is a substantial female labour market participation gap. This disguises the size of the labour force etc,,,, Also Female NEETS is a huge problem.</w:t>
-      </w:r>
-    </w:p>
+        <w:t>Not sure if I should use this data. Data for 2025 was retrieved from the Central Bank of Belize Annual Report.</w:t>
+      </w:r>
+    </w:p>
+  </w:comment>
+  <w:comment w:id="31" w:author="Tommy Descartes" w:date="2026-05-23T07:25:00Z" w:initials="TD">
     <w:p>
       <w:pPr>
         <w:pStyle w:val="CommentText"/>
       </w:pPr>
-    </w:p>
+      <w:r>
+        <w:rPr>
+          <w:rStyle w:val="CommentReference"/>
+        </w:rPr>
+        <w:annotationRef/>
+      </w:r>
+      <w:r>
+        <w:t>Gender response tax policy??</w:t>
+      </w:r>
+    </w:p>
+  </w:comment>
+  <w:comment w:id="32" w:author="Tommy Descartes" w:date="2026-05-23T07:32:00Z" w:initials="TD">
     <w:p>
       <w:pPr>
         <w:pStyle w:val="CommentText"/>
       </w:pPr>
       <w:r>
-        <w:t>Childcare policy, transport, flexible work, parental leave, skills mismatch, female entrenpreneurship</w:t>
+        <w:rPr>
+          <w:rStyle w:val="CommentReference"/>
+        </w:rPr>
+        <w:annotationRef/>
+      </w:r>
+      <w:r>
+        <w:t>Perhaps a Male Vs Female over the different education cohorts and age groups</w:t>
       </w:r>
     </w:p>
   </w:comment>
-  <w:comment w:id="32" w:author="Tommy Descartes" w:date="2026-05-25T19:29:00Z" w:initials="TD">
+  <w:comment w:id="33" w:author="Tommy Descartes" w:date="2026-05-25T19:35:00Z" w:initials="TD">
     <w:p>
       <w:pPr>
         <w:pStyle w:val="CommentText"/>
@@ -12853,11 +12545,11 @@
         <w:annotationRef/>
       </w:r>
       <w:r>
-        <w:t>Place under Migration section.</w:t>
+        <w:t>Legislation speaking to where women can work. Mining sector.</w:t>
       </w:r>
     </w:p>
   </w:comment>
-  <w:comment w:id="33" w:author="Tommy Descartes" w:date="2026-05-19T17:04:00Z" w:initials="TD">
+  <w:comment w:id="34" w:author="Tommy Descartes" w:date="2026-05-20T17:53:00Z" w:initials="TD">
     <w:p>
       <w:pPr>
         <w:pStyle w:val="CommentText"/>
@@ -12869,11 +12561,11 @@
         <w:annotationRef/>
       </w:r>
       <w:r>
-        <w:t>Not sure if I should use this data. Data for 2025 was retrieved from the Central Bank of Belize Annual Report.</w:t>
+        <w:t>Are persons discouraged. Childcare, transportation cost, inflation etc.</w:t>
       </w:r>
     </w:p>
   </w:comment>
-  <w:comment w:id="34" w:author="Tommy Descartes" w:date="2026-05-23T07:25:00Z" w:initials="TD">
+  <w:comment w:id="35" w:author="Tommy Descartes" w:date="2026-05-20T19:07:00Z" w:initials="TD">
     <w:p>
       <w:pPr>
         <w:pStyle w:val="CommentText"/>
@@ -12885,11 +12577,11 @@
         <w:annotationRef/>
       </w:r>
       <w:r>
-        <w:t>Gender response tax policy??</w:t>
+        <w:t>The graph might need refining.</w:t>
       </w:r>
     </w:p>
   </w:comment>
-  <w:comment w:id="35" w:author="Tommy Descartes" w:date="2026-05-23T07:32:00Z" w:initials="TD">
+  <w:comment w:id="36" w:author="Tommy Descartes" w:date="2026-05-20T18:28:00Z" w:initials="TD">
     <w:p>
       <w:pPr>
         <w:pStyle w:val="CommentText"/>
@@ -12901,75 +12593,11 @@
         <w:annotationRef/>
       </w:r>
       <w:r>
-        <w:t>Perhaps a Male Vs Female over the different education cohorts and age groups</w:t>
+        <w:t>Duplication</w:t>
       </w:r>
     </w:p>
   </w:comment>
-  <w:comment w:id="36" w:author="Tommy Descartes" w:date="2026-05-25T19:35:00Z" w:initials="TD">
-    <w:p>
-      <w:pPr>
-        <w:pStyle w:val="CommentText"/>
-      </w:pPr>
-      <w:r>
-        <w:rPr>
-          <w:rStyle w:val="CommentReference"/>
-        </w:rPr>
-        <w:annotationRef/>
-      </w:r>
-      <w:r>
-        <w:t>Legislation speaking to where women can work. Mining sector.</w:t>
-      </w:r>
-    </w:p>
-  </w:comment>
-  <w:comment w:id="37" w:author="Tommy Descartes" w:date="2026-05-20T17:53:00Z" w:initials="TD">
-    <w:p>
-      <w:pPr>
-        <w:pStyle w:val="CommentText"/>
-      </w:pPr>
-      <w:r>
-        <w:rPr>
-          <w:rStyle w:val="CommentReference"/>
-        </w:rPr>
-        <w:annotationRef/>
-      </w:r>
-      <w:r>
-        <w:t>Are persons discouraged. Childcare, transportation cost, inflation etc.</w:t>
-      </w:r>
-    </w:p>
-  </w:comment>
-  <w:comment w:id="38" w:author="Tommy Descartes" w:date="2026-05-20T19:07:00Z" w:initials="TD">
-    <w:p>
-      <w:pPr>
-        <w:pStyle w:val="CommentText"/>
-      </w:pPr>
-      <w:r>
-        <w:rPr>
-          <w:rStyle w:val="CommentReference"/>
-        </w:rPr>
-        <w:annotationRef/>
-      </w:r>
-      <w:r>
-        <w:t>The graph might need refining.</w:t>
-      </w:r>
-    </w:p>
-  </w:comment>
-  <w:comment w:id="39" w:author="Tommy Descartes" w:date="2026-05-20T18:28:00Z" w:initials="TD">
-    <w:p>
-      <w:pPr>
-        <w:pStyle w:val="CommentText"/>
-      </w:pPr>
-      <w:r>
-        <w:rPr>
-          <w:rStyle w:val="CommentReference"/>
-        </w:rPr>
-        <w:annotationRef/>
-      </w:r>
-      <w:r>
-        <w:t>Duplication</w:t>
-      </w:r>
-    </w:p>
-  </w:comment>
-  <w:comment w:id="40" w:author="Tommy Descartes" w:date="2026-05-20T18:29:00Z" w:initials="TD">
+  <w:comment w:id="37" w:author="Tommy Descartes" w:date="2026-05-20T18:29:00Z" w:initials="TD">
     <w:p>
       <w:pPr>
         <w:pStyle w:val="CommentText"/>
@@ -12990,18 +12618,16 @@
 
 <file path=word/commentsExtended.xml><?xml version="1.0" encoding="utf-8"?>
 <w15:commentsEx xmlns:wpc="http://schemas.microsoft.com/office/word/2010/wordprocessingCanvas" xmlns:cx="http://schemas.microsoft.com/office/drawing/2014/chartex" xmlns:cx1="http://schemas.microsoft.com/office/drawing/2015/9/8/chartex" xmlns:cx2="http://schemas.microsoft.com/office/drawing/2015/10/21/chartex" xmlns:cx3="http://schemas.microsoft.com/office/drawing/2016/5/9/chartex" xmlns:cx4="http://schemas.microsoft.com/office/drawing/2016/5/10/chartex" xmlns:cx5="http://schemas.microsoft.com/office/drawing/2016/5/11/chartex" xmlns:cx6="http://schemas.microsoft.com/office/drawing/2016/5/12/chartex" xmlns:cx7="http://schemas.microsoft.com/office/drawing/2016/5/13/chartex" xmlns:cx8="http://schemas.microsoft.com/office/drawing/2016/5/14/chartex" xmlns:mc="http://schemas.openxmlformats.org/markup-compatibility/2006" xmlns:aink="http://schemas.microsoft.com/office/drawing/2016/ink" xmlns:am3d="http://schemas.microsoft.com/office/drawing/2017/model3d" xmlns:o="urn:schemas-microsoft-com:office:office" xmlns:oel="http://schemas.microsoft.com/office/2019/extlst" xmlns:r="http://schemas.openxmlformats.org/officeDocument/2006/relationships" xmlns:m="http://schemas.openxmlformats.org/officeDocument/2006/math" xmlns:v="urn:schemas-microsoft-com:vml" xmlns:wp14="http://schemas.microsoft.com/office/word/2010/wordprocessingDrawing" xmlns:wp="http://schemas.openxmlformats.org/drawingml/2006/wordprocessingDrawing" xmlns:w10="urn:schemas-microsoft-com:office:word" xmlns:w="http://schemas.openxmlformats.org/wordprocessingml/2006/main" xmlns:w14="http://schemas.microsoft.com/office/word/2010/wordml" xmlns:w15="http://schemas.microsoft.com/office/word/2012/wordml" xmlns:w16cex="http://schemas.microsoft.com/office/word/2018/wordml/cex" xmlns:w16cid="http://schemas.microsoft.com/office/word/2016/wordml/cid" xmlns:w16="http://schemas.microsoft.com/office/word/2018/wordml" xmlns:w16du="http://schemas.microsoft.com/office/word/2023/wordml/word16du" xmlns:w16sdtdh="http://schemas.microsoft.com/office/word/2020/wordml/sdtdatahash" xmlns:w16sdtfl="http://schemas.microsoft.com/office/word/2024/wordml/sdtformatlock" xmlns:w16se="http://schemas.microsoft.com/office/word/2015/wordml/symex" xmlns:wpg="http://schemas.microsoft.com/office/word/2010/wordprocessingGroup" xmlns:wpi="http://schemas.microsoft.com/office/word/2010/wordprocessingInk" xmlns:wne="http://schemas.microsoft.com/office/word/2006/wordml" xmlns:wps="http://schemas.microsoft.com/office/word/2010/wordprocessingShape" mc:Ignorable="w14 w15 w16se w16cid w16 w16cex w16sdtdh w16sdtfl w16du wp14">
-  <w15:commentEx w15:paraId="73CAF0F2" w15:done="0"/>
-  <w15:commentEx w15:paraId="4F067995" w15:done="0"/>
-  <w15:commentEx w15:paraId="4673304E" w15:done="0"/>
-  <w15:commentEx w15:paraId="59B6C6D4" w15:done="0"/>
-  <w15:commentEx w15:paraId="0B25D766" w15:done="0"/>
-  <w15:commentEx w15:paraId="38C9AEF5" w15:done="0"/>
-  <w15:commentEx w15:paraId="33992B8E" w15:done="0"/>
-  <w15:commentEx w15:paraId="1E3A8FC0" w15:done="0"/>
+  <w15:commentEx w15:paraId="73CAF0F2" w15:done="1"/>
+  <w15:commentEx w15:paraId="37F57F38" w15:paraIdParent="73CAF0F2" w15:done="1"/>
+  <w15:commentEx w15:paraId="4A1F1C3A" w15:done="1"/>
+  <w15:commentEx w15:paraId="268AB0B1" w15:paraIdParent="4A1F1C3A" w15:done="1"/>
+  <w15:commentEx w15:paraId="16217E3D" w15:done="0"/>
   <w15:commentEx w15:paraId="4B039DE5" w15:done="0"/>
   <w15:commentEx w15:paraId="5DD58FC9" w15:done="0"/>
   <w15:commentEx w15:paraId="5E6AA443" w15:done="0"/>
   <w15:commentEx w15:paraId="11DFEF63" w15:done="0"/>
+  <w15:commentEx w15:paraId="2BEE9AF9" w15:done="0"/>
   <w15:commentEx w15:paraId="7D48D290" w15:done="0"/>
   <w15:commentEx w15:paraId="335D8CAF" w15:done="0"/>
   <w15:commentEx w15:paraId="086B81C9" w15:done="0"/>
@@ -13034,17 +12660,15 @@
 <file path=word/commentsExtensible.xml><?xml version="1.0" encoding="utf-8"?>
 <w16cex:commentsExtensible xmlns:wpc="http://schemas.microsoft.com/office/word/2010/wordprocessingCanvas" xmlns:cx="http://schemas.microsoft.com/office/drawing/2014/chartex" xmlns:cx1="http://schemas.microsoft.com/office/drawing/2015/9/8/chartex" xmlns:cx2="http://schemas.microsoft.com/office/drawing/2015/10/21/chartex" xmlns:cx3="http://schemas.microsoft.com/office/drawing/2016/5/9/chartex" xmlns:cx4="http://schemas.microsoft.com/office/drawing/2016/5/10/chartex" xmlns:cx5="http://schemas.microsoft.com/office/drawing/2016/5/11/chartex" xmlns:cx6="http://schemas.microsoft.com/office/drawing/2016/5/12/chartex" xmlns:cx7="http://schemas.microsoft.com/office/drawing/2016/5/13/chartex" xmlns:cx8="http://schemas.microsoft.com/office/drawing/2016/5/14/chartex" xmlns:cr="http://schemas.microsoft.com/office/comments/2020/reactions" xmlns:mc="http://schemas.openxmlformats.org/markup-compatibility/2006" xmlns:aink="http://schemas.microsoft.com/office/drawing/2016/ink" xmlns:am3d="http://schemas.microsoft.com/office/drawing/2017/model3d" xmlns:o="urn:schemas-microsoft-com:office:office" xmlns:oel="http://schemas.microsoft.com/office/2019/extlst" xmlns:r="http://schemas.openxmlformats.org/officeDocument/2006/relationships" xmlns:m="http://schemas.openxmlformats.org/officeDocument/2006/math" xmlns:v="urn:schemas-microsoft-com:vml" xmlns:wp14="http://schemas.microsoft.com/office/word/2010/wordprocessingDrawing" xmlns:wp="http://schemas.openxmlformats.org/drawingml/2006/wordprocessingDrawing" xmlns:w10="urn:schemas-microsoft-com:office:word" xmlns:w="http://schemas.openxmlformats.org/wordprocessingml/2006/main" xmlns:w14="http://schemas.microsoft.com/office/word/2010/wordml" xmlns:w15="http://schemas.microsoft.com/office/word/2012/wordml" xmlns:w16cex="http://schemas.microsoft.com/office/word/2018/wordml/cex" xmlns:w16cid="http://schemas.microsoft.com/office/word/2016/wordml/cid" xmlns:w16="http://schemas.microsoft.com/office/word/2018/wordml" xmlns:w16du="http://schemas.microsoft.com/office/word/2023/wordml/word16du" xmlns:w16sdtdh="http://schemas.microsoft.com/office/word/2020/wordml/sdtdatahash" xmlns:w16sdtfl="http://schemas.microsoft.com/office/word/2024/wordml/sdtformatlock" xmlns:w16se="http://schemas.microsoft.com/office/word/2015/wordml/symex" xmlns:wpg="http://schemas.microsoft.com/office/word/2010/wordprocessingGroup" xmlns:wpi="http://schemas.microsoft.com/office/word/2010/wordprocessingInk" xmlns:wne="http://schemas.microsoft.com/office/word/2006/wordml" xmlns:wps="http://schemas.microsoft.com/office/word/2010/wordprocessingShape" mc:Ignorable="w14 w15 w16se w16cid w16 w16cex w16sdtdh w16sdtfl cr w16du wp14">
   <w16cex:commentExtensible w16cex:durableId="0F55614F" w16cex:dateUtc="2026-05-15T06:12:00Z"/>
-  <w16cex:commentExtensible w16cex:durableId="764F7533" w16cex:dateUtc="2026-05-11T16:40:00Z"/>
-  <w16cex:commentExtensible w16cex:durableId="7FC9FE16" w16cex:dateUtc="2026-05-11T16:43:00Z"/>
-  <w16cex:commentExtensible w16cex:durableId="17C0BA7D" w16cex:dateUtc="2026-05-13T14:34:00Z"/>
-  <w16cex:commentExtensible w16cex:durableId="4D7FFDBE" w16cex:dateUtc="2026-05-25T22:32:00Z"/>
-  <w16cex:commentExtensible w16cex:durableId="4C6AD29A" w16cex:dateUtc="2026-05-14T13:03:00Z"/>
-  <w16cex:commentExtensible w16cex:durableId="72A658A1" w16cex:dateUtc="2026-05-12T21:37:00Z"/>
-  <w16cex:commentExtensible w16cex:durableId="2D64DFC0" w16cex:dateUtc="2026-05-14T15:53:00Z"/>
+  <w16cex:commentExtensible w16cex:durableId="63217AA1" w16cex:dateUtc="2026-05-26T16:28:00Z"/>
+  <w16cex:commentExtensible w16cex:durableId="06F44358" w16cex:dateUtc="2026-05-25T22:32:00Z"/>
+  <w16cex:commentExtensible w16cex:durableId="2D6C133C" w16cex:dateUtc="2026-05-26T16:30:00Z"/>
+  <w16cex:commentExtensible w16cex:durableId="5A68A107" w16cex:dateUtc="2026-05-26T18:35:00Z"/>
   <w16cex:commentExtensible w16cex:durableId="48D25A13" w16cex:dateUtc="2026-05-25T22:34:00Z"/>
   <w16cex:commentExtensible w16cex:durableId="5FE2D6ED" w16cex:dateUtc="2026-05-14T14:57:00Z"/>
   <w16cex:commentExtensible w16cex:durableId="7ED5E3AA" w16cex:dateUtc="2026-05-15T15:54:00Z"/>
   <w16cex:commentExtensible w16cex:durableId="41FB9971" w16cex:dateUtc="2026-05-25T22:51:00Z"/>
+  <w16cex:commentExtensible w16cex:durableId="57ED9B36" w16cex:dateUtc="2026-05-26T18:39:00Z"/>
   <w16cex:commentExtensible w16cex:durableId="59DF5604" w16cex:dateUtc="2026-05-14T16:09:00Z"/>
   <w16cex:commentExtensible w16cex:durableId="6FB79063" w16cex:dateUtc="2026-05-13T15:24:00Z"/>
   <w16cex:commentExtensible w16cex:durableId="7B05876B" w16cex:dateUtc="2026-05-12T21:36:00Z"/>
@@ -13077,17 +12701,15 @@
 <file path=word/commentsIds.xml><?xml version="1.0" encoding="utf-8"?>
 <w16cid:commentsIds xmlns:wpc="http://schemas.microsoft.com/office/word/2010/wordprocessingCanvas" xmlns:cx="http://schemas.microsoft.com/office/drawing/2014/chartex" xmlns:cx1="http://schemas.microsoft.com/office/drawing/2015/9/8/chartex" xmlns:cx2="http://schemas.microsoft.com/office/drawing/2015/10/21/chartex" xmlns:cx3="http://schemas.microsoft.com/office/drawing/2016/5/9/chartex" xmlns:cx4="http://schemas.microsoft.com/office/drawing/2016/5/10/chartex" xmlns:cx5="http://schemas.microsoft.com/office/drawing/2016/5/11/chartex" xmlns:cx6="http://schemas.microsoft.com/office/drawing/2016/5/12/chartex" xmlns:cx7="http://schemas.microsoft.com/office/drawing/2016/5/13/chartex" xmlns:cx8="http://schemas.microsoft.com/office/drawing/2016/5/14/chartex" xmlns:mc="http://schemas.openxmlformats.org/markup-compatibility/2006" xmlns:aink="http://schemas.microsoft.com/office/drawing/2016/ink" xmlns:am3d="http://schemas.microsoft.com/office/drawing/2017/model3d" xmlns:o="urn:schemas-microsoft-com:office:office" xmlns:oel="http://schemas.microsoft.com/office/2019/extlst" xmlns:r="http://schemas.openxmlformats.org/officeDocument/2006/relationships" xmlns:m="http://schemas.openxmlformats.org/officeDocument/2006/math" xmlns:v="urn:schemas-microsoft-com:vml" xmlns:wp14="http://schemas.microsoft.com/office/word/2010/wordprocessingDrawing" xmlns:wp="http://schemas.openxmlformats.org/drawingml/2006/wordprocessingDrawing" xmlns:w10="urn:schemas-microsoft-com:office:word" xmlns:w="http://schemas.openxmlformats.org/wordprocessingml/2006/main" xmlns:w14="http://schemas.microsoft.com/office/word/2010/wordml" xmlns:w15="http://schemas.microsoft.com/office/word/2012/wordml" xmlns:w16cex="http://schemas.microsoft.com/office/word/2018/wordml/cex" xmlns:w16cid="http://schemas.microsoft.com/office/word/2016/wordml/cid" xmlns:w16="http://schemas.microsoft.com/office/word/2018/wordml" xmlns:w16du="http://schemas.microsoft.com/office/word/2023/wordml/word16du" xmlns:w16sdtdh="http://schemas.microsoft.com/office/word/2020/wordml/sdtdatahash" xmlns:w16sdtfl="http://schemas.microsoft.com/office/word/2024/wordml/sdtformatlock" xmlns:w16se="http://schemas.microsoft.com/office/word/2015/wordml/symex" xmlns:wpg="http://schemas.microsoft.com/office/word/2010/wordprocessingGroup" xmlns:wpi="http://schemas.microsoft.com/office/word/2010/wordprocessingInk" xmlns:wne="http://schemas.microsoft.com/office/word/2006/wordml" xmlns:wps="http://schemas.microsoft.com/office/word/2010/wordprocessingShape" mc:Ignorable="w14 w15 w16se w16cid w16 w16cex w16sdtdh w16sdtfl w16du wp14">
   <w16cid:commentId w16cid:paraId="73CAF0F2" w16cid:durableId="0F55614F"/>
-  <w16cid:commentId w16cid:paraId="4F067995" w16cid:durableId="764F7533"/>
-  <w16cid:commentId w16cid:paraId="4673304E" w16cid:durableId="7FC9FE16"/>
-  <w16cid:commentId w16cid:paraId="59B6C6D4" w16cid:durableId="17C0BA7D"/>
-  <w16cid:commentId w16cid:paraId="0B25D766" w16cid:durableId="4D7FFDBE"/>
-  <w16cid:commentId w16cid:paraId="38C9AEF5" w16cid:durableId="4C6AD29A"/>
-  <w16cid:commentId w16cid:paraId="33992B8E" w16cid:durableId="72A658A1"/>
-  <w16cid:commentId w16cid:paraId="1E3A8FC0" w16cid:durableId="2D64DFC0"/>
+  <w16cid:commentId w16cid:paraId="37F57F38" w16cid:durableId="63217AA1"/>
+  <w16cid:commentId w16cid:paraId="4A1F1C3A" w16cid:durableId="06F44358"/>
+  <w16cid:commentId w16cid:paraId="268AB0B1" w16cid:durableId="2D6C133C"/>
+  <w16cid:commentId w16cid:paraId="16217E3D" w16cid:durableId="5A68A107"/>
   <w16cid:commentId w16cid:paraId="4B039DE5" w16cid:durableId="48D25A13"/>
   <w16cid:commentId w16cid:paraId="5DD58FC9" w16cid:durableId="5FE2D6ED"/>
   <w16cid:commentId w16cid:paraId="5E6AA443" w16cid:durableId="7ED5E3AA"/>
   <w16cid:commentId w16cid:paraId="11DFEF63" w16cid:durableId="41FB9971"/>
+  <w16cid:commentId w16cid:paraId="2BEE9AF9" w16cid:durableId="57ED9B36"/>
   <w16cid:commentId w16cid:paraId="7D48D290" w16cid:durableId="59DF5604"/>
   <w16cid:commentId w16cid:paraId="335D8CAF" w16cid:durableId="6FB79063"/>
   <w16cid:commentId w16cid:paraId="086B81C9" w16cid:durableId="7B05876B"/>
@@ -13237,6 +12859,40 @@
       <w:r>
         <w:rPr>
           <w:rStyle w:val="FootnoteReference"/>
+        </w:rPr>
+        <w:footnoteRef/>
+      </w:r>
+      <w:r>
+        <w:t xml:space="preserve"> International Monetary Fund Article IV Staff Report 2025.</w:t>
+      </w:r>
+    </w:p>
+  </w:footnote>
+  <w:footnote w:id="3">
+    <w:p>
+      <w:pPr>
+        <w:pStyle w:val="FootnoteText"/>
+        <w:jc w:val="both"/>
+      </w:pPr>
+      <w:r>
+        <w:rPr>
+          <w:rStyle w:val="FootnoteReference"/>
+        </w:rPr>
+        <w:footnoteRef/>
+      </w:r>
+      <w:r>
+        <w:t xml:space="preserve"> According to the Office of the Prime Minister and the Ministry of Investment, Belize’s BPO sector is estimated to employ approximately 20,000 persons.</w:t>
+      </w:r>
+    </w:p>
+  </w:footnote>
+  <w:footnote w:id="4">
+    <w:p>
+      <w:pPr>
+        <w:pStyle w:val="FootnoteText"/>
+        <w:jc w:val="both"/>
+      </w:pPr>
+      <w:r>
+        <w:rPr>
+          <w:rStyle w:val="FootnoteReference"/>
           <w:highlight w:val="yellow"/>
         </w:rPr>
         <w:footnoteRef/>
@@ -13262,7 +12918,7 @@
       </w:r>
     </w:p>
   </w:footnote>
-  <w:footnote w:id="3">
+  <w:footnote w:id="5">
     <w:p>
       <w:pPr>
         <w:pStyle w:val="FootnoteText"/>
@@ -13279,7 +12935,7 @@
       </w:r>
     </w:p>
   </w:footnote>
-  <w:footnote w:id="4">
+  <w:footnote w:id="6">
     <w:p>
       <w:pPr>
         <w:pStyle w:val="FootnoteText"/>
@@ -14105,7 +13761,6 @@
   <w:style w:type="character" w:default="1" w:styleId="DefaultParagraphFont">
     <w:name w:val="Default Paragraph Font"/>
     <w:uiPriority w:val="1"/>
-    <w:semiHidden/>
     <w:unhideWhenUsed/>
   </w:style>
   <w:style w:type="table" w:default="1" w:styleId="TableNormal">

</xml_diff>

<commit_message>
Add Tourism Statistics Excel file in raw data folder
</commit_message>
<xml_diff>
--- a/report/draft/Macroeconomic and Demographic Context Version 1.docx
+++ b/report/draft/Macroeconomic and Demographic Context Version 1.docx
@@ -2264,7 +2264,26 @@
         <w:rPr>
           <w:rFonts w:cs="Calibri"/>
         </w:rPr>
-        <w:t xml:space="preserve">Between 1980 and the early 1990s, the economy experienced several episodes of robust growth, including multiple years of double-digit expansion in economic activity (Figure 1 – Panel 1). This performance was driven primarily by agricultural expansion, diversification into tourism services and public sector investment. Growth, however, moderated significantly thereafter, particularly following the global financial crisis, with the post-2008 period characterized by lower average growth and repeated episodes of economic contraction. Over time, the economy has </w:t>
+        <w:t xml:space="preserve">Between 1980 and the early 1990s, the economy experienced several episodes of robust growth, including multiple years of double-digit expansion in economic activity </w:t>
+      </w:r>
+      <w:r>
+        <w:rPr>
+          <w:rFonts w:cs="Calibri"/>
+          <w:b/>
+          <w:bCs/>
+          <w:rPrChange w:id="3" w:author="Tommy Descartes" w:date="2026-05-26T20:58:00Z" w16du:dateUtc="2026-05-27T00:58:00Z">
+            <w:rPr>
+              <w:rFonts w:cs="Calibri"/>
+            </w:rPr>
+          </w:rPrChange>
+        </w:rPr>
+        <w:t>(Figure 1 – Panel 1)</w:t>
+      </w:r>
+      <w:r>
+        <w:rPr>
+          <w:rFonts w:cs="Calibri"/>
+        </w:rPr>
+        <w:t xml:space="preserve">. This performance was driven primarily by agricultural expansion, diversification into tourism services and public sector investment. Growth, however, moderated significantly thereafter, particularly following the global financial crisis, with the post-2008 period characterized by lower average growth and repeated episodes of economic contraction. Over time, the economy has </w:t>
       </w:r>
       <w:r>
         <w:rPr>
@@ -2300,8 +2319,8 @@
           <w:szCs w:val="22"/>
         </w:rPr>
       </w:pPr>
-      <w:commentRangeStart w:id="3"/>
       <w:commentRangeStart w:id="4"/>
+      <w:commentRangeStart w:id="5"/>
       <w:r>
         <w:rPr>
           <w:rFonts w:cs="Calibri"/>
@@ -2394,7 +2413,7 @@
         </w:rPr>
         <w:t xml:space="preserve">: </w:t>
       </w:r>
-      <w:commentRangeEnd w:id="3"/>
+      <w:commentRangeEnd w:id="4"/>
       <w:r>
         <w:rPr>
           <w:rStyle w:val="CommentReference"/>
@@ -2407,9 +2426,9 @@
           <w:sz w:val="22"/>
           <w:szCs w:val="22"/>
         </w:rPr>
-        <w:commentReference w:id="3"/>
-      </w:r>
-      <w:commentRangeEnd w:id="4"/>
+        <w:commentReference w:id="4"/>
+      </w:r>
+      <w:commentRangeEnd w:id="5"/>
       <w:r>
         <w:rPr>
           <w:rStyle w:val="CommentReference"/>
@@ -2422,7 +2441,7 @@
           <w:sz w:val="22"/>
           <w:szCs w:val="22"/>
         </w:rPr>
-        <w:commentReference w:id="4"/>
+        <w:commentReference w:id="5"/>
       </w:r>
     </w:p>
     <w:p>
@@ -2441,7 +2460,7 @@
           <w:szCs w:val="22"/>
         </w:rPr>
       </w:pPr>
-      <w:commentRangeStart w:id="5"/>
+      <w:commentRangeStart w:id="6"/>
       <w:r>
         <w:rPr>
           <w:rFonts w:cs="Calibri"/>
@@ -2454,7 +2473,7 @@
         </w:rPr>
         <w:t>Belize Real GDP Growth, Annual percentage and 5-Year Average (1980 – 2025)</w:t>
       </w:r>
-      <w:commentRangeEnd w:id="5"/>
+      <w:commentRangeEnd w:id="6"/>
       <w:r>
         <w:rPr>
           <w:rStyle w:val="CommentReference"/>
@@ -2466,7 +2485,7 @@
           <w:sz w:val="22"/>
           <w:szCs w:val="22"/>
         </w:rPr>
-        <w:commentReference w:id="5"/>
+        <w:commentReference w:id="6"/>
       </w:r>
     </w:p>
     <w:p>
@@ -2607,8 +2626,21 @@
       <w:r>
         <w:rPr>
           <w:rFonts w:cs="Calibri"/>
-        </w:rPr>
-        <w:t xml:space="preserve">Panel 2 highlights a pronounced deceleration in Belize’s long-run growth trajectory over the past four decades. Average real GDP growth increased from 3.0% during 1980-84 to 10.9% in </w:t>
+          <w:b/>
+          <w:bCs/>
+          <w:rPrChange w:id="7" w:author="Tommy Descartes" w:date="2026-05-26T20:59:00Z" w16du:dateUtc="2026-05-27T00:59:00Z">
+            <w:rPr>
+              <w:rFonts w:cs="Calibri"/>
+            </w:rPr>
+          </w:rPrChange>
+        </w:rPr>
+        <w:t>Panel 2</w:t>
+      </w:r>
+      <w:r>
+        <w:rPr>
+          <w:rFonts w:cs="Calibri"/>
+        </w:rPr>
+        <w:t xml:space="preserve"> highlights a pronounced deceleration in Belize’s long-run growth trajectory over the past four decades. Average real GDP growth increased from 3.0% during 1980-84 to 10.9% in </w:t>
       </w:r>
       <w:r>
         <w:rPr>
@@ -2667,7 +2699,7 @@
         <w:ind w:right="-23"/>
         <w:jc w:val="both"/>
         <w:rPr>
-          <w:del w:id="6" w:author="Tommy Descartes" w:date="2026-05-26T14:36:00Z" w16du:dateUtc="2026-05-26T18:36:00Z"/>
+          <w:del w:id="8" w:author="Tommy Descartes" w:date="2026-05-26T14:36:00Z" w16du:dateUtc="2026-05-26T18:36:00Z"/>
           <w:rFonts w:cs="Calibri"/>
         </w:rPr>
       </w:pPr>
@@ -2725,7 +2757,7 @@
           <w:rFonts w:cs="Calibri"/>
         </w:rPr>
       </w:pPr>
-      <w:commentRangeStart w:id="7"/>
+      <w:commentRangeStart w:id="9"/>
       <w:r>
         <w:rPr>
           <w:rFonts w:cs="Calibri"/>
@@ -2809,7 +2841,7 @@
         </w:rPr>
         <w:t xml:space="preserve"> </w:t>
       </w:r>
-      <w:commentRangeEnd w:id="7"/>
+      <w:commentRangeEnd w:id="9"/>
       <w:r>
         <w:rPr>
           <w:rStyle w:val="CommentReference"/>
@@ -2817,7 +2849,7 @@
           <w:sz w:val="22"/>
           <w:szCs w:val="22"/>
         </w:rPr>
-        <w:commentReference w:id="7"/>
+        <w:commentReference w:id="9"/>
       </w:r>
       <w:r>
         <w:rPr>
@@ -2968,7 +3000,7 @@
         </w:rPr>
         <w:t xml:space="preserve"> </w:t>
       </w:r>
-      <w:commentRangeStart w:id="8"/>
+      <w:commentRangeStart w:id="10"/>
       <w:r>
         <w:rPr>
           <w:rFonts w:cs="Calibri"/>
@@ -3029,7 +3061,7 @@
         </w:rPr>
         <w:t>2025 and is projected to increase to approximately 53.7% by 2035.</w:t>
       </w:r>
-      <w:commentRangeEnd w:id="8"/>
+      <w:commentRangeEnd w:id="10"/>
       <w:r>
         <w:rPr>
           <w:rStyle w:val="CommentReference"/>
@@ -3037,7 +3069,7 @@
           <w:sz w:val="22"/>
           <w:szCs w:val="22"/>
         </w:rPr>
-        <w:commentReference w:id="8"/>
+        <w:commentReference w:id="10"/>
       </w:r>
       <w:r>
         <w:rPr>
@@ -3301,7 +3333,7 @@
         </w:rPr>
         <w:t xml:space="preserve">ravel receipts have become an increasingly important component of Belize’s external services account, rising from </w:t>
       </w:r>
-      <w:commentRangeStart w:id="9"/>
+      <w:commentRangeStart w:id="11"/>
       <w:r>
         <w:rPr>
           <w:rFonts w:cs="Calibri"/>
@@ -3320,7 +3352,7 @@
         </w:rPr>
         <w:t xml:space="preserve"> in 2024.</w:t>
       </w:r>
-      <w:commentRangeEnd w:id="9"/>
+      <w:commentRangeEnd w:id="11"/>
       <w:r>
         <w:rPr>
           <w:rStyle w:val="CommentReference"/>
@@ -3328,7 +3360,7 @@
           <w:sz w:val="22"/>
           <w:szCs w:val="22"/>
         </w:rPr>
-        <w:commentReference w:id="9"/>
+        <w:commentReference w:id="11"/>
       </w:r>
       <w:r>
         <w:rPr>
@@ -3492,7 +3524,7 @@
           <w:szCs w:val="22"/>
         </w:rPr>
       </w:pPr>
-      <w:commentRangeStart w:id="10"/>
+      <w:commentRangeStart w:id="12"/>
       <w:r>
         <w:rPr>
           <w:b/>
@@ -3599,7 +3631,7 @@
         </w:rPr>
         <w:t>Belize Growth Accounting Decomposition (Avg. Annual Contribution to Real GDP)</w:t>
       </w:r>
-      <w:commentRangeEnd w:id="10"/>
+      <w:commentRangeEnd w:id="12"/>
       <w:r>
         <w:rPr>
           <w:rStyle w:val="CommentReference"/>
@@ -3610,7 +3642,7 @@
           <w:sz w:val="22"/>
           <w:szCs w:val="22"/>
         </w:rPr>
-        <w:commentReference w:id="10"/>
+        <w:commentReference w:id="12"/>
       </w:r>
     </w:p>
     <w:p>
@@ -3622,7 +3654,7 @@
           <w:rFonts w:cs="Calibri"/>
         </w:rPr>
       </w:pPr>
-      <w:commentRangeStart w:id="11"/>
+      <w:commentRangeStart w:id="13"/>
       <w:r>
         <w:rPr>
           <w:rFonts w:cs="Calibri"/>
@@ -3664,7 +3696,7 @@
           </wp:inline>
         </w:drawing>
       </w:r>
-      <w:commentRangeEnd w:id="11"/>
+      <w:commentRangeEnd w:id="13"/>
       <w:r>
         <w:rPr>
           <w:rStyle w:val="CommentReference"/>
@@ -3672,7 +3704,7 @@
           <w:sz w:val="22"/>
           <w:szCs w:val="22"/>
         </w:rPr>
-        <w:commentReference w:id="11"/>
+        <w:commentReference w:id="13"/>
       </w:r>
     </w:p>
     <w:p>
@@ -3836,15 +3868,15 @@
           <w:rFonts w:cs="Calibri"/>
         </w:rPr>
       </w:pPr>
-      <w:commentRangeStart w:id="12"/>
-      <w:commentRangeStart w:id="13"/>
+      <w:commentRangeStart w:id="14"/>
+      <w:commentRangeStart w:id="15"/>
       <w:r>
         <w:rPr>
           <w:rFonts w:cs="Calibri"/>
         </w:rPr>
         <w:t xml:space="preserve">Comparator economies such as Costa Rica, the Dominican Republic, and Mauritius provide </w:t>
       </w:r>
-      <w:commentRangeEnd w:id="13"/>
+      <w:commentRangeEnd w:id="15"/>
       <w:r>
         <w:rPr>
           <w:rStyle w:val="CommentReference"/>
@@ -3852,7 +3884,7 @@
           <w:sz w:val="22"/>
           <w:szCs w:val="22"/>
         </w:rPr>
-        <w:commentReference w:id="13"/>
+        <w:commentReference w:id="15"/>
       </w:r>
       <w:r>
         <w:rPr>
@@ -3884,7 +3916,7 @@
         </w:rPr>
         <w:t xml:space="preserve">GNI grew by only 19.3%, reflecting the presence of a persistent middle-income trap dynamics, which is limiting long-term income convergence relative to the selected comparator countries. </w:t>
       </w:r>
-      <w:commentRangeEnd w:id="12"/>
+      <w:commentRangeEnd w:id="14"/>
       <w:r>
         <w:rPr>
           <w:rStyle w:val="CommentReference"/>
@@ -3892,7 +3924,7 @@
           <w:sz w:val="22"/>
           <w:szCs w:val="22"/>
         </w:rPr>
-        <w:commentReference w:id="12"/>
+        <w:commentReference w:id="14"/>
       </w:r>
     </w:p>
     <w:p>
@@ -4150,7 +4182,7 @@
           <w:szCs w:val="22"/>
         </w:rPr>
       </w:pPr>
-      <w:commentRangeStart w:id="14"/>
+      <w:commentRangeStart w:id="16"/>
       <w:r>
         <w:rPr>
           <w:rFonts w:cs="Calibri"/>
@@ -4266,7 +4298,7 @@
         </w:rPr>
         <w:t xml:space="preserve">Gross National Income Per Capita, PPP (Constant 2021 Internation $) </w:t>
       </w:r>
-      <w:commentRangeEnd w:id="14"/>
+      <w:commentRangeEnd w:id="16"/>
       <w:r>
         <w:rPr>
           <w:rStyle w:val="CommentReference"/>
@@ -4278,7 +4310,7 @@
           <w:sz w:val="22"/>
           <w:szCs w:val="22"/>
         </w:rPr>
-        <w:commentReference w:id="14"/>
+        <w:commentReference w:id="16"/>
       </w:r>
     </w:p>
     <w:p>
@@ -4616,7 +4648,7 @@
         </w:rPr>
         <w:t xml:space="preserve"> </w:t>
       </w:r>
-      <w:commentRangeStart w:id="15"/>
+      <w:commentRangeStart w:id="17"/>
       <w:r>
         <w:rPr>
           <w:rFonts w:ascii="Trebuchet MS" w:hAnsi="Trebuchet MS"/>
@@ -4647,7 +4679,7 @@
         </w:rPr>
         <w:t>Trends</w:t>
       </w:r>
-      <w:commentRangeEnd w:id="15"/>
+      <w:commentRangeEnd w:id="17"/>
       <w:r>
         <w:rPr>
           <w:rStyle w:val="CommentReference"/>
@@ -4657,7 +4689,7 @@
           <w:sz w:val="28"/>
           <w:szCs w:val="28"/>
         </w:rPr>
-        <w:commentReference w:id="15"/>
+        <w:commentReference w:id="17"/>
       </w:r>
     </w:p>
     <w:p>
@@ -4682,14 +4714,14 @@
           <w:rFonts w:cs="Calibri"/>
         </w:rPr>
       </w:pPr>
-      <w:commentRangeStart w:id="16"/>
+      <w:commentRangeStart w:id="18"/>
       <w:r>
         <w:rPr>
           <w:rFonts w:cs="Calibri"/>
         </w:rPr>
         <w:t xml:space="preserve">Belize’s estimated mid-year population in 2026 stood at </w:t>
       </w:r>
-      <w:commentRangeStart w:id="17"/>
+      <w:commentRangeStart w:id="19"/>
       <w:r>
         <w:rPr>
           <w:rFonts w:cs="Calibri"/>
@@ -4702,7 +4734,7 @@
         </w:rPr>
         <w:t>, comprising 210,525 males and 217,869 females,</w:t>
       </w:r>
-      <w:commentRangeEnd w:id="17"/>
+      <w:commentRangeEnd w:id="19"/>
       <w:r>
         <w:rPr>
           <w:rStyle w:val="CommentReference"/>
@@ -4710,7 +4742,7 @@
           <w:sz w:val="22"/>
           <w:szCs w:val="22"/>
         </w:rPr>
-        <w:commentReference w:id="17"/>
+        <w:commentReference w:id="19"/>
       </w:r>
       <w:r>
         <w:rPr>
@@ -4724,7 +4756,7 @@
         </w:rPr>
         <w:t xml:space="preserve">. </w:t>
       </w:r>
-      <w:commentRangeEnd w:id="16"/>
+      <w:commentRangeEnd w:id="18"/>
       <w:r>
         <w:rPr>
           <w:rStyle w:val="CommentReference"/>
@@ -4732,7 +4764,7 @@
           <w:sz w:val="22"/>
           <w:szCs w:val="22"/>
         </w:rPr>
-        <w:commentReference w:id="16"/>
+        <w:commentReference w:id="18"/>
       </w:r>
       <w:r>
         <w:rPr>
@@ -4740,7 +4772,7 @@
         </w:rPr>
         <w:t xml:space="preserve">Between 2015 and 2026, </w:t>
       </w:r>
-      <w:commentRangeStart w:id="18"/>
+      <w:commentRangeStart w:id="20"/>
       <w:r>
         <w:rPr>
           <w:rFonts w:cs="Calibri"/>
@@ -4765,7 +4797,7 @@
         </w:rPr>
         <w:t xml:space="preserve"> </w:t>
       </w:r>
-      <w:commentRangeEnd w:id="18"/>
+      <w:commentRangeEnd w:id="20"/>
       <w:r>
         <w:rPr>
           <w:rStyle w:val="CommentReference"/>
@@ -4773,7 +4805,7 @@
           <w:sz w:val="22"/>
           <w:szCs w:val="22"/>
         </w:rPr>
-        <w:commentReference w:id="18"/>
+        <w:commentReference w:id="20"/>
       </w:r>
     </w:p>
     <w:p>
@@ -4817,14 +4849,14 @@
         </w:rPr>
         <w:t xml:space="preserve">small developing </w:t>
       </w:r>
-      <w:commentRangeStart w:id="19"/>
+      <w:commentRangeStart w:id="21"/>
       <w:r>
         <w:rPr>
           <w:rFonts w:cs="Calibri"/>
         </w:rPr>
         <w:t>states</w:t>
       </w:r>
-      <w:commentRangeEnd w:id="19"/>
+      <w:commentRangeEnd w:id="21"/>
       <w:r>
         <w:rPr>
           <w:rStyle w:val="CommentReference"/>
@@ -4832,7 +4864,7 @@
           <w:sz w:val="22"/>
           <w:szCs w:val="22"/>
         </w:rPr>
-        <w:commentReference w:id="19"/>
+        <w:commentReference w:id="21"/>
       </w:r>
       <w:r>
         <w:rPr>
@@ -4846,7 +4878,7 @@
         </w:rPr>
         <w:t xml:space="preserve"> is becoming increasingly ruralized. </w:t>
       </w:r>
-      <w:commentRangeStart w:id="20"/>
+      <w:commentRangeStart w:id="22"/>
       <w:r>
         <w:rPr>
           <w:rFonts w:cs="Calibri"/>
@@ -4883,7 +4915,7 @@
         </w:rPr>
         <w:t xml:space="preserve"> several districts emerging as key labour supply centers</w:t>
       </w:r>
-      <w:commentRangeEnd w:id="20"/>
+      <w:commentRangeEnd w:id="22"/>
       <w:r>
         <w:rPr>
           <w:rStyle w:val="CommentReference"/>
@@ -4891,7 +4923,7 @@
           <w:sz w:val="22"/>
           <w:szCs w:val="22"/>
         </w:rPr>
-        <w:commentReference w:id="20"/>
+        <w:commentReference w:id="22"/>
       </w:r>
       <w:r>
         <w:rPr>
@@ -4955,7 +4987,7 @@
         </w:rPr>
         <w:t xml:space="preserve"> </w:t>
       </w:r>
-      <w:commentRangeStart w:id="21"/>
+      <w:commentRangeStart w:id="23"/>
       <w:r>
         <w:rPr>
           <w:rFonts w:cs="Calibri"/>
@@ -4974,7 +5006,7 @@
         </w:rPr>
         <w:t xml:space="preserve">  </w:t>
       </w:r>
-      <w:commentRangeEnd w:id="21"/>
+      <w:commentRangeEnd w:id="23"/>
       <w:r>
         <w:rPr>
           <w:rStyle w:val="CommentReference"/>
@@ -4982,7 +5014,7 @@
           <w:sz w:val="22"/>
           <w:szCs w:val="22"/>
         </w:rPr>
-        <w:commentReference w:id="21"/>
+        <w:commentReference w:id="23"/>
       </w:r>
     </w:p>
     <w:p>
@@ -5056,14 +5088,14 @@
         </w:rPr>
         <w:t xml:space="preserve"> pressures on the economy’s capacity to generate productive employment opportunities, particularly for youth entering the labor market. At the same time, </w:t>
       </w:r>
-      <w:commentRangeStart w:id="22"/>
+      <w:commentRangeStart w:id="24"/>
       <w:r>
         <w:rPr>
           <w:rFonts w:cs="Calibri"/>
         </w:rPr>
         <w:t>sustained population growth raises demand for housing, education, healthcare, transportation, and other public infrastructure</w:t>
       </w:r>
-      <w:commentRangeEnd w:id="22"/>
+      <w:commentRangeEnd w:id="24"/>
       <w:r>
         <w:rPr>
           <w:rStyle w:val="CommentReference"/>
@@ -5071,7 +5103,7 @@
           <w:sz w:val="22"/>
           <w:szCs w:val="22"/>
         </w:rPr>
-        <w:commentReference w:id="22"/>
+        <w:commentReference w:id="24"/>
       </w:r>
       <w:r>
         <w:rPr>
@@ -5177,7 +5209,7 @@
           <w:rFonts w:cs="Calibri"/>
         </w:rPr>
       </w:pPr>
-      <w:commentRangeStart w:id="23"/>
+      <w:commentRangeStart w:id="25"/>
       <w:r>
         <w:rPr>
           <w:rFonts w:cs="Calibri"/>
@@ -5203,7 +5235,7 @@
         </w:rPr>
         <w:t>, reflecting a relatively youthful demographic structure. The dependency burden is concentrated among the younger cohort of the population, as evidenced by a youth dependence ratio of 43.8%, while the old-age dependency ratio is comparatively low at 10.9</w:t>
       </w:r>
-      <w:commentRangeEnd w:id="23"/>
+      <w:commentRangeEnd w:id="25"/>
       <w:r>
         <w:rPr>
           <w:rStyle w:val="CommentReference"/>
@@ -5211,7 +5243,7 @@
           <w:sz w:val="22"/>
           <w:szCs w:val="22"/>
         </w:rPr>
-        <w:commentReference w:id="23"/>
+        <w:commentReference w:id="25"/>
       </w:r>
       <w:r>
         <w:rPr>
@@ -5326,7 +5358,7 @@
           <w:szCs w:val="22"/>
         </w:rPr>
       </w:pPr>
-      <w:commentRangeStart w:id="24"/>
+      <w:commentRangeStart w:id="26"/>
       <w:r>
         <w:rPr>
           <w:rFonts w:cs="Calibri"/>
@@ -5412,7 +5444,7 @@
         </w:rPr>
         <w:t xml:space="preserve">: </w:t>
       </w:r>
-      <w:commentRangeEnd w:id="24"/>
+      <w:commentRangeEnd w:id="26"/>
       <w:r>
         <w:rPr>
           <w:rStyle w:val="CommentReference"/>
@@ -5424,7 +5456,7 @@
           <w:sz w:val="22"/>
           <w:szCs w:val="22"/>
         </w:rPr>
-        <w:commentReference w:id="24"/>
+        <w:commentReference w:id="26"/>
       </w:r>
     </w:p>
     <w:p>
@@ -5586,7 +5618,7 @@
         </w:rPr>
         <w:t xml:space="preserve"> </w:t>
       </w:r>
-      <w:commentRangeStart w:id="25"/>
+      <w:commentRangeStart w:id="27"/>
       <w:r>
         <w:rPr>
           <w:rFonts w:cs="Calibri"/>
@@ -5617,7 +5649,7 @@
         </w:rPr>
         <w:t xml:space="preserve"> are macro-critical, as it can weaken human capital deepening and constrain domestic labour market dynamism.</w:t>
       </w:r>
-      <w:commentRangeEnd w:id="25"/>
+      <w:commentRangeEnd w:id="27"/>
       <w:r>
         <w:rPr>
           <w:rStyle w:val="CommentReference"/>
@@ -5625,7 +5657,7 @@
           <w:sz w:val="22"/>
           <w:szCs w:val="22"/>
         </w:rPr>
-        <w:commentReference w:id="25"/>
+        <w:commentReference w:id="27"/>
       </w:r>
     </w:p>
     <w:p>
@@ -5793,7 +5825,7 @@
           <w:szCs w:val="22"/>
         </w:rPr>
       </w:pPr>
-      <w:commentRangeStart w:id="26"/>
+      <w:commentRangeStart w:id="28"/>
       <w:r>
         <w:rPr>
           <w:b/>
@@ -5899,7 +5931,7 @@
         </w:rPr>
         <w:t>Belize Demographic Transition, 2015-2025</w:t>
       </w:r>
-      <w:commentRangeEnd w:id="26"/>
+      <w:commentRangeEnd w:id="28"/>
       <w:r>
         <w:rPr>
           <w:rStyle w:val="CommentReference"/>
@@ -5910,7 +5942,7 @@
           <w:sz w:val="22"/>
           <w:szCs w:val="22"/>
         </w:rPr>
-        <w:commentReference w:id="26"/>
+        <w:commentReference w:id="28"/>
       </w:r>
     </w:p>
     <w:p>
@@ -6161,14 +6193,14 @@
         </w:rPr>
         <w:t xml:space="preserve"> likely reflects expanding economic opportunities associated with the growth of the tourism sector as well as inward migration from neighbouring Central American countries. Net migration flows strengthened during the 2000s, contributing to the expansion of the labour force and total population growth. Migration patterns, however, remain highly sensitive to economic conditions, </w:t>
       </w:r>
-      <w:commentRangeStart w:id="27"/>
+      <w:commentRangeStart w:id="29"/>
       <w:r>
         <w:rPr>
           <w:rFonts w:cs="Calibri"/>
         </w:rPr>
         <w:t>as evidenced by the sharp decline during the COVID-19 pandemic and the subsequent rebound in 2022</w:t>
       </w:r>
-      <w:commentRangeEnd w:id="27"/>
+      <w:commentRangeEnd w:id="29"/>
       <w:r>
         <w:rPr>
           <w:rStyle w:val="CommentReference"/>
@@ -6176,7 +6208,7 @@
           <w:sz w:val="22"/>
           <w:szCs w:val="22"/>
         </w:rPr>
-        <w:commentReference w:id="27"/>
+        <w:commentReference w:id="29"/>
       </w:r>
       <w:r>
         <w:rPr>
@@ -6683,7 +6715,7 @@
           <w:szCs w:val="28"/>
         </w:rPr>
       </w:pPr>
-      <w:commentRangeStart w:id="28"/>
+      <w:commentRangeStart w:id="30"/>
       <w:r>
         <w:rPr>
           <w:rFonts w:ascii="Trebuchet MS" w:hAnsi="Trebuchet MS"/>
@@ -6694,7 +6726,7 @@
         </w:rPr>
         <w:t>Labour Market Assessment</w:t>
       </w:r>
-      <w:commentRangeEnd w:id="28"/>
+      <w:commentRangeEnd w:id="30"/>
       <w:r>
         <w:rPr>
           <w:rStyle w:val="CommentReference"/>
@@ -6704,7 +6736,7 @@
           <w:sz w:val="28"/>
           <w:szCs w:val="28"/>
         </w:rPr>
-        <w:commentReference w:id="28"/>
+        <w:commentReference w:id="30"/>
       </w:r>
     </w:p>
     <w:bookmarkEnd w:id="0"/>
@@ -7295,7 +7327,7 @@
           <w:rFonts w:cs="Aptos Serif"/>
         </w:rPr>
       </w:pPr>
-      <w:commentRangeStart w:id="29"/>
+      <w:commentRangeStart w:id="31"/>
       <w:r>
         <w:rPr>
           <w:rFonts w:cs="Aptos Serif"/>
@@ -7424,7 +7456,7 @@
         </w:rPr>
         <w:t xml:space="preserve"> The population with secondary education increased from 50,037 persons in 2015 to 70,051 persons in 2024, equivalent to 40.0%. Similarly, the number of persons with tertiary education expanded from 35,229 to 54,025 over the same period, representing an increase of nearly 53.4%. This growth in tertiary education attainment suggests a gradual deepening of Belize’s skilled labour force and may reflect expanded access to higher education, increased educational participation and changing labour market demands.</w:t>
       </w:r>
-      <w:commentRangeEnd w:id="29"/>
+      <w:commentRangeEnd w:id="31"/>
       <w:r>
         <w:rPr>
           <w:rStyle w:val="CommentReference"/>
@@ -7432,7 +7464,7 @@
           <w:sz w:val="22"/>
           <w:szCs w:val="22"/>
         </w:rPr>
-        <w:commentReference w:id="29"/>
+        <w:commentReference w:id="31"/>
       </w:r>
     </w:p>
     <w:p>
@@ -9730,7 +9762,7 @@
                 <w:szCs w:val="20"/>
               </w:rPr>
             </w:pPr>
-            <w:commentRangeStart w:id="30"/>
+            <w:commentRangeStart w:id="32"/>
             <w:r>
               <w:rPr>
                 <w:rFonts w:cs="Calibri"/>
@@ -9757,7 +9789,7 @@
               </w:rPr>
               <w:t xml:space="preserve">175,944 </w:t>
             </w:r>
-            <w:commentRangeEnd w:id="30"/>
+            <w:commentRangeEnd w:id="32"/>
             <w:r>
               <w:rPr>
                 <w:rStyle w:val="CommentReference"/>
@@ -9765,7 +9797,7 @@
                 <w:sz w:val="20"/>
                 <w:szCs w:val="20"/>
               </w:rPr>
-              <w:commentReference w:id="30"/>
+              <w:commentReference w:id="32"/>
             </w:r>
           </w:p>
         </w:tc>
@@ -9930,7 +9962,7 @@
           <w:szCs w:val="24"/>
         </w:rPr>
       </w:pPr>
-      <w:commentRangeStart w:id="31"/>
+      <w:commentRangeStart w:id="33"/>
       <w:r>
         <w:rPr>
           <w:b/>
@@ -9940,7 +9972,7 @@
         </w:rPr>
         <w:t>Gender Participation Gap</w:t>
       </w:r>
-      <w:commentRangeEnd w:id="31"/>
+      <w:commentRangeEnd w:id="33"/>
       <w:r>
         <w:rPr>
           <w:rStyle w:val="CommentReference"/>
@@ -9949,7 +9981,7 @@
           <w:sz w:val="24"/>
           <w:szCs w:val="24"/>
         </w:rPr>
-        <w:commentReference w:id="31"/>
+        <w:commentReference w:id="33"/>
       </w:r>
     </w:p>
     <w:p>
@@ -10060,7 +10092,7 @@
           <w:szCs w:val="22"/>
         </w:rPr>
       </w:pPr>
-      <w:commentRangeStart w:id="32"/>
+      <w:commentRangeStart w:id="34"/>
       <w:r>
         <w:rPr>
           <w:b/>
@@ -10166,7 +10198,7 @@
         </w:rPr>
         <w:t>Belize: Labour Force Participation and Gender Gap</w:t>
       </w:r>
-      <w:commentRangeEnd w:id="32"/>
+      <w:commentRangeEnd w:id="34"/>
       <w:r>
         <w:rPr>
           <w:rStyle w:val="CommentReference"/>
@@ -10177,7 +10209,7 @@
           <w:sz w:val="22"/>
           <w:szCs w:val="22"/>
         </w:rPr>
-        <w:commentReference w:id="32"/>
+        <w:commentReference w:id="34"/>
       </w:r>
     </w:p>
     <w:p>
@@ -10296,14 +10328,14 @@
         </w:rPr>
         <w:t xml:space="preserve">The persistence of this participation gap points to the existence of structural barriers limiting women’s attachment to the labour market. These barriers may include unpaid care and domestic responsibilities, transportation limitations, </w:t>
       </w:r>
-      <w:commentRangeStart w:id="33"/>
+      <w:commentRangeStart w:id="35"/>
       <w:r>
         <w:rPr>
           <w:rFonts w:cs="Calibri"/>
         </w:rPr>
         <w:t xml:space="preserve">occupational segregation, </w:t>
       </w:r>
-      <w:commentRangeEnd w:id="33"/>
+      <w:commentRangeEnd w:id="35"/>
       <w:r>
         <w:rPr>
           <w:rStyle w:val="CommentReference"/>
@@ -10311,7 +10343,7 @@
           <w:sz w:val="22"/>
           <w:szCs w:val="22"/>
         </w:rPr>
-        <w:commentReference w:id="33"/>
+        <w:commentReference w:id="35"/>
       </w:r>
       <w:r>
         <w:rPr>
@@ -11498,14 +11530,14 @@
         </w:rPr>
         <w:t xml:space="preserve">The decline in labour force participation has coincided with a substantial increase in the number </w:t>
       </w:r>
-      <w:commentRangeStart w:id="34"/>
+      <w:commentRangeStart w:id="36"/>
       <w:r>
         <w:rPr>
           <w:rFonts w:cs="Calibri"/>
         </w:rPr>
         <w:t>of persons remaining outside the labour force. The economically inactive working-age population increased from 81,344 persons in September 2019, equivalent to approximately 29.9% of the working-age population, to 130,909 persons by September 2025, representing approximately 41.9% of the working-age population. Overall, the number of economically inactive persons increased by 49,565 persons between 2019 and 2025, equivalent to a cumulative increase of approximately 60.9%.</w:t>
       </w:r>
-      <w:commentRangeEnd w:id="34"/>
+      <w:commentRangeEnd w:id="36"/>
       <w:r>
         <w:rPr>
           <w:rStyle w:val="CommentReference"/>
@@ -11513,7 +11545,7 @@
           <w:sz w:val="22"/>
           <w:szCs w:val="22"/>
         </w:rPr>
-        <w:commentReference w:id="34"/>
+        <w:commentReference w:id="36"/>
       </w:r>
     </w:p>
     <w:p>
@@ -11782,7 +11814,7 @@
           <w:szCs w:val="22"/>
         </w:rPr>
       </w:pPr>
-      <w:commentRangeStart w:id="35"/>
+      <w:commentRangeStart w:id="37"/>
       <w:r>
         <w:rPr>
           <w:b/>
@@ -11794,7 +11826,7 @@
         </w:rPr>
         <w:t>Belize: Persons Outside the Labour Force by Sex</w:t>
       </w:r>
-      <w:commentRangeEnd w:id="35"/>
+      <w:commentRangeEnd w:id="37"/>
       <w:r>
         <w:rPr>
           <w:rStyle w:val="CommentReference"/>
@@ -11805,7 +11837,7 @@
           <w:sz w:val="22"/>
           <w:szCs w:val="22"/>
         </w:rPr>
-        <w:commentReference w:id="35"/>
+        <w:commentReference w:id="37"/>
       </w:r>
     </w:p>
     <w:p>
@@ -11894,7 +11926,7 @@
           <w:rFonts w:cs="Calibri"/>
         </w:rPr>
       </w:pPr>
-      <w:commentRangeStart w:id="36"/>
+      <w:commentRangeStart w:id="38"/>
       <w:r>
         <w:rPr>
           <w:rFonts w:cs="Calibri"/>
@@ -11922,7 +11954,7 @@
         </w:rPr>
         <w:t xml:space="preserve"> </w:t>
       </w:r>
-      <w:commentRangeEnd w:id="36"/>
+      <w:commentRangeEnd w:id="38"/>
       <w:r>
         <w:rPr>
           <w:rStyle w:val="CommentReference"/>
@@ -11930,7 +11962,7 @@
           <w:sz w:val="22"/>
           <w:szCs w:val="22"/>
         </w:rPr>
-        <w:commentReference w:id="36"/>
+        <w:commentReference w:id="38"/>
       </w:r>
       <w:r>
         <w:rPr>
@@ -11960,14 +11992,14 @@
           <w:rFonts w:cs="Calibri"/>
         </w:rPr>
       </w:pPr>
-      <w:commentRangeStart w:id="37"/>
+      <w:commentRangeStart w:id="39"/>
       <w:r>
         <w:rPr>
           <w:rFonts w:cs="Calibri"/>
         </w:rPr>
         <w:t>From a broader macroeconomic perspective, persistently high female labour force inactivity may constrain labour utilization, productivity growth, household income generation, and the country’s ability to fully capitalize on its demographic dividend. These findings therefore underscore the importance of policies aimed at strengthening female labour market participation through investments in childcare services, transportation infrastructure, skills development, flexible work arrangements, and broader labour market inclusion initiatives.</w:t>
       </w:r>
-      <w:commentRangeEnd w:id="37"/>
+      <w:commentRangeEnd w:id="39"/>
       <w:r>
         <w:rPr>
           <w:rStyle w:val="CommentReference"/>
@@ -11975,7 +12007,7 @@
           <w:sz w:val="22"/>
           <w:szCs w:val="22"/>
         </w:rPr>
-        <w:commentReference w:id="37"/>
+        <w:commentReference w:id="39"/>
       </w:r>
     </w:p>
     <w:p>
@@ -12056,7 +12088,7 @@
       </w:r>
     </w:p>
   </w:comment>
-  <w:comment w:id="3" w:author="Tommy Descartes" w:date="2026-05-25T18:32:00Z" w:initials="TD">
+  <w:comment w:id="4" w:author="Tommy Descartes" w:date="2026-05-25T18:32:00Z" w:initials="TD">
     <w:p>
       <w:pPr>
         <w:pStyle w:val="CommentText"/>
@@ -12072,7 +12104,7 @@
       </w:r>
     </w:p>
   </w:comment>
-  <w:comment w:id="4" w:author="Tommy Descartes" w:date="2026-05-26T12:30:00Z" w:initials="TD">
+  <w:comment w:id="5" w:author="Tommy Descartes" w:date="2026-05-26T12:30:00Z" w:initials="TD">
     <w:p>
       <w:pPr>
         <w:pStyle w:val="CommentText"/>
@@ -12088,7 +12120,7 @@
       </w:r>
     </w:p>
   </w:comment>
-  <w:comment w:id="5" w:author="Tommy Descartes" w:date="2026-05-26T14:35:00Z" w:initials="TD">
+  <w:comment w:id="6" w:author="Tommy Descartes" w:date="2026-05-26T14:35:00Z" w:initials="TD">
     <w:p>
       <w:pPr>
         <w:pStyle w:val="CommentText"/>
@@ -12104,7 +12136,7 @@
       </w:r>
     </w:p>
   </w:comment>
-  <w:comment w:id="7" w:author="Tommy Descartes" w:date="2026-05-25T18:34:00Z" w:initials="TD">
+  <w:comment w:id="9" w:author="Tommy Descartes" w:date="2026-05-25T18:34:00Z" w:initials="TD">
     <w:p>
       <w:pPr>
         <w:pStyle w:val="CommentText"/>
@@ -12120,7 +12152,7 @@
       </w:r>
     </w:p>
   </w:comment>
-  <w:comment w:id="8" w:author="Tommy Descartes" w:date="2026-05-14T10:57:00Z" w:initials="TD">
+  <w:comment w:id="10" w:author="Tommy Descartes" w:date="2026-05-14T10:57:00Z" w:initials="TD">
     <w:p>
       <w:pPr>
         <w:pStyle w:val="CommentText"/>
@@ -12136,7 +12168,7 @@
       </w:r>
     </w:p>
   </w:comment>
-  <w:comment w:id="9" w:author="Tommy Descartes" w:date="2026-05-15T11:54:00Z" w:initials="TD">
+  <w:comment w:id="11" w:author="Tommy Descartes" w:date="2026-05-15T11:54:00Z" w:initials="TD">
     <w:p>
       <w:pPr>
         <w:pStyle w:val="CommentText"/>
@@ -12152,7 +12184,7 @@
       </w:r>
     </w:p>
   </w:comment>
-  <w:comment w:id="10" w:author="Tommy Descartes" w:date="2026-05-25T18:51:00Z" w:initials="TD">
+  <w:comment w:id="12" w:author="Tommy Descartes" w:date="2026-05-25T18:51:00Z" w:initials="TD">
     <w:p>
       <w:pPr>
         <w:pStyle w:val="CommentText"/>
@@ -12168,7 +12200,7 @@
       </w:r>
     </w:p>
   </w:comment>
-  <w:comment w:id="11" w:author="Tommy Descartes" w:date="2026-05-26T14:39:00Z" w:initials="TD">
+  <w:comment w:id="13" w:author="Tommy Descartes" w:date="2026-05-26T14:39:00Z" w:initials="TD">
     <w:p>
       <w:pPr>
         <w:pStyle w:val="CommentText"/>
@@ -12184,7 +12216,7 @@
       </w:r>
     </w:p>
   </w:comment>
-  <w:comment w:id="13" w:author="Tommy Descartes" w:date="2026-05-14T12:09:00Z" w:initials="TD">
+  <w:comment w:id="15" w:author="Tommy Descartes" w:date="2026-05-14T12:09:00Z" w:initials="TD">
     <w:p>
       <w:pPr>
         <w:pStyle w:val="CommentText"/>
@@ -12200,7 +12232,7 @@
       </w:r>
     </w:p>
   </w:comment>
-  <w:comment w:id="12" w:author="Tommy Descartes" w:date="2026-05-13T11:24:00Z" w:initials="TD">
+  <w:comment w:id="14" w:author="Tommy Descartes" w:date="2026-05-13T11:24:00Z" w:initials="TD">
     <w:p>
       <w:pPr>
         <w:pStyle w:val="CommentText"/>
@@ -12216,7 +12248,7 @@
       </w:r>
     </w:p>
   </w:comment>
-  <w:comment w:id="14" w:author="Tommy Descartes" w:date="2026-05-12T17:36:00Z" w:initials="TD">
+  <w:comment w:id="16" w:author="Tommy Descartes" w:date="2026-05-12T17:36:00Z" w:initials="TD">
     <w:p>
       <w:pPr>
         <w:pStyle w:val="CommentText"/>
@@ -12232,7 +12264,7 @@
       </w:r>
     </w:p>
   </w:comment>
-  <w:comment w:id="15" w:author="Tommy Descartes" w:date="2026-05-15T03:16:00Z" w:initials="TD">
+  <w:comment w:id="17" w:author="Tommy Descartes" w:date="2026-05-15T03:16:00Z" w:initials="TD">
     <w:p>
       <w:pPr>
         <w:pStyle w:val="CommentText"/>
@@ -12248,7 +12280,7 @@
       </w:r>
     </w:p>
   </w:comment>
-  <w:comment w:id="17" w:author="Tommy Descartes" w:date="2026-05-17T18:19:00Z" w:initials="TD">
+  <w:comment w:id="19" w:author="Tommy Descartes" w:date="2026-05-17T18:19:00Z" w:initials="TD">
     <w:p>
       <w:pPr>
         <w:pStyle w:val="CommentText"/>
@@ -12264,7 +12296,7 @@
       </w:r>
     </w:p>
   </w:comment>
-  <w:comment w:id="16" w:author="Tommy Descartes" w:date="2026-05-13T08:29:00Z" w:initials="TD">
+  <w:comment w:id="18" w:author="Tommy Descartes" w:date="2026-05-13T08:29:00Z" w:initials="TD">
     <w:p>
       <w:pPr>
         <w:pStyle w:val="CommentText"/>
@@ -12280,7 +12312,7 @@
       </w:r>
     </w:p>
   </w:comment>
-  <w:comment w:id="18" w:author="Tommy Descartes" w:date="2026-05-13T17:55:00Z" w:initials="TD">
+  <w:comment w:id="20" w:author="Tommy Descartes" w:date="2026-05-13T17:55:00Z" w:initials="TD">
     <w:p>
       <w:pPr>
         <w:pStyle w:val="CommentText"/>
@@ -12296,7 +12328,7 @@
       </w:r>
     </w:p>
   </w:comment>
-  <w:comment w:id="19" w:author="Tommy Descartes" w:date="2026-05-14T13:55:00Z" w:initials="TD">
+  <w:comment w:id="21" w:author="Tommy Descartes" w:date="2026-05-14T13:55:00Z" w:initials="TD">
     <w:p>
       <w:pPr>
         <w:pStyle w:val="CommentText"/>
@@ -12312,7 +12344,7 @@
       </w:r>
     </w:p>
   </w:comment>
-  <w:comment w:id="20" w:author="Tommy Descartes" w:date="2026-05-25T19:05:00Z" w:initials="TD">
+  <w:comment w:id="22" w:author="Tommy Descartes" w:date="2026-05-25T19:05:00Z" w:initials="TD">
     <w:p>
       <w:pPr>
         <w:pStyle w:val="CommentText"/>
@@ -12328,7 +12360,7 @@
       </w:r>
     </w:p>
   </w:comment>
-  <w:comment w:id="21" w:author="Tommy Descartes" w:date="2026-05-25T19:06:00Z" w:initials="TD">
+  <w:comment w:id="23" w:author="Tommy Descartes" w:date="2026-05-25T19:06:00Z" w:initials="TD">
     <w:p>
       <w:pPr>
         <w:pStyle w:val="CommentText"/>
@@ -12344,7 +12376,7 @@
       </w:r>
     </w:p>
   </w:comment>
-  <w:comment w:id="22" w:author="Tommy Descartes" w:date="2026-05-13T10:07:00Z" w:initials="TD">
+  <w:comment w:id="24" w:author="Tommy Descartes" w:date="2026-05-13T10:07:00Z" w:initials="TD">
     <w:p>
       <w:pPr>
         <w:pStyle w:val="CommentText"/>
@@ -12360,7 +12392,7 @@
       </w:r>
     </w:p>
   </w:comment>
-  <w:comment w:id="23" w:author="Tommy Descartes" w:date="2026-05-15T03:10:00Z" w:initials="TD">
+  <w:comment w:id="25" w:author="Tommy Descartes" w:date="2026-05-15T03:10:00Z" w:initials="TD">
     <w:p>
       <w:pPr>
         <w:pStyle w:val="CommentText"/>
@@ -12376,7 +12408,7 @@
       </w:r>
     </w:p>
   </w:comment>
-  <w:comment w:id="24" w:author="Tommy Descartes" w:date="2026-05-13T08:23:00Z" w:initials="TD">
+  <w:comment w:id="26" w:author="Tommy Descartes" w:date="2026-05-13T08:23:00Z" w:initials="TD">
     <w:p>
       <w:pPr>
         <w:pStyle w:val="CommentText"/>
@@ -12392,7 +12424,7 @@
       </w:r>
     </w:p>
   </w:comment>
-  <w:comment w:id="25" w:author="Tommy Descartes" w:date="2026-05-15T03:20:00Z" w:initials="TD">
+  <w:comment w:id="27" w:author="Tommy Descartes" w:date="2026-05-15T03:20:00Z" w:initials="TD">
     <w:p>
       <w:pPr>
         <w:pStyle w:val="CommentText"/>
@@ -12408,7 +12440,7 @@
       </w:r>
     </w:p>
   </w:comment>
-  <w:comment w:id="26" w:author="Tommy Descartes" w:date="2026-05-25T19:20:00Z" w:initials="TD">
+  <w:comment w:id="28" w:author="Tommy Descartes" w:date="2026-05-25T19:20:00Z" w:initials="TD">
     <w:p>
       <w:pPr>
         <w:pStyle w:val="CommentText"/>
@@ -12424,7 +12456,7 @@
       </w:r>
     </w:p>
   </w:comment>
-  <w:comment w:id="27" w:author="Tommy Descartes" w:date="2026-05-15T11:29:00Z" w:initials="TD">
+  <w:comment w:id="29" w:author="Tommy Descartes" w:date="2026-05-15T11:29:00Z" w:initials="TD">
     <w:p>
       <w:pPr>
         <w:pStyle w:val="CommentText"/>
@@ -12440,7 +12472,7 @@
       </w:r>
     </w:p>
   </w:comment>
-  <w:comment w:id="28" w:author="Tommy Descartes" w:date="2026-05-17T18:31:00Z" w:initials="TD">
+  <w:comment w:id="30" w:author="Tommy Descartes" w:date="2026-05-17T18:31:00Z" w:initials="TD">
     <w:p>
       <w:pPr>
         <w:pStyle w:val="CommentText"/>
@@ -12469,7 +12501,7 @@
       </w:r>
     </w:p>
   </w:comment>
-  <w:comment w:id="29" w:author="Tommy Descartes" w:date="2026-05-25T19:29:00Z" w:initials="TD">
+  <w:comment w:id="31" w:author="Tommy Descartes" w:date="2026-05-25T19:29:00Z" w:initials="TD">
     <w:p>
       <w:pPr>
         <w:pStyle w:val="CommentText"/>
@@ -12485,7 +12517,7 @@
       </w:r>
     </w:p>
   </w:comment>
-  <w:comment w:id="30" w:author="Tommy Descartes" w:date="2026-05-19T17:04:00Z" w:initials="TD">
+  <w:comment w:id="32" w:author="Tommy Descartes" w:date="2026-05-19T17:04:00Z" w:initials="TD">
     <w:p>
       <w:pPr>
         <w:pStyle w:val="CommentText"/>
@@ -12501,7 +12533,7 @@
       </w:r>
     </w:p>
   </w:comment>
-  <w:comment w:id="31" w:author="Tommy Descartes" w:date="2026-05-23T07:25:00Z" w:initials="TD">
+  <w:comment w:id="33" w:author="Tommy Descartes" w:date="2026-05-23T07:25:00Z" w:initials="TD">
     <w:p>
       <w:pPr>
         <w:pStyle w:val="CommentText"/>
@@ -12517,7 +12549,7 @@
       </w:r>
     </w:p>
   </w:comment>
-  <w:comment w:id="32" w:author="Tommy Descartes" w:date="2026-05-23T07:32:00Z" w:initials="TD">
+  <w:comment w:id="34" w:author="Tommy Descartes" w:date="2026-05-23T07:32:00Z" w:initials="TD">
     <w:p>
       <w:pPr>
         <w:pStyle w:val="CommentText"/>
@@ -12533,7 +12565,7 @@
       </w:r>
     </w:p>
   </w:comment>
-  <w:comment w:id="33" w:author="Tommy Descartes" w:date="2026-05-25T19:35:00Z" w:initials="TD">
+  <w:comment w:id="35" w:author="Tommy Descartes" w:date="2026-05-25T19:35:00Z" w:initials="TD">
     <w:p>
       <w:pPr>
         <w:pStyle w:val="CommentText"/>
@@ -12549,7 +12581,7 @@
       </w:r>
     </w:p>
   </w:comment>
-  <w:comment w:id="34" w:author="Tommy Descartes" w:date="2026-05-20T17:53:00Z" w:initials="TD">
+  <w:comment w:id="36" w:author="Tommy Descartes" w:date="2026-05-20T17:53:00Z" w:initials="TD">
     <w:p>
       <w:pPr>
         <w:pStyle w:val="CommentText"/>
@@ -12565,7 +12597,7 @@
       </w:r>
     </w:p>
   </w:comment>
-  <w:comment w:id="35" w:author="Tommy Descartes" w:date="2026-05-20T19:07:00Z" w:initials="TD">
+  <w:comment w:id="37" w:author="Tommy Descartes" w:date="2026-05-20T19:07:00Z" w:initials="TD">
     <w:p>
       <w:pPr>
         <w:pStyle w:val="CommentText"/>
@@ -12581,7 +12613,7 @@
       </w:r>
     </w:p>
   </w:comment>
-  <w:comment w:id="36" w:author="Tommy Descartes" w:date="2026-05-20T18:28:00Z" w:initials="TD">
+  <w:comment w:id="38" w:author="Tommy Descartes" w:date="2026-05-20T18:28:00Z" w:initials="TD">
     <w:p>
       <w:pPr>
         <w:pStyle w:val="CommentText"/>
@@ -12597,7 +12629,7 @@
       </w:r>
     </w:p>
   </w:comment>
-  <w:comment w:id="37" w:author="Tommy Descartes" w:date="2026-05-20T18:29:00Z" w:initials="TD">
+  <w:comment w:id="39" w:author="Tommy Descartes" w:date="2026-05-20T18:29:00Z" w:initials="TD">
     <w:p>
       <w:pPr>
         <w:pStyle w:val="CommentText"/>

</xml_diff>

<commit_message>
Updated Macroeconomic and Demographic Context Report
</commit_message>
<xml_diff>
--- a/report/draft/Macroeconomic and Demographic Context Version 1.docx
+++ b/report/draft/Macroeconomic and Demographic Context Version 1.docx
@@ -2493,6 +2493,9 @@
         </w:rPr>
       </w:pPr>
       <w:r>
+        <w:rPr>
+          <w:noProof/>
+        </w:rPr>
         <w:drawing>
           <wp:inline distT="0" distB="0" distL="0" distR="0" wp14:anchorId="148882CC" wp14:editId="540E7804">
             <wp:extent cx="5943600" cy="4272915"/>
@@ -2966,6 +2969,7 @@
       <w:r>
         <w:rPr>
           <w:rFonts w:cs="Calibri"/>
+          <w:noProof/>
         </w:rPr>
         <w:drawing>
           <wp:inline distT="0" distB="0" distL="0" distR="0" wp14:anchorId="32B094C0" wp14:editId="23BBFBC6">
@@ -3123,8 +3127,20 @@
       <w:r>
         <w:rPr>
           <w:rFonts w:cs="Calibri"/>
-        </w:rPr>
-        <w:t>Panel 2 complements this structural analysis by examining the contribution of sectors to real GDP growth across successive five-year periods. The figure reveals a clear deceleration in long-run economic growth over time. The strongest growth performance occurred during the late 1980s and 1990s, when average real GDP growth exceeded 5 percent and contributions were relatively broad-based across multiple sectors. During this period, the economy benefited from stronger contributions from the primary sector, secondary activities, wholesale and retail trade, and services. This likely reflected a combination of agricultural expansion, tourism growth, investment inflows, and broader macroeconomic stabilization.</w:t>
+          <w:highlight w:val="yellow"/>
+          <w:rPrChange w:id="7" w:author="Tommy Descartes" w:date="2026-05-28T08:48:00Z" w16du:dateUtc="2026-05-28T12:48:00Z">
+            <w:rPr>
+              <w:rFonts w:cs="Calibri"/>
+            </w:rPr>
+          </w:rPrChange>
+        </w:rPr>
+        <w:t>Panel 2 complements this structural analysis by examining the contribution of sectors to real GDP growth across successive five-year periods.</w:t>
+      </w:r>
+      <w:r>
+        <w:rPr>
+          <w:rFonts w:cs="Calibri"/>
+        </w:rPr>
+        <w:t xml:space="preserve"> The figure reveals a clear deceleration in long-run economic growth over time. The strongest growth performance occurred during the late 1980s and 1990s, when average real GDP growth exceeded 5 percent and contributions were relatively broad-based across multiple sectors. During this period, the economy benefited from stronger contributions from the primary sector, secondary activities, wholesale and retail trade, and services. This likely reflected a combination of agricultural expansion, tourism growth, investment inflows, and broader macroeconomic stabilization.</w:t>
       </w:r>
     </w:p>
     <w:p>
@@ -3228,14 +3244,20 @@
         <w:rPr>
           <w:rFonts w:cs="Calibri"/>
         </w:rPr>
-        <w:t xml:space="preserve">Overall, the evidence from the two panels suggests that Belize’s development trajectory has been characterized by services-led structural transformation combined with limited industrial deepening and slowing long-run growth performance. While the expansion of services has </w:t>
+        <w:t>Taken together</w:t>
+      </w:r>
+      <w:r>
+        <w:rPr>
+          <w:rFonts w:cs="Calibri"/>
+        </w:rPr>
+        <w:t xml:space="preserve">, the evidence from the two panels suggests that Belize’s development trajectory has been characterized by services-led structural transformation combined with limited industrial deepening and slowing long-run growth performance. While the expansion of </w:t>
       </w:r>
       <w:r>
         <w:rPr>
           <w:rFonts w:cs="Calibri"/>
         </w:rPr>
         <w:lastRenderedPageBreak/>
-        <w:t>supported employment creation and economic diversification away from traditional agriculture, the economy remains highly dependent on tourism and domestic services activity. This pattern may help explain the weakening contribution of productivity growth observed in the broader growth accounting analysis and underscores the importance of policies aimed at enhancing productive capacity, export sophistication, resilience, and technological upgrading.</w:t>
+        <w:t>services has supported employment creation and economic diversification away from traditional agriculture, the economy remains highly dependent on tourism and domestic services activity. This pattern may help explain the weakening contribution of productivity growth observed in the broader growth accounting analysis and underscores the importance of policies aimed at enhancing productive capacity, export sophistication, resilience, and technological upgrading.</w:t>
       </w:r>
     </w:p>
     <w:p>
@@ -3280,7 +3302,7 @@
           <w:rFonts w:cs="Calibri"/>
         </w:rPr>
       </w:pPr>
-      <w:commentRangeStart w:id="7"/>
+      <w:commentRangeStart w:id="8"/>
       <w:r>
         <w:rPr>
           <w:rFonts w:cs="Calibri"/>
@@ -3294,7 +3316,7 @@
         </w:rPr>
         <w:t xml:space="preserve"> </w:t>
       </w:r>
-      <w:commentRangeEnd w:id="7"/>
+      <w:commentRangeEnd w:id="8"/>
       <w:r>
         <w:rPr>
           <w:rStyle w:val="CommentReference"/>
@@ -3302,7 +3324,7 @@
           <w:sz w:val="22"/>
           <w:szCs w:val="22"/>
         </w:rPr>
-        <w:commentReference w:id="7"/>
+        <w:commentReference w:id="8"/>
       </w:r>
       <w:r>
         <w:rPr>
@@ -3415,7 +3437,7 @@
         </w:rPr>
         <w:t xml:space="preserve"> </w:t>
       </w:r>
-      <w:commentRangeStart w:id="8"/>
+      <w:commentRangeStart w:id="9"/>
       <w:r>
         <w:rPr>
           <w:rFonts w:cs="Calibri"/>
@@ -3476,7 +3498,7 @@
         </w:rPr>
         <w:t>2025 and is projected to increase to approximately 53.7% by 2035.</w:t>
       </w:r>
-      <w:commentRangeEnd w:id="8"/>
+      <w:commentRangeEnd w:id="9"/>
       <w:r>
         <w:rPr>
           <w:rStyle w:val="CommentReference"/>
@@ -3484,7 +3506,7 @@
           <w:sz w:val="22"/>
           <w:szCs w:val="22"/>
         </w:rPr>
-        <w:commentReference w:id="8"/>
+        <w:commentReference w:id="9"/>
       </w:r>
       <w:r>
         <w:rPr>
@@ -3717,7 +3739,7 @@
         </w:rPr>
         <w:t xml:space="preserve">ravel receipts have become an increasingly important component of Belize’s external services account, rising from </w:t>
       </w:r>
-      <w:commentRangeStart w:id="9"/>
+      <w:commentRangeStart w:id="10"/>
       <w:r>
         <w:rPr>
           <w:rFonts w:cs="Calibri"/>
@@ -3736,7 +3758,7 @@
         </w:rPr>
         <w:t xml:space="preserve"> in 2024.</w:t>
       </w:r>
-      <w:commentRangeEnd w:id="9"/>
+      <w:commentRangeEnd w:id="10"/>
       <w:r>
         <w:rPr>
           <w:rStyle w:val="CommentReference"/>
@@ -3744,7 +3766,7 @@
           <w:sz w:val="22"/>
           <w:szCs w:val="22"/>
         </w:rPr>
-        <w:commentReference w:id="9"/>
+        <w:commentReference w:id="10"/>
       </w:r>
       <w:r>
         <w:rPr>
@@ -3909,8 +3931,8 @@
           <w:szCs w:val="22"/>
         </w:rPr>
       </w:pPr>
-      <w:commentRangeStart w:id="10"/>
       <w:commentRangeStart w:id="11"/>
+      <w:commentRangeStart w:id="12"/>
       <w:r>
         <w:rPr>
           <w:b/>
@@ -4038,7 +4060,7 @@
         </w:rPr>
         <w:t>Avg. Contribution to Real GDP)</w:t>
       </w:r>
-      <w:commentRangeEnd w:id="10"/>
+      <w:commentRangeEnd w:id="11"/>
       <w:r>
         <w:rPr>
           <w:rStyle w:val="CommentReference"/>
@@ -4049,9 +4071,9 @@
           <w:sz w:val="22"/>
           <w:szCs w:val="22"/>
         </w:rPr>
-        <w:commentReference w:id="10"/>
-      </w:r>
-      <w:commentRangeEnd w:id="11"/>
+        <w:commentReference w:id="11"/>
+      </w:r>
+      <w:commentRangeEnd w:id="12"/>
       <w:r>
         <w:rPr>
           <w:rStyle w:val="CommentReference"/>
@@ -4062,7 +4084,7 @@
           <w:sz w:val="22"/>
           <w:szCs w:val="22"/>
         </w:rPr>
-        <w:commentReference w:id="11"/>
+        <w:commentReference w:id="12"/>
       </w:r>
     </w:p>
     <w:p>
@@ -4077,6 +4099,7 @@
       <w:r>
         <w:rPr>
           <w:rFonts w:cs="Calibri"/>
+          <w:noProof/>
         </w:rPr>
         <w:drawing>
           <wp:inline distT="0" distB="0" distL="0" distR="0" wp14:anchorId="2188AFB4" wp14:editId="5AF51BEB">
@@ -4138,7 +4161,7 @@
         <w:rPr>
           <w:rFonts w:cs="Calibri"/>
         </w:rPr>
-        <w:t>Economic growth accelerated substantially during the 1985-89 and 1990-94 periods, representing the strongest growth episode. This expansion was driven overwhelmingly by physical capital accumulation, particularly during the 1990-94 period when capital contributed more than seven percentage points to annual GDP growth. The surge in capital accumulation likely reflected significant investment in tourism infrastructure, utilities, transportation and expansion in both public and private capital formation. Labour contributions also strengthened steadily during this period, reflecting stronger employment absorption associated with tourism expansion, agricultural activity and service sector growth. Importantly, TFP became strongly positive during the late 1980s, indicating that growth was not solely driven by factor accumulation, but also driven by productive efficiency, structural modernization and improvement in economic organization.</w:t>
+        <w:t>Economic growth accelerated during the 1985-89 and 1990-94 periods, representing the strongest growth episode. This expansion was driven overwhelmingly by physical capital accumulation, particularly during the 1990-94 period when capital contributed more than seven percentage points to annual GDP growth. The surge in capital accumulation likely reflected significant investment in tourism infrastructure, utilities, transportation and expansion in both public and private capital formation. Labour contributions also strengthened steadily during this period, reflecting stronger employment absorption associated with tourism expansion, agricultural activity and service sector growth. Importantly, TFP became strongly positive during the late 1980s, indicating that growth was not solely driven by factor accumulation, but also driven by productive efficiency, structural modernization and improvement in economic organization.</w:t>
       </w:r>
       <w:r>
         <w:rPr>
@@ -4653,6 +4676,7 @@
       <w:r>
         <w:rPr>
           <w:rFonts w:cs="Calibri"/>
+          <w:noProof/>
         </w:rPr>
         <w:drawing>
           <wp:inline distT="0" distB="0" distL="0" distR="0" wp14:anchorId="6827EDC6" wp14:editId="087D42B6">
@@ -4742,14 +4766,54 @@
           <w:rFonts w:cs="Calibri"/>
         </w:rPr>
       </w:pPr>
-      <w:commentRangeStart w:id="12"/>
       <w:commentRangeStart w:id="13"/>
+      <w:commentRangeStart w:id="14"/>
       <w:r>
         <w:rPr>
           <w:rFonts w:cs="Calibri"/>
         </w:rPr>
         <w:t xml:space="preserve">Comparator economies such as Costa Rica, the Dominican Republic, and Mauritius provide </w:t>
       </w:r>
+      <w:commentRangeEnd w:id="14"/>
+      <w:r>
+        <w:rPr>
+          <w:rStyle w:val="CommentReference"/>
+          <w:rFonts w:cs="Calibri"/>
+          <w:sz w:val="22"/>
+          <w:szCs w:val="22"/>
+        </w:rPr>
+        <w:commentReference w:id="14"/>
+      </w:r>
+      <w:r>
+        <w:rPr>
+          <w:rFonts w:cs="Calibri"/>
+        </w:rPr>
+        <w:t xml:space="preserve">a useful benchmark for assessing Belize’s long-term growth trajectory, given their shared structural characteristics as small open economies with varying degrees of tourism dependence and external vulnerability. </w:t>
+      </w:r>
+      <w:r>
+        <w:rPr>
+          <w:rFonts w:cs="Calibri"/>
+        </w:rPr>
+        <w:t>Real g</w:t>
+      </w:r>
+      <w:r>
+        <w:rPr>
+          <w:rFonts w:cs="Calibri"/>
+        </w:rPr>
+        <w:t xml:space="preserve">ross national income (GNI) per capita in Belize, measured in purchasing power parity (PPP) adjusted constant international dollars, has remained broadly stagnant over the past three decades. Between 1991 and 2024, the country’s </w:t>
+      </w:r>
+      <w:r>
+        <w:rPr>
+          <w:rFonts w:cs="Calibri"/>
+        </w:rPr>
+        <w:t xml:space="preserve">real </w:t>
+      </w:r>
+      <w:r>
+        <w:rPr>
+          <w:rFonts w:cs="Calibri"/>
+        </w:rPr>
+        <w:t xml:space="preserve">GNI grew by only 19.3%, reflecting the presence of a persistent middle-income trap dynamics, which is limiting long-term income convergence relative to the selected comparator countries. </w:t>
+      </w:r>
       <w:commentRangeEnd w:id="13"/>
       <w:r>
         <w:rPr>
@@ -4759,46 +4823,6 @@
           <w:szCs w:val="22"/>
         </w:rPr>
         <w:commentReference w:id="13"/>
-      </w:r>
-      <w:r>
-        <w:rPr>
-          <w:rFonts w:cs="Calibri"/>
-        </w:rPr>
-        <w:t xml:space="preserve">a useful benchmark for assessing Belize’s long-term growth trajectory, given their shared structural characteristics as small open economies with varying degrees of tourism dependence and external vulnerability. </w:t>
-      </w:r>
-      <w:r>
-        <w:rPr>
-          <w:rFonts w:cs="Calibri"/>
-        </w:rPr>
-        <w:t>Real g</w:t>
-      </w:r>
-      <w:r>
-        <w:rPr>
-          <w:rFonts w:cs="Calibri"/>
-        </w:rPr>
-        <w:t xml:space="preserve">ross national income (GNI) per capita in Belize, measured in purchasing power parity (PPP) adjusted constant international dollars, has remained broadly stagnant over the past three decades. Between 1991 and 2024, the country’s </w:t>
-      </w:r>
-      <w:r>
-        <w:rPr>
-          <w:rFonts w:cs="Calibri"/>
-        </w:rPr>
-        <w:t xml:space="preserve">real </w:t>
-      </w:r>
-      <w:r>
-        <w:rPr>
-          <w:rFonts w:cs="Calibri"/>
-        </w:rPr>
-        <w:t xml:space="preserve">GNI grew by only 19.3%, reflecting the presence of a persistent middle-income trap dynamics, which is limiting long-term income convergence relative to the selected comparator countries. </w:t>
-      </w:r>
-      <w:commentRangeEnd w:id="12"/>
-      <w:r>
-        <w:rPr>
-          <w:rStyle w:val="CommentReference"/>
-          <w:rFonts w:cs="Calibri"/>
-          <w:sz w:val="22"/>
-          <w:szCs w:val="22"/>
-        </w:rPr>
-        <w:commentReference w:id="12"/>
       </w:r>
     </w:p>
     <w:p>
@@ -5063,7 +5087,7 @@
           <w:szCs w:val="22"/>
         </w:rPr>
       </w:pPr>
-      <w:commentRangeStart w:id="14"/>
+      <w:commentRangeStart w:id="15"/>
       <w:r>
         <w:rPr>
           <w:rFonts w:cs="Calibri"/>
@@ -5178,7 +5202,7 @@
         </w:rPr>
         <w:t xml:space="preserve">Gross National Income Per Capita, PPP (Constant 2021 Internation $) </w:t>
       </w:r>
-      <w:commentRangeEnd w:id="14"/>
+      <w:commentRangeEnd w:id="15"/>
       <w:r>
         <w:rPr>
           <w:rStyle w:val="CommentReference"/>
@@ -5190,7 +5214,7 @@
           <w:sz w:val="22"/>
           <w:szCs w:val="22"/>
         </w:rPr>
-        <w:commentReference w:id="14"/>
+        <w:commentReference w:id="15"/>
       </w:r>
     </w:p>
     <w:p>
@@ -5459,7 +5483,7 @@
         </w:rPr>
         <w:t xml:space="preserve"> </w:t>
       </w:r>
-      <w:commentRangeStart w:id="15"/>
+      <w:commentRangeStart w:id="16"/>
       <w:r>
         <w:rPr>
           <w:rFonts w:ascii="Trebuchet MS" w:hAnsi="Trebuchet MS"/>
@@ -5490,7 +5514,7 @@
         </w:rPr>
         <w:t>Trends</w:t>
       </w:r>
-      <w:commentRangeEnd w:id="15"/>
+      <w:commentRangeEnd w:id="16"/>
       <w:r>
         <w:rPr>
           <w:rStyle w:val="CommentReference"/>
@@ -5500,7 +5524,7 @@
           <w:sz w:val="28"/>
           <w:szCs w:val="28"/>
         </w:rPr>
-        <w:commentReference w:id="15"/>
+        <w:commentReference w:id="16"/>
       </w:r>
     </w:p>
     <w:p>
@@ -5525,14 +5549,14 @@
           <w:rFonts w:cs="Calibri"/>
         </w:rPr>
       </w:pPr>
-      <w:commentRangeStart w:id="16"/>
+      <w:commentRangeStart w:id="17"/>
       <w:r>
         <w:rPr>
           <w:rFonts w:cs="Calibri"/>
         </w:rPr>
         <w:t xml:space="preserve">Belize’s estimated mid-year population in 2026 stood at </w:t>
       </w:r>
-      <w:commentRangeStart w:id="17"/>
+      <w:commentRangeStart w:id="18"/>
       <w:r>
         <w:rPr>
           <w:rFonts w:cs="Calibri"/>
@@ -5545,6 +5569,28 @@
         </w:rPr>
         <w:t>, comprising 210,525 males and 217,869 females,</w:t>
       </w:r>
+      <w:commentRangeEnd w:id="18"/>
+      <w:r>
+        <w:rPr>
+          <w:rStyle w:val="CommentReference"/>
+          <w:rFonts w:cs="Calibri"/>
+          <w:sz w:val="22"/>
+          <w:szCs w:val="22"/>
+        </w:rPr>
+        <w:commentReference w:id="18"/>
+      </w:r>
+      <w:r>
+        <w:rPr>
+          <w:rFonts w:cs="Calibri"/>
+        </w:rPr>
+        <w:t xml:space="preserve"> implying a gender ratio of approximately 96.6 males per 100 females</w:t>
+      </w:r>
+      <w:r>
+        <w:rPr>
+          <w:rFonts w:cs="Calibri"/>
+        </w:rPr>
+        <w:t xml:space="preserve">. </w:t>
+      </w:r>
       <w:commentRangeEnd w:id="17"/>
       <w:r>
         <w:rPr>
@@ -5559,15 +5605,34 @@
         <w:rPr>
           <w:rFonts w:cs="Calibri"/>
         </w:rPr>
-        <w:t xml:space="preserve"> implying a gender ratio of approximately 96.6 males per 100 females</w:t>
-      </w:r>
-      <w:r>
-        <w:rPr>
-          <w:rFonts w:cs="Calibri"/>
-        </w:rPr>
-        <w:t xml:space="preserve">. </w:t>
-      </w:r>
-      <w:commentRangeEnd w:id="16"/>
+        <w:t xml:space="preserve">Between 2015 and 2026, </w:t>
+      </w:r>
+      <w:commentRangeStart w:id="19"/>
+      <w:r>
+        <w:rPr>
+          <w:rFonts w:cs="Calibri"/>
+        </w:rPr>
+        <w:t xml:space="preserve">the Belizean population grew from 356,705 to 426,368, representing cumulative growth of 19.5% or an additional  69,663 persons over the period. This corresponds to an average </w:t>
+      </w:r>
+      <w:r>
+        <w:rPr>
+          <w:rFonts w:cs="Calibri"/>
+        </w:rPr>
+        <w:t>annual</w:t>
+      </w:r>
+      <w:r>
+        <w:rPr>
+          <w:rFonts w:cs="Calibri"/>
+        </w:rPr>
+        <w:t xml:space="preserve"> population growth rate of approximately 1.6%.</w:t>
+      </w:r>
+      <w:r>
+        <w:rPr>
+          <w:rFonts w:cs="Calibri"/>
+        </w:rPr>
+        <w:t xml:space="preserve"> </w:t>
+      </w:r>
+      <w:commentRangeEnd w:id="19"/>
       <w:r>
         <w:rPr>
           <w:rStyle w:val="CommentReference"/>
@@ -5575,48 +5640,7 @@
           <w:sz w:val="22"/>
           <w:szCs w:val="22"/>
         </w:rPr>
-        <w:commentReference w:id="16"/>
-      </w:r>
-      <w:r>
-        <w:rPr>
-          <w:rFonts w:cs="Calibri"/>
-        </w:rPr>
-        <w:t xml:space="preserve">Between 2015 and 2026, </w:t>
-      </w:r>
-      <w:commentRangeStart w:id="18"/>
-      <w:r>
-        <w:rPr>
-          <w:rFonts w:cs="Calibri"/>
-        </w:rPr>
-        <w:t xml:space="preserve">the Belizean population grew from 356,705 to 426,368, representing cumulative growth of 19.5% or an additional  69,663 persons over the period. This corresponds to an average </w:t>
-      </w:r>
-      <w:r>
-        <w:rPr>
-          <w:rFonts w:cs="Calibri"/>
-        </w:rPr>
-        <w:t>annual</w:t>
-      </w:r>
-      <w:r>
-        <w:rPr>
-          <w:rFonts w:cs="Calibri"/>
-        </w:rPr>
-        <w:t xml:space="preserve"> population growth rate of approximately 1.6%.</w:t>
-      </w:r>
-      <w:r>
-        <w:rPr>
-          <w:rFonts w:cs="Calibri"/>
-        </w:rPr>
-        <w:t xml:space="preserve"> </w:t>
-      </w:r>
-      <w:commentRangeEnd w:id="18"/>
-      <w:r>
-        <w:rPr>
-          <w:rStyle w:val="CommentReference"/>
-          <w:rFonts w:cs="Calibri"/>
-          <w:sz w:val="22"/>
-          <w:szCs w:val="22"/>
-        </w:rPr>
-        <w:commentReference w:id="18"/>
+        <w:commentReference w:id="19"/>
       </w:r>
     </w:p>
     <w:p>
@@ -5660,14 +5684,14 @@
         </w:rPr>
         <w:t xml:space="preserve">small developing </w:t>
       </w:r>
-      <w:commentRangeStart w:id="19"/>
+      <w:commentRangeStart w:id="20"/>
       <w:r>
         <w:rPr>
           <w:rFonts w:cs="Calibri"/>
         </w:rPr>
         <w:t>states</w:t>
       </w:r>
-      <w:commentRangeEnd w:id="19"/>
+      <w:commentRangeEnd w:id="20"/>
       <w:r>
         <w:rPr>
           <w:rStyle w:val="CommentReference"/>
@@ -5675,7 +5699,7 @@
           <w:sz w:val="22"/>
           <w:szCs w:val="22"/>
         </w:rPr>
-        <w:commentReference w:id="19"/>
+        <w:commentReference w:id="20"/>
       </w:r>
       <w:r>
         <w:rPr>
@@ -5689,7 +5713,7 @@
         </w:rPr>
         <w:t xml:space="preserve"> is becoming increasingly ruralized. </w:t>
       </w:r>
-      <w:commentRangeStart w:id="20"/>
+      <w:commentRangeStart w:id="21"/>
       <w:r>
         <w:rPr>
           <w:rFonts w:cs="Calibri"/>
@@ -5726,7 +5750,7 @@
         </w:rPr>
         <w:t xml:space="preserve"> several districts emerging as key labour supply centers</w:t>
       </w:r>
-      <w:commentRangeEnd w:id="20"/>
+      <w:commentRangeEnd w:id="21"/>
       <w:r>
         <w:rPr>
           <w:rStyle w:val="CommentReference"/>
@@ -5734,7 +5758,7 @@
           <w:sz w:val="22"/>
           <w:szCs w:val="22"/>
         </w:rPr>
-        <w:commentReference w:id="20"/>
+        <w:commentReference w:id="21"/>
       </w:r>
       <w:r>
         <w:rPr>
@@ -5798,7 +5822,7 @@
         </w:rPr>
         <w:t xml:space="preserve"> </w:t>
       </w:r>
-      <w:commentRangeStart w:id="21"/>
+      <w:commentRangeStart w:id="22"/>
       <w:r>
         <w:rPr>
           <w:rFonts w:cs="Calibri"/>
@@ -5817,7 +5841,7 @@
         </w:rPr>
         <w:t xml:space="preserve">  </w:t>
       </w:r>
-      <w:commentRangeEnd w:id="21"/>
+      <w:commentRangeEnd w:id="22"/>
       <w:r>
         <w:rPr>
           <w:rStyle w:val="CommentReference"/>
@@ -5825,7 +5849,7 @@
           <w:sz w:val="22"/>
           <w:szCs w:val="22"/>
         </w:rPr>
-        <w:commentReference w:id="21"/>
+        <w:commentReference w:id="22"/>
       </w:r>
     </w:p>
     <w:p>
@@ -5899,14 +5923,14 @@
         </w:rPr>
         <w:t xml:space="preserve"> pressures on the economy’s capacity to generate productive employment opportunities, particularly for youth entering the labor market. At the same time, </w:t>
       </w:r>
-      <w:commentRangeStart w:id="22"/>
+      <w:commentRangeStart w:id="23"/>
       <w:r>
         <w:rPr>
           <w:rFonts w:cs="Calibri"/>
         </w:rPr>
         <w:t>sustained population growth raises demand for housing, education, healthcare, transportation, and other public infrastructure</w:t>
       </w:r>
-      <w:commentRangeEnd w:id="22"/>
+      <w:commentRangeEnd w:id="23"/>
       <w:r>
         <w:rPr>
           <w:rStyle w:val="CommentReference"/>
@@ -5914,7 +5938,7 @@
           <w:sz w:val="22"/>
           <w:szCs w:val="22"/>
         </w:rPr>
-        <w:commentReference w:id="22"/>
+        <w:commentReference w:id="23"/>
       </w:r>
       <w:r>
         <w:rPr>
@@ -6020,7 +6044,7 @@
           <w:rFonts w:cs="Calibri"/>
         </w:rPr>
       </w:pPr>
-      <w:commentRangeStart w:id="23"/>
+      <w:commentRangeStart w:id="24"/>
       <w:r>
         <w:rPr>
           <w:rFonts w:cs="Calibri"/>
@@ -6046,7 +6070,7 @@
         </w:rPr>
         <w:t>, reflecting a relatively youthful demographic structure. The dependency burden is concentrated among the younger cohort of the population, as evidenced by a youth dependence ratio of 43.8%, while the old-age dependency ratio is comparatively low at 10.9</w:t>
       </w:r>
-      <w:commentRangeEnd w:id="23"/>
+      <w:commentRangeEnd w:id="24"/>
       <w:r>
         <w:rPr>
           <w:rStyle w:val="CommentReference"/>
@@ -6054,7 +6078,7 @@
           <w:sz w:val="22"/>
           <w:szCs w:val="22"/>
         </w:rPr>
-        <w:commentReference w:id="23"/>
+        <w:commentReference w:id="24"/>
       </w:r>
       <w:r>
         <w:rPr>
@@ -6169,7 +6193,7 @@
           <w:szCs w:val="22"/>
         </w:rPr>
       </w:pPr>
-      <w:commentRangeStart w:id="24"/>
+      <w:commentRangeStart w:id="25"/>
       <w:r>
         <w:rPr>
           <w:rFonts w:cs="Calibri"/>
@@ -6256,7 +6280,7 @@
         </w:rPr>
         <w:t xml:space="preserve">: </w:t>
       </w:r>
-      <w:commentRangeEnd w:id="24"/>
+      <w:commentRangeEnd w:id="25"/>
       <w:r>
         <w:rPr>
           <w:rStyle w:val="CommentReference"/>
@@ -6268,7 +6292,7 @@
           <w:sz w:val="22"/>
           <w:szCs w:val="22"/>
         </w:rPr>
-        <w:commentReference w:id="24"/>
+        <w:commentReference w:id="25"/>
       </w:r>
     </w:p>
     <w:p>
@@ -6430,7 +6454,7 @@
         </w:rPr>
         <w:t xml:space="preserve"> </w:t>
       </w:r>
-      <w:commentRangeStart w:id="25"/>
+      <w:commentRangeStart w:id="26"/>
       <w:r>
         <w:rPr>
           <w:rFonts w:cs="Calibri"/>
@@ -6461,7 +6485,7 @@
         </w:rPr>
         <w:t xml:space="preserve"> are macro-critical, as it can weaken human capital deepening and constrain domestic labour market dynamism.</w:t>
       </w:r>
-      <w:commentRangeEnd w:id="25"/>
+      <w:commentRangeEnd w:id="26"/>
       <w:r>
         <w:rPr>
           <w:rStyle w:val="CommentReference"/>
@@ -6469,7 +6493,7 @@
           <w:sz w:val="22"/>
           <w:szCs w:val="22"/>
         </w:rPr>
-        <w:commentReference w:id="25"/>
+        <w:commentReference w:id="26"/>
       </w:r>
     </w:p>
     <w:p>
@@ -6637,7 +6661,7 @@
           <w:szCs w:val="22"/>
         </w:rPr>
       </w:pPr>
-      <w:commentRangeStart w:id="26"/>
+      <w:commentRangeStart w:id="27"/>
       <w:r>
         <w:rPr>
           <w:b/>
@@ -6744,7 +6768,7 @@
         </w:rPr>
         <w:t>Belize Demographic Transition, 2015-2025</w:t>
       </w:r>
-      <w:commentRangeEnd w:id="26"/>
+      <w:commentRangeEnd w:id="27"/>
       <w:r>
         <w:rPr>
           <w:rStyle w:val="CommentReference"/>
@@ -6755,7 +6779,7 @@
           <w:sz w:val="22"/>
           <w:szCs w:val="22"/>
         </w:rPr>
-        <w:commentReference w:id="26"/>
+        <w:commentReference w:id="27"/>
       </w:r>
     </w:p>
     <w:p>
@@ -7006,14 +7030,14 @@
         </w:rPr>
         <w:t xml:space="preserve"> likely reflects expanding economic opportunities associated with the growth of the tourism sector as well as inward migration from neighbouring Central American countries. Net migration flows strengthened during the 2000s, contributing to the expansion of the labour force and total population growth. Migration patterns, however, remain highly sensitive to economic conditions, </w:t>
       </w:r>
-      <w:commentRangeStart w:id="27"/>
+      <w:commentRangeStart w:id="28"/>
       <w:r>
         <w:rPr>
           <w:rFonts w:cs="Calibri"/>
         </w:rPr>
         <w:t>as evidenced by the sharp decline during the COVID-19 pandemic and the subsequent rebound in 2022</w:t>
       </w:r>
-      <w:commentRangeEnd w:id="27"/>
+      <w:commentRangeEnd w:id="28"/>
       <w:r>
         <w:rPr>
           <w:rStyle w:val="CommentReference"/>
@@ -7021,7 +7045,7 @@
           <w:sz w:val="22"/>
           <w:szCs w:val="22"/>
         </w:rPr>
-        <w:commentReference w:id="27"/>
+        <w:commentReference w:id="28"/>
       </w:r>
       <w:r>
         <w:rPr>
@@ -7528,7 +7552,7 @@
           <w:szCs w:val="28"/>
         </w:rPr>
       </w:pPr>
-      <w:commentRangeStart w:id="28"/>
+      <w:commentRangeStart w:id="29"/>
       <w:r>
         <w:rPr>
           <w:rFonts w:ascii="Trebuchet MS" w:hAnsi="Trebuchet MS"/>
@@ -7540,7 +7564,7 @@
         <w:lastRenderedPageBreak/>
         <w:t>Labour Market Assessment</w:t>
       </w:r>
-      <w:commentRangeEnd w:id="28"/>
+      <w:commentRangeEnd w:id="29"/>
       <w:r>
         <w:rPr>
           <w:rStyle w:val="CommentReference"/>
@@ -7550,7 +7574,7 @@
           <w:sz w:val="28"/>
           <w:szCs w:val="28"/>
         </w:rPr>
-        <w:commentReference w:id="28"/>
+        <w:commentReference w:id="29"/>
       </w:r>
     </w:p>
     <w:bookmarkEnd w:id="0"/>
@@ -8142,7 +8166,7 @@
           <w:rFonts w:cs="Aptos Serif"/>
         </w:rPr>
       </w:pPr>
-      <w:commentRangeStart w:id="29"/>
+      <w:commentRangeStart w:id="30"/>
       <w:r>
         <w:rPr>
           <w:rFonts w:cs="Aptos Serif"/>
@@ -8271,7 +8295,7 @@
         </w:rPr>
         <w:t xml:space="preserve"> The population with secondary education increased from 50,037 persons in 2015 to 70,051 persons in 2024, equivalent to 40.0%. Similarly, the number of persons with tertiary education expanded from 35,229 to 54,025 over the same period, representing an increase of nearly 53.4%. This growth in tertiary education attainment suggests a gradual deepening of Belize’s skilled labour force and may reflect expanded access to higher education, increased educational participation and changing labour market demands.</w:t>
       </w:r>
-      <w:commentRangeEnd w:id="29"/>
+      <w:commentRangeEnd w:id="30"/>
       <w:r>
         <w:rPr>
           <w:rStyle w:val="CommentReference"/>
@@ -8279,7 +8303,7 @@
           <w:sz w:val="22"/>
           <w:szCs w:val="22"/>
         </w:rPr>
-        <w:commentReference w:id="29"/>
+        <w:commentReference w:id="30"/>
       </w:r>
     </w:p>
     <w:p>
@@ -10591,7 +10615,7 @@
                 <w:szCs w:val="20"/>
               </w:rPr>
             </w:pPr>
-            <w:commentRangeStart w:id="30"/>
+            <w:commentRangeStart w:id="31"/>
             <w:r>
               <w:rPr>
                 <w:rFonts w:cs="Calibri"/>
@@ -10618,7 +10642,7 @@
               </w:rPr>
               <w:t xml:space="preserve">175,944 </w:t>
             </w:r>
-            <w:commentRangeEnd w:id="30"/>
+            <w:commentRangeEnd w:id="31"/>
             <w:r>
               <w:rPr>
                 <w:rStyle w:val="CommentReference"/>
@@ -10626,7 +10650,7 @@
                 <w:sz w:val="20"/>
                 <w:szCs w:val="20"/>
               </w:rPr>
-              <w:commentReference w:id="30"/>
+              <w:commentReference w:id="31"/>
             </w:r>
           </w:p>
         </w:tc>
@@ -10791,7 +10815,7 @@
           <w:szCs w:val="24"/>
         </w:rPr>
       </w:pPr>
-      <w:commentRangeStart w:id="31"/>
+      <w:commentRangeStart w:id="32"/>
       <w:r>
         <w:rPr>
           <w:b/>
@@ -10802,7 +10826,7 @@
         <w:lastRenderedPageBreak/>
         <w:t>Gender Participation Gap</w:t>
       </w:r>
-      <w:commentRangeEnd w:id="31"/>
+      <w:commentRangeEnd w:id="32"/>
       <w:r>
         <w:rPr>
           <w:rStyle w:val="CommentReference"/>
@@ -10811,7 +10835,7 @@
           <w:sz w:val="24"/>
           <w:szCs w:val="24"/>
         </w:rPr>
-        <w:commentReference w:id="31"/>
+        <w:commentReference w:id="32"/>
       </w:r>
     </w:p>
     <w:p>
@@ -10922,7 +10946,7 @@
           <w:szCs w:val="22"/>
         </w:rPr>
       </w:pPr>
-      <w:commentRangeStart w:id="32"/>
+      <w:commentRangeStart w:id="33"/>
       <w:r>
         <w:rPr>
           <w:b/>
@@ -11028,7 +11052,7 @@
         </w:rPr>
         <w:t>Belize: Labour Force Participation and Gender Gap</w:t>
       </w:r>
-      <w:commentRangeEnd w:id="32"/>
+      <w:commentRangeEnd w:id="33"/>
       <w:r>
         <w:rPr>
           <w:rStyle w:val="CommentReference"/>
@@ -11039,7 +11063,7 @@
           <w:sz w:val="22"/>
           <w:szCs w:val="22"/>
         </w:rPr>
-        <w:commentReference w:id="32"/>
+        <w:commentReference w:id="33"/>
       </w:r>
     </w:p>
     <w:p>
@@ -11165,14 +11189,14 @@
         <w:lastRenderedPageBreak/>
         <w:t xml:space="preserve">domestic responsibilities, transportation limitations, </w:t>
       </w:r>
-      <w:commentRangeStart w:id="33"/>
+      <w:commentRangeStart w:id="34"/>
       <w:r>
         <w:rPr>
           <w:rFonts w:cs="Calibri"/>
         </w:rPr>
         <w:t xml:space="preserve">occupational segregation, </w:t>
       </w:r>
-      <w:commentRangeEnd w:id="33"/>
+      <w:commentRangeEnd w:id="34"/>
       <w:r>
         <w:rPr>
           <w:rStyle w:val="CommentReference"/>
@@ -11180,7 +11204,7 @@
           <w:sz w:val="22"/>
           <w:szCs w:val="22"/>
         </w:rPr>
-        <w:commentReference w:id="33"/>
+        <w:commentReference w:id="34"/>
       </w:r>
       <w:r>
         <w:rPr>
@@ -12378,14 +12402,14 @@
         </w:rPr>
         <w:t xml:space="preserve">The decline in labour force participation has coincided with a substantial increase in the number </w:t>
       </w:r>
-      <w:commentRangeStart w:id="34"/>
+      <w:commentRangeStart w:id="35"/>
       <w:r>
         <w:rPr>
           <w:rFonts w:cs="Calibri"/>
         </w:rPr>
         <w:t>of persons remaining outside the labour force. The economically inactive working-age population increased from 81,344 persons in September 2019, equivalent to approximately 29.9% of the working-age population, to 130,909 persons by September 2025, representing approximately 41.9% of the working-age population. Overall, the number of economically inactive persons increased by 49,565 persons between 2019 and 2025, equivalent to a cumulative increase of approximately 60.9%.</w:t>
       </w:r>
-      <w:commentRangeEnd w:id="34"/>
+      <w:commentRangeEnd w:id="35"/>
       <w:r>
         <w:rPr>
           <w:rStyle w:val="CommentReference"/>
@@ -12393,7 +12417,7 @@
           <w:sz w:val="22"/>
           <w:szCs w:val="22"/>
         </w:rPr>
-        <w:commentReference w:id="34"/>
+        <w:commentReference w:id="35"/>
       </w:r>
     </w:p>
     <w:p>
@@ -12663,7 +12687,7 @@
           <w:szCs w:val="22"/>
         </w:rPr>
       </w:pPr>
-      <w:commentRangeStart w:id="35"/>
+      <w:commentRangeStart w:id="36"/>
       <w:r>
         <w:rPr>
           <w:b/>
@@ -12675,7 +12699,7 @@
         </w:rPr>
         <w:t>Belize: Persons Outside the Labour Force by Sex</w:t>
       </w:r>
-      <w:commentRangeEnd w:id="35"/>
+      <w:commentRangeEnd w:id="36"/>
       <w:r>
         <w:rPr>
           <w:rStyle w:val="CommentReference"/>
@@ -12686,7 +12710,7 @@
           <w:sz w:val="22"/>
           <w:szCs w:val="22"/>
         </w:rPr>
-        <w:commentReference w:id="35"/>
+        <w:commentReference w:id="36"/>
       </w:r>
     </w:p>
     <w:p>
@@ -12775,7 +12799,7 @@
           <w:rFonts w:cs="Calibri"/>
         </w:rPr>
       </w:pPr>
-      <w:commentRangeStart w:id="36"/>
+      <w:commentRangeStart w:id="37"/>
       <w:r>
         <w:rPr>
           <w:rFonts w:cs="Calibri"/>
@@ -12803,7 +12827,7 @@
         </w:rPr>
         <w:t xml:space="preserve"> </w:t>
       </w:r>
-      <w:commentRangeEnd w:id="36"/>
+      <w:commentRangeEnd w:id="37"/>
       <w:r>
         <w:rPr>
           <w:rStyle w:val="CommentReference"/>
@@ -12811,7 +12835,7 @@
           <w:sz w:val="22"/>
           <w:szCs w:val="22"/>
         </w:rPr>
-        <w:commentReference w:id="36"/>
+        <w:commentReference w:id="37"/>
       </w:r>
       <w:r>
         <w:rPr>
@@ -12841,7 +12865,7 @@
           <w:rFonts w:cs="Calibri"/>
         </w:rPr>
       </w:pPr>
-      <w:commentRangeStart w:id="37"/>
+      <w:commentRangeStart w:id="38"/>
       <w:r>
         <w:rPr>
           <w:rFonts w:cs="Calibri"/>
@@ -12855,7 +12879,7 @@
         <w:lastRenderedPageBreak/>
         <w:t>may constrain labour utilization, productivity growth, household income generation, and the country’s ability to fully capitalize on its demographic dividend. These findings therefore underscore the importance of policies aimed at strengthening female labour market participation through investments in childcare services, transportation infrastructure, skills development, flexible work arrangements, and broader labour market inclusion initiatives.</w:t>
       </w:r>
-      <w:commentRangeEnd w:id="37"/>
+      <w:commentRangeEnd w:id="38"/>
       <w:r>
         <w:rPr>
           <w:rStyle w:val="CommentReference"/>
@@ -12863,7 +12887,7 @@
           <w:sz w:val="22"/>
           <w:szCs w:val="22"/>
         </w:rPr>
-        <w:commentReference w:id="37"/>
+        <w:commentReference w:id="38"/>
       </w:r>
     </w:p>
     <w:p>
@@ -13008,7 +13032,7 @@
       </w:r>
     </w:p>
   </w:comment>
-  <w:comment w:id="7" w:author="Tommy Descartes" w:date="2026-05-25T18:34:00Z" w:initials="TD">
+  <w:comment w:id="8" w:author="Tommy Descartes" w:date="2026-05-25T18:34:00Z" w:initials="TD">
     <w:p>
       <w:pPr>
         <w:pStyle w:val="CommentText"/>
@@ -13024,7 +13048,7 @@
       </w:r>
     </w:p>
   </w:comment>
-  <w:comment w:id="8" w:author="Tommy Descartes" w:date="2026-05-14T10:57:00Z" w:initials="TD">
+  <w:comment w:id="9" w:author="Tommy Descartes" w:date="2026-05-14T10:57:00Z" w:initials="TD">
     <w:p>
       <w:pPr>
         <w:pStyle w:val="CommentText"/>
@@ -13040,7 +13064,7 @@
       </w:r>
     </w:p>
   </w:comment>
-  <w:comment w:id="9" w:author="Tommy Descartes" w:date="2026-05-15T11:54:00Z" w:initials="TD">
+  <w:comment w:id="10" w:author="Tommy Descartes" w:date="2026-05-15T11:54:00Z" w:initials="TD">
     <w:p>
       <w:pPr>
         <w:pStyle w:val="CommentText"/>
@@ -13056,7 +13080,7 @@
       </w:r>
     </w:p>
   </w:comment>
-  <w:comment w:id="10" w:author="Tommy Descartes" w:date="2026-05-25T18:51:00Z" w:initials="TD">
+  <w:comment w:id="11" w:author="Tommy Descartes" w:date="2026-05-25T18:51:00Z" w:initials="TD">
     <w:p>
       <w:pPr>
         <w:pStyle w:val="CommentText"/>
@@ -13072,7 +13096,7 @@
       </w:r>
     </w:p>
   </w:comment>
-  <w:comment w:id="11" w:author="Tommy Descartes" w:date="2026-05-27T12:00:00Z" w:initials="TD">
+  <w:comment w:id="12" w:author="Tommy Descartes" w:date="2026-05-27T12:00:00Z" w:initials="TD">
     <w:p>
       <w:pPr>
         <w:pStyle w:val="CommentText"/>
@@ -13088,7 +13112,7 @@
       </w:r>
     </w:p>
   </w:comment>
-  <w:comment w:id="13" w:author="Tommy Descartes" w:date="2026-05-14T12:09:00Z" w:initials="TD">
+  <w:comment w:id="14" w:author="Tommy Descartes" w:date="2026-05-14T12:09:00Z" w:initials="TD">
     <w:p>
       <w:pPr>
         <w:pStyle w:val="CommentText"/>
@@ -13104,7 +13128,7 @@
       </w:r>
     </w:p>
   </w:comment>
-  <w:comment w:id="12" w:author="Tommy Descartes" w:date="2026-05-13T11:24:00Z" w:initials="TD">
+  <w:comment w:id="13" w:author="Tommy Descartes" w:date="2026-05-13T11:24:00Z" w:initials="TD">
     <w:p>
       <w:pPr>
         <w:pStyle w:val="CommentText"/>
@@ -13120,7 +13144,7 @@
       </w:r>
     </w:p>
   </w:comment>
-  <w:comment w:id="14" w:author="Tommy Descartes" w:date="2026-05-12T17:36:00Z" w:initials="TD">
+  <w:comment w:id="15" w:author="Tommy Descartes" w:date="2026-05-12T17:36:00Z" w:initials="TD">
     <w:p>
       <w:pPr>
         <w:pStyle w:val="CommentText"/>
@@ -13136,7 +13160,7 @@
       </w:r>
     </w:p>
   </w:comment>
-  <w:comment w:id="15" w:author="Tommy Descartes" w:date="2026-05-15T03:16:00Z" w:initials="TD">
+  <w:comment w:id="16" w:author="Tommy Descartes" w:date="2026-05-15T03:16:00Z" w:initials="TD">
     <w:p>
       <w:pPr>
         <w:pStyle w:val="CommentText"/>
@@ -13152,7 +13176,7 @@
       </w:r>
     </w:p>
   </w:comment>
-  <w:comment w:id="17" w:author="Tommy Descartes" w:date="2026-05-17T18:19:00Z" w:initials="TD">
+  <w:comment w:id="18" w:author="Tommy Descartes" w:date="2026-05-17T18:19:00Z" w:initials="TD">
     <w:p>
       <w:pPr>
         <w:pStyle w:val="CommentText"/>
@@ -13168,7 +13192,7 @@
       </w:r>
     </w:p>
   </w:comment>
-  <w:comment w:id="16" w:author="Tommy Descartes" w:date="2026-05-13T08:29:00Z" w:initials="TD">
+  <w:comment w:id="17" w:author="Tommy Descartes" w:date="2026-05-13T08:29:00Z" w:initials="TD">
     <w:p>
       <w:pPr>
         <w:pStyle w:val="CommentText"/>
@@ -13184,7 +13208,7 @@
       </w:r>
     </w:p>
   </w:comment>
-  <w:comment w:id="18" w:author="Tommy Descartes" w:date="2026-05-13T17:55:00Z" w:initials="TD">
+  <w:comment w:id="19" w:author="Tommy Descartes" w:date="2026-05-13T17:55:00Z" w:initials="TD">
     <w:p>
       <w:pPr>
         <w:pStyle w:val="CommentText"/>
@@ -13200,7 +13224,7 @@
       </w:r>
     </w:p>
   </w:comment>
-  <w:comment w:id="19" w:author="Tommy Descartes" w:date="2026-05-14T13:55:00Z" w:initials="TD">
+  <w:comment w:id="20" w:author="Tommy Descartes" w:date="2026-05-14T13:55:00Z" w:initials="TD">
     <w:p>
       <w:pPr>
         <w:pStyle w:val="CommentText"/>
@@ -13216,7 +13240,7 @@
       </w:r>
     </w:p>
   </w:comment>
-  <w:comment w:id="20" w:author="Tommy Descartes" w:date="2026-05-25T19:05:00Z" w:initials="TD">
+  <w:comment w:id="21" w:author="Tommy Descartes" w:date="2026-05-25T19:05:00Z" w:initials="TD">
     <w:p>
       <w:pPr>
         <w:pStyle w:val="CommentText"/>
@@ -13232,7 +13256,7 @@
       </w:r>
     </w:p>
   </w:comment>
-  <w:comment w:id="21" w:author="Tommy Descartes" w:date="2026-05-25T19:06:00Z" w:initials="TD">
+  <w:comment w:id="22" w:author="Tommy Descartes" w:date="2026-05-25T19:06:00Z" w:initials="TD">
     <w:p>
       <w:pPr>
         <w:pStyle w:val="CommentText"/>
@@ -13248,7 +13272,7 @@
       </w:r>
     </w:p>
   </w:comment>
-  <w:comment w:id="22" w:author="Tommy Descartes" w:date="2026-05-13T10:07:00Z" w:initials="TD">
+  <w:comment w:id="23" w:author="Tommy Descartes" w:date="2026-05-13T10:07:00Z" w:initials="TD">
     <w:p>
       <w:pPr>
         <w:pStyle w:val="CommentText"/>
@@ -13264,7 +13288,7 @@
       </w:r>
     </w:p>
   </w:comment>
-  <w:comment w:id="23" w:author="Tommy Descartes" w:date="2026-05-15T03:10:00Z" w:initials="TD">
+  <w:comment w:id="24" w:author="Tommy Descartes" w:date="2026-05-15T03:10:00Z" w:initials="TD">
     <w:p>
       <w:pPr>
         <w:pStyle w:val="CommentText"/>
@@ -13280,7 +13304,7 @@
       </w:r>
     </w:p>
   </w:comment>
-  <w:comment w:id="24" w:author="Tommy Descartes" w:date="2026-05-13T08:23:00Z" w:initials="TD">
+  <w:comment w:id="25" w:author="Tommy Descartes" w:date="2026-05-13T08:23:00Z" w:initials="TD">
     <w:p>
       <w:pPr>
         <w:pStyle w:val="CommentText"/>
@@ -13296,7 +13320,7 @@
       </w:r>
     </w:p>
   </w:comment>
-  <w:comment w:id="25" w:author="Tommy Descartes" w:date="2026-05-15T03:20:00Z" w:initials="TD">
+  <w:comment w:id="26" w:author="Tommy Descartes" w:date="2026-05-15T03:20:00Z" w:initials="TD">
     <w:p>
       <w:pPr>
         <w:pStyle w:val="CommentText"/>
@@ -13312,7 +13336,7 @@
       </w:r>
     </w:p>
   </w:comment>
-  <w:comment w:id="26" w:author="Tommy Descartes" w:date="2026-05-25T19:20:00Z" w:initials="TD">
+  <w:comment w:id="27" w:author="Tommy Descartes" w:date="2026-05-25T19:20:00Z" w:initials="TD">
     <w:p>
       <w:pPr>
         <w:pStyle w:val="CommentText"/>
@@ -13328,7 +13352,7 @@
       </w:r>
     </w:p>
   </w:comment>
-  <w:comment w:id="27" w:author="Tommy Descartes" w:date="2026-05-15T11:29:00Z" w:initials="TD">
+  <w:comment w:id="28" w:author="Tommy Descartes" w:date="2026-05-15T11:29:00Z" w:initials="TD">
     <w:p>
       <w:pPr>
         <w:pStyle w:val="CommentText"/>
@@ -13344,7 +13368,7 @@
       </w:r>
     </w:p>
   </w:comment>
-  <w:comment w:id="28" w:author="Tommy Descartes" w:date="2026-05-17T18:31:00Z" w:initials="TD">
+  <w:comment w:id="29" w:author="Tommy Descartes" w:date="2026-05-17T18:31:00Z" w:initials="TD">
     <w:p>
       <w:pPr>
         <w:pStyle w:val="CommentText"/>
@@ -13373,7 +13397,7 @@
       </w:r>
     </w:p>
   </w:comment>
-  <w:comment w:id="29" w:author="Tommy Descartes" w:date="2026-05-25T19:29:00Z" w:initials="TD">
+  <w:comment w:id="30" w:author="Tommy Descartes" w:date="2026-05-25T19:29:00Z" w:initials="TD">
     <w:p>
       <w:pPr>
         <w:pStyle w:val="CommentText"/>
@@ -13389,7 +13413,7 @@
       </w:r>
     </w:p>
   </w:comment>
-  <w:comment w:id="30" w:author="Tommy Descartes" w:date="2026-05-19T17:04:00Z" w:initials="TD">
+  <w:comment w:id="31" w:author="Tommy Descartes" w:date="2026-05-19T17:04:00Z" w:initials="TD">
     <w:p>
       <w:pPr>
         <w:pStyle w:val="CommentText"/>
@@ -13405,7 +13429,7 @@
       </w:r>
     </w:p>
   </w:comment>
-  <w:comment w:id="31" w:author="Tommy Descartes" w:date="2026-05-23T07:25:00Z" w:initials="TD">
+  <w:comment w:id="32" w:author="Tommy Descartes" w:date="2026-05-23T07:25:00Z" w:initials="TD">
     <w:p>
       <w:pPr>
         <w:pStyle w:val="CommentText"/>
@@ -13421,7 +13445,7 @@
       </w:r>
     </w:p>
   </w:comment>
-  <w:comment w:id="32" w:author="Tommy Descartes" w:date="2026-05-23T07:32:00Z" w:initials="TD">
+  <w:comment w:id="33" w:author="Tommy Descartes" w:date="2026-05-23T07:32:00Z" w:initials="TD">
     <w:p>
       <w:pPr>
         <w:pStyle w:val="CommentText"/>
@@ -13437,7 +13461,7 @@
       </w:r>
     </w:p>
   </w:comment>
-  <w:comment w:id="33" w:author="Tommy Descartes" w:date="2026-05-25T19:35:00Z" w:initials="TD">
+  <w:comment w:id="34" w:author="Tommy Descartes" w:date="2026-05-25T19:35:00Z" w:initials="TD">
     <w:p>
       <w:pPr>
         <w:pStyle w:val="CommentText"/>
@@ -13453,7 +13477,7 @@
       </w:r>
     </w:p>
   </w:comment>
-  <w:comment w:id="34" w:author="Tommy Descartes" w:date="2026-05-20T17:53:00Z" w:initials="TD">
+  <w:comment w:id="35" w:author="Tommy Descartes" w:date="2026-05-20T17:53:00Z" w:initials="TD">
     <w:p>
       <w:pPr>
         <w:pStyle w:val="CommentText"/>
@@ -13469,7 +13493,7 @@
       </w:r>
     </w:p>
   </w:comment>
-  <w:comment w:id="35" w:author="Tommy Descartes" w:date="2026-05-20T19:07:00Z" w:initials="TD">
+  <w:comment w:id="36" w:author="Tommy Descartes" w:date="2026-05-20T19:07:00Z" w:initials="TD">
     <w:p>
       <w:pPr>
         <w:pStyle w:val="CommentText"/>
@@ -13485,7 +13509,7 @@
       </w:r>
     </w:p>
   </w:comment>
-  <w:comment w:id="36" w:author="Tommy Descartes" w:date="2026-05-20T18:28:00Z" w:initials="TD">
+  <w:comment w:id="37" w:author="Tommy Descartes" w:date="2026-05-20T18:28:00Z" w:initials="TD">
     <w:p>
       <w:pPr>
         <w:pStyle w:val="CommentText"/>
@@ -13501,7 +13525,7 @@
       </w:r>
     </w:p>
   </w:comment>
-  <w:comment w:id="37" w:author="Tommy Descartes" w:date="2026-05-20T18:29:00Z" w:initials="TD">
+  <w:comment w:id="38" w:author="Tommy Descartes" w:date="2026-05-20T18:29:00Z" w:initials="TD">
     <w:p>
       <w:pPr>
         <w:pStyle w:val="CommentText"/>
@@ -14668,6 +14692,7 @@
   <w:style w:type="character" w:default="1" w:styleId="DefaultParagraphFont">
     <w:name w:val="Default Paragraph Font"/>
     <w:uiPriority w:val="1"/>
+    <w:semiHidden/>
     <w:unhideWhenUsed/>
   </w:style>
   <w:style w:type="table" w:default="1" w:styleId="TableNormal">

</xml_diff>

<commit_message>
Updated Macroeconomic and Demographic Report
</commit_message>
<xml_diff>
--- a/report/draft/Macroeconomic and Demographic Context Version 1.docx
+++ b/report/draft/Macroeconomic and Demographic Context Version 1.docx
@@ -4380,6 +4380,7 @@
       <w:r>
         <w:rPr>
           <w:rFonts w:cs="Calibri"/>
+          <w:noProof/>
         </w:rPr>
         <w:drawing>
           <wp:inline distT="0" distB="0" distL="0" distR="0" wp14:anchorId="4E9DA8C4" wp14:editId="4DB8F297">
@@ -5341,10 +5342,10 @@
           <w:szCs w:val="24"/>
         </w:rPr>
         <w:drawing>
-          <wp:inline distT="0" distB="0" distL="0" distR="0" wp14:anchorId="4F1A7355" wp14:editId="64D3550B">
-            <wp:extent cx="5943600" cy="4193540"/>
+          <wp:inline distT="0" distB="0" distL="0" distR="0" wp14:anchorId="6A474071" wp14:editId="560E6583">
+            <wp:extent cx="5943600" cy="4175760"/>
             <wp:effectExtent l="0" t="0" r="0" b="0"/>
-            <wp:docPr id="1050683871" name="Picture 1"/>
+            <wp:docPr id="1423209775" name="Picture 1"/>
             <wp:cNvGraphicFramePr>
               <a:graphicFrameLocks xmlns:a="http://schemas.openxmlformats.org/drawingml/2006/main" noChangeAspect="1"/>
             </wp:cNvGraphicFramePr>
@@ -5352,7 +5353,7 @@
               <a:graphicData uri="http://schemas.openxmlformats.org/drawingml/2006/picture">
                 <pic:pic xmlns:pic="http://schemas.openxmlformats.org/drawingml/2006/picture">
                   <pic:nvPicPr>
-                    <pic:cNvPr id="1050683871" name=""/>
+                    <pic:cNvPr id="1423209775" name=""/>
                     <pic:cNvPicPr/>
                   </pic:nvPicPr>
                   <pic:blipFill>
@@ -5364,7 +5365,7 @@
                   <pic:spPr>
                     <a:xfrm>
                       <a:off x="0" y="0"/>
-                      <a:ext cx="5943600" cy="4193540"/>
+                      <a:ext cx="5943600" cy="4175760"/>
                     </a:xfrm>
                     <a:prstGeom prst="rect">
                       <a:avLst/>
@@ -14977,6 +14978,7 @@
   <w:style w:type="character" w:default="1" w:styleId="DefaultParagraphFont">
     <w:name w:val="Default Paragraph Font"/>
     <w:uiPriority w:val="1"/>
+    <w:semiHidden/>
     <w:unhideWhenUsed/>
   </w:style>
   <w:style w:type="table" w:default="1" w:styleId="TableNormal">

</xml_diff>